<commit_message>
fix(data): request range 0-49999 so >1000-row tables return in full
</commit_message>
<xml_diff>
--- a/docs/Phase 4 - Environment and CI-CD.docx
+++ b/docs/Phase 4 - Environment and CI-CD.docx
@@ -1,21 +1,20 @@
 
 <file path=word/document.xml><?xml version="1.0" encoding="utf-8"?>
-<w:document xmlns:wpc="http://schemas.microsoft.com/office/word/2010/wordprocessingCanvas" xmlns:mc="http://schemas.openxmlformats.org/markup-compatibility/2006" xmlns:o="urn:schemas-microsoft-com:office:office" xmlns:r="http://schemas.openxmlformats.org/officeDocument/2006/relationships" xmlns:m="http://schemas.openxmlformats.org/officeDocument/2006/math" xmlns:v="urn:schemas-microsoft-com:vml" xmlns:wp14="http://schemas.microsoft.com/office/word/2010/wordprocessingDrawing" xmlns:wp="http://schemas.openxmlformats.org/drawingml/2006/wordprocessingDrawing" xmlns:w10="urn:schemas-microsoft-com:office:word" xmlns:w="http://schemas.openxmlformats.org/wordprocessingml/2006/main" xmlns:w14="http://schemas.microsoft.com/office/word/2010/wordml" xmlns:w15="http://schemas.microsoft.com/office/word/2012/wordml" xmlns:wpg="http://schemas.microsoft.com/office/word/2010/wordprocessingGroup" xmlns:wpi="http://schemas.microsoft.com/office/word/2010/wordprocessingInk" xmlns:wne="http://schemas.microsoft.com/office/word/2006/wordml" xmlns:wps="http://schemas.microsoft.com/office/word/2010/wordprocessingShape" xmlns:cx="http://schemas.microsoft.com/office/drawing/2014/chartex" xmlns:cx1="http://schemas.microsoft.com/office/drawing/2015/9/8/chartex" xmlns:cx2="http://schemas.microsoft.com/office/drawing/2015/10/21/chartex" xmlns:cx3="http://schemas.microsoft.com/office/drawing/2016/5/9/chartex" xmlns:cx4="http://schemas.microsoft.com/office/drawing/2016/5/10/chartex" xmlns:cx5="http://schemas.microsoft.com/office/drawing/2016/5/11/chartex" xmlns:cx6="http://schemas.microsoft.com/office/drawing/2016/5/12/chartex" xmlns:cx7="http://schemas.microsoft.com/office/drawing/2016/5/13/chartex" xmlns:cx8="http://schemas.microsoft.com/office/drawing/2016/5/14/chartex" xmlns:aink="http://schemas.microsoft.com/office/drawing/2016/ink" xmlns:am3d="http://schemas.microsoft.com/office/drawing/2017/model3d" xmlns:w16cex="http://schemas.microsoft.com/office/word/2018/wordml/cex" xmlns:w16cid="http://schemas.microsoft.com/office/word/2016/wordml/cid" xmlns:w16="http://schemas.microsoft.com/office/word/2018/wordml" xmlns:w16sdtdh="http://schemas.microsoft.com/office/word/2020/wordml/sdtdatahash" xmlns:w16se="http://schemas.microsoft.com/office/word/2015/wordml/symex" mc:Ignorable="w14 w15 wp14">
+<w:document xmlns:wpc="http://schemas.microsoft.com/office/word/2010/wordprocessingCanvas" xmlns:cx="http://schemas.microsoft.com/office/drawing/2014/chartex" xmlns:cx1="http://schemas.microsoft.com/office/drawing/2015/9/8/chartex" xmlns:cx2="http://schemas.microsoft.com/office/drawing/2015/10/21/chartex" xmlns:cx3="http://schemas.microsoft.com/office/drawing/2016/5/9/chartex" xmlns:cx4="http://schemas.microsoft.com/office/drawing/2016/5/10/chartex" xmlns:cx5="http://schemas.microsoft.com/office/drawing/2016/5/11/chartex" xmlns:cx6="http://schemas.microsoft.com/office/drawing/2016/5/12/chartex" xmlns:cx7="http://schemas.microsoft.com/office/drawing/2016/5/13/chartex" xmlns:cx8="http://schemas.microsoft.com/office/drawing/2016/5/14/chartex" xmlns:mc="http://schemas.openxmlformats.org/markup-compatibility/2006" xmlns:aink="http://schemas.microsoft.com/office/drawing/2016/ink" xmlns:am3d="http://schemas.microsoft.com/office/drawing/2017/model3d" xmlns:o="urn:schemas-microsoft-com:office:office" xmlns:oel="http://schemas.microsoft.com/office/2019/extlst" xmlns:r="http://schemas.openxmlformats.org/officeDocument/2006/relationships" xmlns:m="http://schemas.openxmlformats.org/officeDocument/2006/math" xmlns:v="urn:schemas-microsoft-com:vml" xmlns:wp14="http://schemas.microsoft.com/office/word/2010/wordprocessingDrawing" xmlns:wp="http://schemas.openxmlformats.org/drawingml/2006/wordprocessingDrawing" xmlns:w10="urn:schemas-microsoft-com:office:word" xmlns:w="http://schemas.openxmlformats.org/wordprocessingml/2006/main" xmlns:w14="http://schemas.microsoft.com/office/word/2010/wordml" xmlns:w15="http://schemas.microsoft.com/office/word/2012/wordml" xmlns:w16cex="http://schemas.microsoft.com/office/word/2018/wordml/cex" xmlns:w16cid="http://schemas.microsoft.com/office/word/2016/wordml/cid" xmlns:w16="http://schemas.microsoft.com/office/word/2018/wordml" xmlns:w16du="http://schemas.microsoft.com/office/word/2023/wordml/word16du" xmlns:w16sdtdh="http://schemas.microsoft.com/office/word/2020/wordml/sdtdatahash" xmlns:w16sdtfl="http://schemas.microsoft.com/office/word/2024/wordml/sdtformatlock" xmlns:w16se="http://schemas.microsoft.com/office/word/2015/wordml/symex" xmlns:wpg="http://schemas.microsoft.com/office/word/2010/wordprocessingGroup" xmlns:wpi="http://schemas.microsoft.com/office/word/2010/wordprocessingInk" xmlns:wne="http://schemas.microsoft.com/office/word/2006/wordml" xmlns:wps="http://schemas.microsoft.com/office/word/2010/wordprocessingShape" mc:Ignorable="w14 w15 w16se w16cid w16 w16cex w16sdtdh w16sdtfl w16du wp14">
   <w:body>
     <w:p>
       <w:pPr>
-        <w:spacing w:after="60" w:before="80"/>
+        <w:spacing w:before="80" w:after="60"/>
         <w:jc w:val="center"/>
       </w:pPr>
       <w:r>
         <w:rPr>
           <w:b/>
           <w:bCs/>
-          <w:color w:val="1F3864"/>
           <w:sz w:val="40"/>
           <w:szCs w:val="40"/>
         </w:rPr>
-        <w:t xml:space="preserve">Phase 4 — Environment and CI/CD</w:t>
+        <w:t>Phase 4 — Environment and CI/CD</w:t>
       </w:r>
     </w:p>
     <w:p>
@@ -25,11 +24,10 @@
       </w:pPr>
       <w:r>
         <w:rPr>
-          <w:color w:val="2E5A88"/>
           <w:sz w:val="26"/>
           <w:szCs w:val="26"/>
         </w:rPr>
-        <w:t xml:space="preserve">Environment Setup &amp; CI/CD Pipeline Record</w:t>
+        <w:t>Environment Setup &amp; CI/CD Pipeline Record</w:t>
       </w:r>
     </w:p>
     <w:p>
@@ -44,35 +42,46 @@
           <w:sz w:val="18"/>
           <w:szCs w:val="18"/>
         </w:rPr>
-        <w:t xml:space="preserve">CPF Group Multi-Subsidiary Analytics Dashboard | Prepared by Vincent Onchieku Collins</w:t>
+        <w:t>CPF Group Multi-Subsidiary Analytics Dashboard | Prepared by Vincent Onchieku Collins</w:t>
       </w:r>
     </w:p>
     <w:tbl>
       <w:tblPr>
-        <w:tblW w:type="dxa" w:w="10466"/>
+        <w:tblW w:w="10466" w:type="dxa"/>
         <w:tblBorders>
-          <w:top w:val="single" w:color="auto" w:sz="4"/>
-          <w:left w:val="single" w:color="auto" w:sz="4"/>
-          <w:bottom w:val="single" w:color="auto" w:sz="4"/>
-          <w:right w:val="single" w:color="auto" w:sz="4"/>
-          <w:insideH w:val="single" w:color="auto" w:sz="4"/>
-          <w:insideV w:val="single" w:color="auto" w:sz="4"/>
+          <w:top w:val="single" w:sz="4" w:space="0" w:color="auto"/>
+          <w:left w:val="single" w:sz="4" w:space="0" w:color="auto"/>
+          <w:bottom w:val="single" w:sz="4" w:space="0" w:color="auto"/>
+          <w:right w:val="single" w:sz="4" w:space="0" w:color="auto"/>
+          <w:insideH w:val="single" w:sz="4" w:space="0" w:color="auto"/>
+          <w:insideV w:val="single" w:sz="4" w:space="0" w:color="auto"/>
         </w:tblBorders>
+        <w:tblCellMar>
+          <w:left w:w="10" w:type="dxa"/>
+          <w:right w:w="10" w:type="dxa"/>
+        </w:tblCellMar>
+        <w:tblLook w:val="04A0" w:firstRow="1" w:lastRow="0" w:firstColumn="1" w:lastColumn="0" w:noHBand="0" w:noVBand="1"/>
       </w:tblPr>
       <w:tblGrid>
         <w:gridCol w:w="2600"/>
         <w:gridCol w:w="7866"/>
       </w:tblGrid>
       <w:tr>
+        <w:tblPrEx>
+          <w:tblCellMar>
+            <w:top w:w="0" w:type="dxa"/>
+            <w:bottom w:w="0" w:type="dxa"/>
+          </w:tblCellMar>
+        </w:tblPrEx>
         <w:tc>
           <w:tcPr>
-            <w:tcW w:type="dxa" w:w="2600"/>
-            <w:shd w:fill="DCE6F1" w:val="clear"/>
+            <w:tcW w:w="2600" w:type="dxa"/>
+            <w:shd w:val="clear" w:color="auto" w:fill="FFFFFF" w:themeFill="background1"/>
             <w:tcMar>
-              <w:top w:type="dxa" w:w="80"/>
-              <w:left w:type="dxa" w:w="100"/>
-              <w:bottom w:type="dxa" w:w="80"/>
-              <w:right w:type="dxa" w:w="100"/>
+              <w:top w:w="80" w:type="dxa"/>
+              <w:left w:w="100" w:type="dxa"/>
+              <w:bottom w:w="80" w:type="dxa"/>
+              <w:right w:w="100" w:type="dxa"/>
             </w:tcMar>
           </w:tcPr>
           <w:p>
@@ -80,23 +89,22 @@
               <w:rPr>
                 <w:b/>
                 <w:bCs/>
-                <w:color w:val="1F3864"/>
-                <w:sz w:val="18"/>
-                <w:szCs w:val="18"/>
-              </w:rPr>
-              <w:t xml:space="preserve">Field</w:t>
+                <w:sz w:val="18"/>
+                <w:szCs w:val="18"/>
+              </w:rPr>
+              <w:t>Field</w:t>
             </w:r>
           </w:p>
         </w:tc>
         <w:tc>
           <w:tcPr>
-            <w:tcW w:type="dxa" w:w="7866"/>
-            <w:shd w:fill="DCE6F1" w:val="clear"/>
+            <w:tcW w:w="7866" w:type="dxa"/>
+            <w:shd w:val="clear" w:color="auto" w:fill="FFFFFF" w:themeFill="background1"/>
             <w:tcMar>
-              <w:top w:type="dxa" w:w="80"/>
-              <w:left w:type="dxa" w:w="100"/>
-              <w:bottom w:type="dxa" w:w="80"/>
-              <w:right w:type="dxa" w:w="100"/>
+              <w:top w:w="80" w:type="dxa"/>
+              <w:left w:w="100" w:type="dxa"/>
+              <w:bottom w:w="80" w:type="dxa"/>
+              <w:right w:w="100" w:type="dxa"/>
             </w:tcMar>
           </w:tcPr>
           <w:p>
@@ -104,195 +112,202 @@
               <w:rPr>
                 <w:b/>
                 <w:bCs/>
-                <w:color w:val="1F3864"/>
-                <w:sz w:val="18"/>
-                <w:szCs w:val="18"/>
-              </w:rPr>
-              <w:t xml:space="preserve">Detail</w:t>
+                <w:sz w:val="18"/>
+                <w:szCs w:val="18"/>
+              </w:rPr>
+              <w:t>Detail</w:t>
             </w:r>
           </w:p>
         </w:tc>
       </w:tr>
       <w:tr>
+        <w:tblPrEx>
+          <w:tblCellMar>
+            <w:top w:w="0" w:type="dxa"/>
+            <w:bottom w:w="0" w:type="dxa"/>
+          </w:tblCellMar>
+        </w:tblPrEx>
         <w:tc>
           <w:tcPr>
-            <w:tcW w:type="dxa" w:w="2600"/>
+            <w:tcW w:w="2600" w:type="dxa"/>
             <w:tcMar>
-              <w:top w:type="dxa" w:w="80"/>
-              <w:left w:type="dxa" w:w="100"/>
-              <w:bottom w:type="dxa" w:w="80"/>
-              <w:right w:type="dxa" w:w="100"/>
+              <w:top w:w="80" w:type="dxa"/>
+              <w:left w:w="100" w:type="dxa"/>
+              <w:bottom w:w="80" w:type="dxa"/>
+              <w:right w:w="100" w:type="dxa"/>
             </w:tcMar>
           </w:tcPr>
           <w:p>
             <w:r>
               <w:rPr>
-                <w:b w:val="false"/>
-                <w:bCs w:val="false"/>
-                <w:sz w:val="18"/>
-                <w:szCs w:val="18"/>
-              </w:rPr>
-              <w:t xml:space="preserve">Prepared by</w:t>
+                <w:sz w:val="18"/>
+                <w:szCs w:val="18"/>
+              </w:rPr>
+              <w:t>Prepared by</w:t>
             </w:r>
           </w:p>
         </w:tc>
         <w:tc>
           <w:tcPr>
-            <w:tcW w:type="dxa" w:w="7866"/>
+            <w:tcW w:w="7866" w:type="dxa"/>
             <w:tcMar>
-              <w:top w:type="dxa" w:w="80"/>
-              <w:left w:type="dxa" w:w="100"/>
-              <w:bottom w:type="dxa" w:w="80"/>
-              <w:right w:type="dxa" w:w="100"/>
+              <w:top w:w="80" w:type="dxa"/>
+              <w:left w:w="100" w:type="dxa"/>
+              <w:bottom w:w="80" w:type="dxa"/>
+              <w:right w:w="100" w:type="dxa"/>
             </w:tcMar>
           </w:tcPr>
           <w:p>
             <w:r>
               <w:rPr>
-                <w:b w:val="false"/>
-                <w:bCs w:val="false"/>
-                <w:sz w:val="18"/>
-                <w:szCs w:val="18"/>
-              </w:rPr>
-              <w:t xml:space="preserve">Vincent Onchieku Collins</w:t>
+                <w:sz w:val="18"/>
+                <w:szCs w:val="18"/>
+              </w:rPr>
+              <w:t>Vincent Onchieku Collins</w:t>
             </w:r>
           </w:p>
         </w:tc>
       </w:tr>
       <w:tr>
+        <w:tblPrEx>
+          <w:tblCellMar>
+            <w:top w:w="0" w:type="dxa"/>
+            <w:bottom w:w="0" w:type="dxa"/>
+          </w:tblCellMar>
+        </w:tblPrEx>
         <w:tc>
           <w:tcPr>
-            <w:tcW w:type="dxa" w:w="2600"/>
+            <w:tcW w:w="2600" w:type="dxa"/>
             <w:tcMar>
-              <w:top w:type="dxa" w:w="80"/>
-              <w:left w:type="dxa" w:w="100"/>
-              <w:bottom w:type="dxa" w:w="80"/>
-              <w:right w:type="dxa" w:w="100"/>
+              <w:top w:w="80" w:type="dxa"/>
+              <w:left w:w="100" w:type="dxa"/>
+              <w:bottom w:w="80" w:type="dxa"/>
+              <w:right w:w="100" w:type="dxa"/>
             </w:tcMar>
           </w:tcPr>
           <w:p>
             <w:r>
               <w:rPr>
-                <w:b w:val="false"/>
-                <w:bCs w:val="false"/>
-                <w:sz w:val="18"/>
-                <w:szCs w:val="18"/>
-              </w:rPr>
-              <w:t xml:space="preserve">Document Version</w:t>
+                <w:sz w:val="18"/>
+                <w:szCs w:val="18"/>
+              </w:rPr>
+              <w:t>Document Version</w:t>
             </w:r>
           </w:p>
         </w:tc>
         <w:tc>
           <w:tcPr>
-            <w:tcW w:type="dxa" w:w="7866"/>
+            <w:tcW w:w="7866" w:type="dxa"/>
             <w:tcMar>
-              <w:top w:type="dxa" w:w="80"/>
-              <w:left w:type="dxa" w:w="100"/>
-              <w:bottom w:type="dxa" w:w="80"/>
-              <w:right w:type="dxa" w:w="100"/>
+              <w:top w:w="80" w:type="dxa"/>
+              <w:left w:w="100" w:type="dxa"/>
+              <w:bottom w:w="80" w:type="dxa"/>
+              <w:right w:w="100" w:type="dxa"/>
             </w:tcMar>
           </w:tcPr>
           <w:p>
             <w:r>
               <w:rPr>
-                <w:b w:val="false"/>
-                <w:bCs w:val="false"/>
-                <w:sz w:val="18"/>
-                <w:szCs w:val="18"/>
-              </w:rPr>
-              <w:t xml:space="preserve">1.0</w:t>
+                <w:sz w:val="18"/>
+                <w:szCs w:val="18"/>
+              </w:rPr>
+              <w:t>1.0</w:t>
             </w:r>
           </w:p>
         </w:tc>
       </w:tr>
       <w:tr>
+        <w:tblPrEx>
+          <w:tblCellMar>
+            <w:top w:w="0" w:type="dxa"/>
+            <w:bottom w:w="0" w:type="dxa"/>
+          </w:tblCellMar>
+        </w:tblPrEx>
         <w:tc>
           <w:tcPr>
-            <w:tcW w:type="dxa" w:w="2600"/>
+            <w:tcW w:w="2600" w:type="dxa"/>
             <w:tcMar>
-              <w:top w:type="dxa" w:w="80"/>
-              <w:left w:type="dxa" w:w="100"/>
-              <w:bottom w:type="dxa" w:w="80"/>
-              <w:right w:type="dxa" w:w="100"/>
+              <w:top w:w="80" w:type="dxa"/>
+              <w:left w:w="100" w:type="dxa"/>
+              <w:bottom w:w="80" w:type="dxa"/>
+              <w:right w:w="100" w:type="dxa"/>
             </w:tcMar>
           </w:tcPr>
           <w:p>
             <w:r>
               <w:rPr>
-                <w:b w:val="false"/>
-                <w:bCs w:val="false"/>
-                <w:sz w:val="18"/>
-                <w:szCs w:val="18"/>
-              </w:rPr>
-              <w:t xml:space="preserve">Status</w:t>
+                <w:sz w:val="18"/>
+                <w:szCs w:val="18"/>
+              </w:rPr>
+              <w:t>Status</w:t>
             </w:r>
           </w:p>
         </w:tc>
         <w:tc>
           <w:tcPr>
-            <w:tcW w:type="dxa" w:w="7866"/>
+            <w:tcW w:w="7866" w:type="dxa"/>
             <w:tcMar>
-              <w:top w:type="dxa" w:w="80"/>
-              <w:left w:type="dxa" w:w="100"/>
-              <w:bottom w:type="dxa" w:w="80"/>
-              <w:right w:type="dxa" w:w="100"/>
+              <w:top w:w="80" w:type="dxa"/>
+              <w:left w:w="100" w:type="dxa"/>
+              <w:bottom w:w="80" w:type="dxa"/>
+              <w:right w:w="100" w:type="dxa"/>
             </w:tcMar>
           </w:tcPr>
           <w:p>
             <w:r>
               <w:rPr>
-                <w:b w:val="false"/>
-                <w:bCs w:val="false"/>
-                <w:sz w:val="18"/>
-                <w:szCs w:val="18"/>
-              </w:rPr>
-              <w:t xml:space="preserve">Repository and tooling complete; three external account steps pending (see §9)</w:t>
+                <w:sz w:val="18"/>
+                <w:szCs w:val="18"/>
+              </w:rPr>
+              <w:t>Repository and tooling complete; three external account steps pending (see §9)</w:t>
             </w:r>
           </w:p>
         </w:tc>
       </w:tr>
       <w:tr>
+        <w:tblPrEx>
+          <w:tblCellMar>
+            <w:top w:w="0" w:type="dxa"/>
+            <w:bottom w:w="0" w:type="dxa"/>
+          </w:tblCellMar>
+        </w:tblPrEx>
         <w:tc>
           <w:tcPr>
-            <w:tcW w:type="dxa" w:w="2600"/>
+            <w:tcW w:w="2600" w:type="dxa"/>
             <w:tcMar>
-              <w:top w:type="dxa" w:w="80"/>
-              <w:left w:type="dxa" w:w="100"/>
-              <w:bottom w:type="dxa" w:w="80"/>
-              <w:right w:type="dxa" w:w="100"/>
+              <w:top w:w="80" w:type="dxa"/>
+              <w:left w:w="100" w:type="dxa"/>
+              <w:bottom w:w="80" w:type="dxa"/>
+              <w:right w:w="100" w:type="dxa"/>
             </w:tcMar>
           </w:tcPr>
           <w:p>
             <w:r>
               <w:rPr>
-                <w:b w:val="false"/>
-                <w:bCs w:val="false"/>
-                <w:sz w:val="18"/>
-                <w:szCs w:val="18"/>
-              </w:rPr>
-              <w:t xml:space="preserve">Governing references</w:t>
+                <w:sz w:val="18"/>
+                <w:szCs w:val="18"/>
+              </w:rPr>
+              <w:t>Governing references</w:t>
             </w:r>
           </w:p>
         </w:tc>
         <w:tc>
           <w:tcPr>
-            <w:tcW w:type="dxa" w:w="7866"/>
+            <w:tcW w:w="7866" w:type="dxa"/>
             <w:tcMar>
-              <w:top w:type="dxa" w:w="80"/>
-              <w:left w:type="dxa" w:w="100"/>
-              <w:bottom w:type="dxa" w:w="80"/>
-              <w:right w:type="dxa" w:w="100"/>
+              <w:top w:w="80" w:type="dxa"/>
+              <w:left w:w="100" w:type="dxa"/>
+              <w:bottom w:w="80" w:type="dxa"/>
+              <w:right w:w="100" w:type="dxa"/>
             </w:tcMar>
           </w:tcPr>
           <w:p>
             <w:r>
               <w:rPr>
-                <w:b w:val="false"/>
-                <w:bCs w:val="false"/>
-                <w:sz w:val="18"/>
-                <w:szCs w:val="18"/>
-              </w:rPr>
-              <w:t xml:space="preserve">Week 7 &amp; 8 Execution Plan; Phase 3 — Design (Software Design Document); SDLC Document; Clean Coding Practices</w:t>
+                <w:sz w:val="18"/>
+                <w:szCs w:val="18"/>
+              </w:rPr>
+              <w:t>Week 7 &amp; 8 Execution Plan; Phase 3 — Design (Software Design Document); SDLC Document; Clean Coding Practices</w:t>
             </w:r>
           </w:p>
         </w:tc>
@@ -301,12 +316,12 @@
     <w:p>
       <w:pPr>
         <w:pBdr>
-          <w:top w:val="single" w:color="8EA9C1" w:sz="4" w:space="8"/>
-          <w:left w:val="single" w:color="8EA9C1" w:sz="4" w:space="8"/>
-          <w:bottom w:val="single" w:color="8EA9C1" w:sz="4" w:space="8"/>
-          <w:right w:val="single" w:color="8EA9C1" w:sz="4" w:space="8"/>
+          <w:top w:val="single" w:sz="4" w:space="8" w:color="8EA9C1"/>
+          <w:left w:val="single" w:sz="4" w:space="8" w:color="8EA9C1"/>
+          <w:bottom w:val="single" w:sz="4" w:space="8" w:color="8EA9C1"/>
+          <w:right w:val="single" w:sz="4" w:space="8" w:color="8EA9C1"/>
         </w:pBdr>
-        <w:shd w:fill="F2F6FA" w:val="clear"/>
+        <w:shd w:val="clear" w:color="auto" w:fill="FFFFFF" w:themeFill="background1"/>
         <w:spacing w:after="160"/>
       </w:pPr>
       <w:r>
@@ -314,27 +329,39 @@
           <w:i/>
           <w:iCs/>
         </w:rPr>
-        <w:t xml:space="preserve">SDLC alignment: supports SDLC Phase 4 (Coding) and Phase 6 (Deployment) — implements the “Modern Approach: CI/CD pipelines” noted in the SDLC Document and the Tooling &amp; Team Workflow section of Clean Coding Practices §12. This record documents what was actually built, so it can stand alongside the Phase 1–3 documents as evidence of process, not just intent.</w:t>
+        <w:t>SDLC alignment: supports SDLC Phase 4 (Coding) and Phase 6 (Deployment) — implements the “Modern Approach: CI/CD pipelines” noted in the SDLC Document and the Tooling &amp; Team Workflow section of Clean Coding Practices §12. This record documents what was actually built, so it can stand alongside the Phase 1–3 documents as evidence of process, not just intent.</w:t>
       </w:r>
     </w:p>
     <w:p>
       <w:pPr>
         <w:pStyle w:val="Heading1"/>
         <w:pBdr>
-          <w:bottom w:val="single" w:color="8EA9C1" w:sz="6" w:space="4"/>
+          <w:bottom w:val="single" w:sz="6" w:space="4" w:color="8EA9C1"/>
         </w:pBdr>
-        <w:spacing w:after="140" w:before="300"/>
-      </w:pPr>
-      <w:r>
-        <w:t xml:space="preserve">1. Project Location</w:t>
+        <w:spacing w:before="300" w:after="140"/>
+        <w:rPr>
+          <w:color w:val="auto"/>
+        </w:rPr>
+      </w:pPr>
+      <w:r>
+        <w:rPr>
+          <w:color w:val="auto"/>
+        </w:rPr>
+        <w:t>1. Project Location</w:t>
       </w:r>
     </w:p>
     <w:p>
       <w:pPr>
         <w:spacing w:after="110"/>
-      </w:pPr>
-      <w:r>
-        <w:t xml:space="preserve">The codebase was first scaffolded inside the Project documentation folder, then moved before any real development, for two concrete reasons found during setup rather than anticipated in advance:</w:t>
+        <w:rPr>
+          <w:color w:val="C00000"/>
+        </w:rPr>
+      </w:pPr>
+      <w:r>
+        <w:rPr>
+          <w:color w:val="C00000"/>
+        </w:rPr>
+        <w:t>The codebase was first scaffolded inside the Project documentation folder, then moved before any real development, for two concrete reasons found during setup rather than anticipated in advance:</w:t>
       </w:r>
     </w:p>
     <w:p>
@@ -345,18 +372,65 @@
           <w:numId w:val="2"/>
         </w:numPr>
         <w:spacing w:after="80"/>
-      </w:pPr>
-      <w:r>
-        <w:rPr>
-          <w:b/>
-          <w:bCs/>
-          <w:i w:val="false"/>
-          <w:iCs w:val="false"/>
+        <w:rPr>
+          <w:color w:val="C00000"/>
+        </w:rPr>
+      </w:pPr>
+      <w:r>
+        <w:rPr>
+          <w:b/>
+          <w:bCs/>
+          <w:color w:val="C00000"/>
         </w:rPr>
         <w:t xml:space="preserve">The folder path contained an “&amp;” </w:t>
       </w:r>
       <w:r>
-        <w:t xml:space="preserve">(“Week 7 &amp; 8 Dashboard &amp; Data Product Build”). On Windows, npm's generated .cmd shims run through cmd.exe, which treats “&amp;” as a command separator — this silently broke npm run build (confirmed: it failed with a mangled path before the move, and succeeded immediately after).</w:t>
+        <w:rPr>
+          <w:color w:val="C00000"/>
+        </w:rPr>
+        <w:t xml:space="preserve">(“Week 7 &amp; 8 Dashboard &amp; Data Product Build”). On Windows, </w:t>
+      </w:r>
+      <w:proofErr w:type="spellStart"/>
+      <w:r>
+        <w:rPr>
+          <w:color w:val="C00000"/>
+        </w:rPr>
+        <w:t>npm's</w:t>
+      </w:r>
+      <w:proofErr w:type="spellEnd"/>
+      <w:r>
+        <w:rPr>
+          <w:color w:val="C00000"/>
+        </w:rPr>
+        <w:t xml:space="preserve"> generated .</w:t>
+      </w:r>
+      <w:proofErr w:type="spellStart"/>
+      <w:r>
+        <w:rPr>
+          <w:color w:val="C00000"/>
+        </w:rPr>
+        <w:t>cmd</w:t>
+      </w:r>
+      <w:proofErr w:type="spellEnd"/>
+      <w:r>
+        <w:rPr>
+          <w:color w:val="C00000"/>
+        </w:rPr>
+        <w:t xml:space="preserve"> shims run through cmd.exe, which treats “&amp;” as a command separator — this silently broke </w:t>
+      </w:r>
+      <w:proofErr w:type="spellStart"/>
+      <w:r>
+        <w:rPr>
+          <w:color w:val="C00000"/>
+        </w:rPr>
+        <w:t>npm</w:t>
+      </w:r>
+      <w:proofErr w:type="spellEnd"/>
+      <w:r>
+        <w:rPr>
+          <w:color w:val="C00000"/>
+        </w:rPr>
+        <w:t xml:space="preserve"> run build (confirmed: it failed with a mangled path before the move, and succeeded immediately after).</w:t>
       </w:r>
     </w:p>
     <w:p>
@@ -367,18 +441,37 @@
           <w:numId w:val="2"/>
         </w:numPr>
         <w:spacing w:after="80"/>
-      </w:pPr>
-      <w:r>
-        <w:rPr>
-          <w:b/>
-          <w:bCs/>
-          <w:i w:val="false"/>
-          <w:iCs w:val="false"/>
+        <w:rPr>
+          <w:color w:val="C00000"/>
+        </w:rPr>
+      </w:pPr>
+      <w:r>
+        <w:rPr>
+          <w:b/>
+          <w:bCs/>
+          <w:color w:val="C00000"/>
         </w:rPr>
         <w:t xml:space="preserve">OneDrive continuous sync </w:t>
       </w:r>
       <w:r>
-        <w:t xml:space="preserve">does not handle a Next.js node_modules folder well — tens of thousands of small files trigger sync lock conflicts and slowdowns.</w:t>
+        <w:rPr>
+          <w:color w:val="C00000"/>
+        </w:rPr>
+        <w:t xml:space="preserve">does not handle a Next.js </w:t>
+      </w:r>
+      <w:proofErr w:type="spellStart"/>
+      <w:r>
+        <w:rPr>
+          <w:color w:val="C00000"/>
+        </w:rPr>
+        <w:t>node_modules</w:t>
+      </w:r>
+      <w:proofErr w:type="spellEnd"/>
+      <w:r>
+        <w:rPr>
+          <w:color w:val="C00000"/>
+        </w:rPr>
+        <w:t xml:space="preserve"> folder well — tens of thousands of small files trigger sync lock conflicts and slowdowns.</w:t>
       </w:r>
     </w:p>
     <w:p>
@@ -386,27 +479,34 @@
         <w:spacing w:after="110"/>
       </w:pPr>
       <w:r>
-        <w:rPr>
-          <w:b/>
-          <w:bCs/>
-          <w:color w:val="1F3864"/>
-        </w:rPr>
-        <w:t xml:space="preserve">Resolution: </w:t>
-      </w:r>
-      <w:r>
-        <w:t xml:space="preserve">the Next.js codebase now lives at C:\Users\vcollins\dev\cpf-group-dashboard — a clean local path outside OneDrive. The Project folder keeps only documentation (this file included); the duplicate scaffold left behind in Project\app needs to be deleted manually, since an automated safety check blocks a workspace-directory deletion of that scope.</w:t>
+        <w:t>T</w:t>
+      </w:r>
+      <w:r>
+        <w:t xml:space="preserve">he Next.js codebase lives at </w:t>
+      </w:r>
+      <w:r>
+        <w:t>C:\Users\vince\projects\cpf-dashboard</w:t>
+      </w:r>
+      <w:r>
+        <w:t xml:space="preserve">. </w:t>
       </w:r>
     </w:p>
     <w:p>
       <w:pPr>
         <w:pStyle w:val="Heading1"/>
         <w:pBdr>
-          <w:bottom w:val="single" w:color="8EA9C1" w:sz="6" w:space="4"/>
+          <w:bottom w:val="single" w:sz="6" w:space="4" w:color="8EA9C1"/>
         </w:pBdr>
-        <w:spacing w:after="140" w:before="300"/>
-      </w:pPr>
-      <w:r>
-        <w:t xml:space="preserve">2. Repository and Scaffold</w:t>
+        <w:spacing w:before="300" w:after="140"/>
+        <w:rPr>
+          <w:color w:val="auto"/>
+        </w:rPr>
+      </w:pPr>
+      <w:r>
+        <w:rPr>
+          <w:color w:val="auto"/>
+        </w:rPr>
+        <w:t>2. Repository and Scaffold</w:t>
       </w:r>
     </w:p>
     <w:p>
@@ -422,13 +522,27 @@
         <w:rPr>
           <w:b/>
           <w:bCs/>
-          <w:i w:val="false"/>
-          <w:iCs w:val="false"/>
         </w:rPr>
         <w:t xml:space="preserve">Initialized </w:t>
       </w:r>
       <w:r>
-        <w:t xml:space="preserve">via create-next-app, with TypeScript, the App Router, ESLint, and an src/ directory.</w:t>
+        <w:t xml:space="preserve">via create-next-app, with TypeScript, the App Router, </w:t>
+      </w:r>
+      <w:proofErr w:type="spellStart"/>
+      <w:r>
+        <w:t>ESLint</w:t>
+      </w:r>
+      <w:proofErr w:type="spellEnd"/>
+      <w:r>
+        <w:t xml:space="preserve">, and an </w:t>
+      </w:r>
+      <w:proofErr w:type="spellStart"/>
+      <w:r>
+        <w:t>src</w:t>
+      </w:r>
+      <w:proofErr w:type="spellEnd"/>
+      <w:r>
+        <w:t>/ directory.</w:t>
       </w:r>
     </w:p>
     <w:p>
@@ -444,13 +558,16 @@
         <w:rPr>
           <w:b/>
           <w:bCs/>
-          <w:i w:val="false"/>
-          <w:iCs w:val="false"/>
         </w:rPr>
         <w:t xml:space="preserve">Package name: </w:t>
       </w:r>
-      <w:r>
-        <w:t xml:space="preserve">cpf-group-dashboard (renamed from the create-next-app default).</w:t>
+      <w:proofErr w:type="spellStart"/>
+      <w:r>
+        <w:t>cpf</w:t>
+      </w:r>
+      <w:proofErr w:type="spellEnd"/>
+      <w:r>
+        <w:t>-group-dashboard (renamed from the create-next-app default).</w:t>
       </w:r>
     </w:p>
     <w:p>
@@ -466,13 +583,11 @@
         <w:rPr>
           <w:b/>
           <w:bCs/>
-          <w:i w:val="false"/>
-          <w:iCs w:val="false"/>
         </w:rPr>
         <w:t xml:space="preserve">Default branch renamed </w:t>
       </w:r>
       <w:r>
-        <w:t xml:space="preserve">from master to main, to match the README, the CI workflow trigger, and the Execution Plan's references to “merge to main.”</w:t>
+        <w:t>from master to main, to match the README, the CI workflow trigger, and the Execution Plan's references to “merge to main.”</w:t>
       </w:r>
     </w:p>
     <w:p>
@@ -488,25 +603,29 @@
         <w:rPr>
           <w:b/>
           <w:bCs/>
-          <w:i w:val="false"/>
-          <w:iCs w:val="false"/>
         </w:rPr>
         <w:t xml:space="preserve">Git history: </w:t>
       </w:r>
       <w:r>
-        <w:t xml:space="preserve">the scaffold's own “Initial commit from Create Next App,” followed by a second commit (§9) recording this phase's tooling.</w:t>
+        <w:t>the scaffold's own “Initial commit from Create Next App,” followed by a second commit (§9) recording this phase's tooling.</w:t>
       </w:r>
     </w:p>
     <w:p>
       <w:pPr>
         <w:pStyle w:val="Heading1"/>
         <w:pBdr>
-          <w:bottom w:val="single" w:color="8EA9C1" w:sz="6" w:space="4"/>
+          <w:bottom w:val="single" w:sz="6" w:space="4" w:color="8EA9C1"/>
         </w:pBdr>
-        <w:spacing w:after="140" w:before="300"/>
-      </w:pPr>
-      <w:r>
-        <w:t xml:space="preserve">3. Code Quality Tooling</w:t>
+        <w:spacing w:before="300" w:after="140"/>
+        <w:rPr>
+          <w:color w:val="auto"/>
+        </w:rPr>
+      </w:pPr>
+      <w:r>
+        <w:rPr>
+          <w:color w:val="auto"/>
+        </w:rPr>
+        <w:t>3. Code Quality Tooling</w:t>
       </w:r>
     </w:p>
     <w:p>
@@ -518,17 +637,37 @@
         </w:numPr>
         <w:spacing w:after="80"/>
       </w:pPr>
-      <w:r>
-        <w:rPr>
-          <w:b/>
-          <w:bCs/>
-          <w:i w:val="false"/>
-          <w:iCs w:val="false"/>
-        </w:rPr>
-        <w:t xml:space="preserve">ESLint: </w:t>
-      </w:r>
-      <w:r>
-        <w:t xml:space="preserve">eslint-config-next (core-web-vitals + typescript rule sets), extended with eslint-config-prettier so formatting rules never conflict with Prettier.</w:t>
+      <w:proofErr w:type="spellStart"/>
+      <w:r>
+        <w:rPr>
+          <w:b/>
+          <w:bCs/>
+        </w:rPr>
+        <w:t>ESLint</w:t>
+      </w:r>
+      <w:proofErr w:type="spellEnd"/>
+      <w:r>
+        <w:rPr>
+          <w:b/>
+          <w:bCs/>
+        </w:rPr>
+        <w:t xml:space="preserve">: </w:t>
+      </w:r>
+      <w:proofErr w:type="spellStart"/>
+      <w:r>
+        <w:t>eslint</w:t>
+      </w:r>
+      <w:proofErr w:type="spellEnd"/>
+      <w:r>
+        <w:t xml:space="preserve">-config-next (core-web-vitals + typescript rule sets), extended with </w:t>
+      </w:r>
+      <w:proofErr w:type="spellStart"/>
+      <w:r>
+        <w:t>eslint</w:t>
+      </w:r>
+      <w:proofErr w:type="spellEnd"/>
+      <w:r>
+        <w:t>-config-prettier so formatting rules never conflict with Prettier.</w:t>
       </w:r>
     </w:p>
     <w:p>
@@ -544,13 +683,52 @@
         <w:rPr>
           <w:b/>
           <w:bCs/>
-          <w:i w:val="false"/>
-          <w:iCs w:val="false"/>
-        </w:rPr>
-        <w:t xml:space="preserve">Prettier: </w:t>
-      </w:r>
-      <w:r>
-        <w:t xml:space="preserve">.prettierrc.json (semi, double quotes, trailing commas, 100-character print width) and a .prettierignore excluding build output and lockfiles.</w:t>
+        </w:rPr>
+        <w:t>Prettier</w:t>
+      </w:r>
+      <w:proofErr w:type="gramStart"/>
+      <w:r>
+        <w:rPr>
+          <w:b/>
+          <w:bCs/>
+        </w:rPr>
+        <w:t xml:space="preserve">: </w:t>
+      </w:r>
+      <w:r>
+        <w:t>.</w:t>
+      </w:r>
+      <w:proofErr w:type="spellStart"/>
+      <w:r>
+        <w:t>prettierrc</w:t>
+      </w:r>
+      <w:proofErr w:type="gramEnd"/>
+      <w:r>
+        <w:t>.json</w:t>
+      </w:r>
+      <w:proofErr w:type="spellEnd"/>
+      <w:r>
+        <w:t xml:space="preserve"> (semi, double quotes, trailing commas, 100-character print width) and </w:t>
+      </w:r>
+      <w:proofErr w:type="gramStart"/>
+      <w:r>
+        <w:t>a .</w:t>
+      </w:r>
+      <w:proofErr w:type="spellStart"/>
+      <w:r>
+        <w:t>prettierignore</w:t>
+      </w:r>
+      <w:proofErr w:type="spellEnd"/>
+      <w:proofErr w:type="gramEnd"/>
+      <w:r>
+        <w:t xml:space="preserve"> excluding build output and </w:t>
+      </w:r>
+      <w:proofErr w:type="spellStart"/>
+      <w:r>
+        <w:t>lockfiles</w:t>
+      </w:r>
+      <w:proofErr w:type="spellEnd"/>
+      <w:r>
+        <w:t>.</w:t>
       </w:r>
     </w:p>
     <w:p>
@@ -566,13 +744,34 @@
         <w:rPr>
           <w:b/>
           <w:bCs/>
-          <w:i w:val="false"/>
-          <w:iCs w:val="false"/>
         </w:rPr>
         <w:t xml:space="preserve">Scripts added: </w:t>
       </w:r>
-      <w:r>
-        <w:t xml:space="preserve">npm run format (write) and npm run format:check (check only — what CI runs).</w:t>
+      <w:proofErr w:type="spellStart"/>
+      <w:r>
+        <w:t>npm</w:t>
+      </w:r>
+      <w:proofErr w:type="spellEnd"/>
+      <w:r>
+        <w:t xml:space="preserve"> run format (write) and </w:t>
+      </w:r>
+      <w:proofErr w:type="spellStart"/>
+      <w:r>
+        <w:t>npm</w:t>
+      </w:r>
+      <w:proofErr w:type="spellEnd"/>
+      <w:r>
+        <w:t xml:space="preserve"> run </w:t>
+      </w:r>
+      <w:proofErr w:type="spellStart"/>
+      <w:proofErr w:type="gramStart"/>
+      <w:r>
+        <w:t>format:check</w:t>
+      </w:r>
+      <w:proofErr w:type="spellEnd"/>
+      <w:proofErr w:type="gramEnd"/>
+      <w:r>
+        <w:t xml:space="preserve"> (check only — what CI runs).</w:t>
       </w:r>
     </w:p>
     <w:p>
@@ -583,24 +782,50 @@
         <w:rPr>
           <w:b/>
           <w:bCs/>
-          <w:color w:val="1F3864"/>
         </w:rPr>
         <w:t xml:space="preserve">Verified: </w:t>
       </w:r>
-      <w:r>
-        <w:t xml:space="preserve">npm run build, npm run lint, and npm run format all pass cleanly at the new project location (see §8).</w:t>
+      <w:proofErr w:type="spellStart"/>
+      <w:r>
+        <w:t>npm</w:t>
+      </w:r>
+      <w:proofErr w:type="spellEnd"/>
+      <w:r>
+        <w:t xml:space="preserve"> run build, </w:t>
+      </w:r>
+      <w:proofErr w:type="spellStart"/>
+      <w:r>
+        <w:t>npm</w:t>
+      </w:r>
+      <w:proofErr w:type="spellEnd"/>
+      <w:r>
+        <w:t xml:space="preserve"> run lint, and </w:t>
+      </w:r>
+      <w:proofErr w:type="spellStart"/>
+      <w:r>
+        <w:t>npm</w:t>
+      </w:r>
+      <w:proofErr w:type="spellEnd"/>
+      <w:r>
+        <w:t xml:space="preserve"> run format all pass cleanly at the new project location (see §8).</w:t>
       </w:r>
     </w:p>
     <w:p>
       <w:pPr>
         <w:pStyle w:val="Heading1"/>
         <w:pBdr>
-          <w:bottom w:val="single" w:color="8EA9C1" w:sz="6" w:space="4"/>
+          <w:bottom w:val="single" w:sz="6" w:space="4" w:color="8EA9C1"/>
         </w:pBdr>
-        <w:spacing w:after="140" w:before="300"/>
-      </w:pPr>
-      <w:r>
-        <w:t xml:space="preserve">4. Pre-commit Automation</w:t>
+        <w:spacing w:before="300" w:after="140"/>
+        <w:rPr>
+          <w:color w:val="auto"/>
+        </w:rPr>
+      </w:pPr>
+      <w:r>
+        <w:rPr>
+          <w:color w:val="auto"/>
+        </w:rPr>
+        <w:t>4. Pre-commit Automation</w:t>
       </w:r>
     </w:p>
     <w:p>
@@ -616,13 +841,45 @@
         <w:rPr>
           <w:b/>
           <w:bCs/>
-          <w:i w:val="false"/>
-          <w:iCs w:val="false"/>
         </w:rPr>
         <w:t xml:space="preserve">Husky </w:t>
       </w:r>
       <w:r>
-        <w:t xml:space="preserve">initialized (npx husky init), with a prepare script in package.json so the hook installs automatically on npm install for anyone who clones the repo.</w:t>
+        <w:t>initialized (</w:t>
+      </w:r>
+      <w:proofErr w:type="spellStart"/>
+      <w:r>
+        <w:t>npx</w:t>
+      </w:r>
+      <w:proofErr w:type="spellEnd"/>
+      <w:r>
+        <w:t xml:space="preserve"> husky </w:t>
+      </w:r>
+      <w:proofErr w:type="spellStart"/>
+      <w:r>
+        <w:t>init</w:t>
+      </w:r>
+      <w:proofErr w:type="spellEnd"/>
+      <w:r>
+        <w:t xml:space="preserve">), with a prepare script in </w:t>
+      </w:r>
+      <w:proofErr w:type="spellStart"/>
+      <w:proofErr w:type="gramStart"/>
+      <w:r>
+        <w:t>package.json</w:t>
+      </w:r>
+      <w:proofErr w:type="spellEnd"/>
+      <w:proofErr w:type="gramEnd"/>
+      <w:r>
+        <w:t xml:space="preserve"> so the hook installs automatically on </w:t>
+      </w:r>
+      <w:proofErr w:type="spellStart"/>
+      <w:r>
+        <w:t>npm</w:t>
+      </w:r>
+      <w:proofErr w:type="spellEnd"/>
+      <w:r>
+        <w:t xml:space="preserve"> install for anyone who clones the repo.</w:t>
       </w:r>
     </w:p>
     <w:p>
@@ -638,68 +895,153 @@
         <w:rPr>
           <w:b/>
           <w:bCs/>
-          <w:i w:val="false"/>
-          <w:iCs w:val="false"/>
         </w:rPr>
         <w:t xml:space="preserve">lint-staged </w:t>
       </w:r>
       <w:r>
-        <w:t xml:space="preserve">configured in package.json: *.{js,jsx,ts,tsx} runs eslint --fix then prettier --write; *.{json,css,md} runs prettier --write.</w:t>
+        <w:t xml:space="preserve">configured in </w:t>
+      </w:r>
+      <w:proofErr w:type="spellStart"/>
+      <w:proofErr w:type="gramStart"/>
+      <w:r>
+        <w:t>package.json</w:t>
+      </w:r>
+      <w:proofErr w:type="spellEnd"/>
+      <w:proofErr w:type="gramEnd"/>
+      <w:r>
+        <w:t xml:space="preserve">: </w:t>
+      </w:r>
+      <w:proofErr w:type="gramStart"/>
+      <w:r>
+        <w:t>*.{</w:t>
+      </w:r>
+      <w:proofErr w:type="spellStart"/>
+      <w:r>
+        <w:t>js,jsx</w:t>
+      </w:r>
+      <w:proofErr w:type="gramEnd"/>
+      <w:r>
+        <w:t>,</w:t>
+      </w:r>
+      <w:proofErr w:type="gramStart"/>
+      <w:r>
+        <w:t>ts,tsx</w:t>
+      </w:r>
+      <w:proofErr w:type="spellEnd"/>
+      <w:proofErr w:type="gramEnd"/>
+      <w:r>
+        <w:t xml:space="preserve">} runs </w:t>
+      </w:r>
+      <w:proofErr w:type="spellStart"/>
+      <w:r>
+        <w:t>eslint</w:t>
+      </w:r>
+      <w:proofErr w:type="spellEnd"/>
+      <w:r>
+        <w:t xml:space="preserve"> --fix then prettier --write; </w:t>
+      </w:r>
+      <w:proofErr w:type="gramStart"/>
+      <w:r>
+        <w:t>*.{</w:t>
+      </w:r>
+      <w:proofErr w:type="spellStart"/>
+      <w:r>
+        <w:t>json,css</w:t>
+      </w:r>
+      <w:proofErr w:type="gramEnd"/>
+      <w:r>
+        <w:t>,md</w:t>
+      </w:r>
+      <w:proofErr w:type="spellEnd"/>
+      <w:r>
+        <w:t>} runs prettier --write.</w:t>
       </w:r>
     </w:p>
     <w:tbl>
       <w:tblPr>
-        <w:tblW w:type="dxa" w:w="10466"/>
+        <w:tblW w:w="10466" w:type="dxa"/>
         <w:tblBorders>
-          <w:top w:val="single" w:color="auto" w:sz="4"/>
-          <w:left w:val="single" w:color="auto" w:sz="4"/>
-          <w:bottom w:val="single" w:color="auto" w:sz="4"/>
-          <w:right w:val="single" w:color="auto" w:sz="4"/>
-          <w:insideH w:val="single" w:color="auto" w:sz="4"/>
-          <w:insideV w:val="single" w:color="auto" w:sz="4"/>
+          <w:top w:val="single" w:sz="4" w:space="0" w:color="auto"/>
+          <w:left w:val="single" w:sz="4" w:space="0" w:color="auto"/>
+          <w:bottom w:val="single" w:sz="4" w:space="0" w:color="auto"/>
+          <w:right w:val="single" w:sz="4" w:space="0" w:color="auto"/>
+          <w:insideH w:val="single" w:sz="4" w:space="0" w:color="auto"/>
+          <w:insideV w:val="single" w:sz="4" w:space="0" w:color="auto"/>
         </w:tblBorders>
+        <w:tblCellMar>
+          <w:left w:w="10" w:type="dxa"/>
+          <w:right w:w="10" w:type="dxa"/>
+        </w:tblCellMar>
+        <w:tblLook w:val="04A0" w:firstRow="1" w:lastRow="0" w:firstColumn="1" w:lastColumn="0" w:noHBand="0" w:noVBand="1"/>
       </w:tblPr>
       <w:tblGrid>
         <w:gridCol w:w="10466"/>
       </w:tblGrid>
       <w:tr>
+        <w:tblPrEx>
+          <w:tblCellMar>
+            <w:top w:w="0" w:type="dxa"/>
+            <w:bottom w:w="0" w:type="dxa"/>
+          </w:tblCellMar>
+        </w:tblPrEx>
         <w:tc>
           <w:tcPr>
-            <w:tcW w:type="dxa" w:w="10466"/>
-            <w:shd w:fill="F3F6FA" w:val="clear"/>
+            <w:tcW w:w="10466" w:type="dxa"/>
+            <w:shd w:val="clear" w:color="auto" w:fill="F3F6FA"/>
             <w:tcMar>
-              <w:top w:type="dxa" w:w="140"/>
-              <w:left w:type="dxa" w:w="180"/>
-              <w:bottom w:type="dxa" w:w="140"/>
-              <w:right w:type="dxa" w:w="180"/>
+              <w:top w:w="140" w:type="dxa"/>
+              <w:left w:w="180" w:type="dxa"/>
+              <w:bottom w:w="140" w:type="dxa"/>
+              <w:right w:w="180" w:type="dxa"/>
             </w:tcMar>
           </w:tcPr>
           <w:p>
-            <w:pPr>
-              <w:spacing w:after="0"/>
-            </w:pPr>
-            <w:r>
-              <w:rPr>
-                <w:rFonts w:ascii="Consolas" w:cs="Consolas" w:eastAsia="Consolas" w:hAnsi="Consolas"/>
-                <w:color w:val="2B2B2B"/>
-                <w:sz w:val="18"/>
-                <w:szCs w:val="18"/>
-              </w:rPr>
-              <w:t xml:space="preserve">// .husky/pre-commit</w:t>
+            <w:r>
+              <w:rPr>
+                <w:rFonts w:ascii="Consolas" w:eastAsia="Consolas" w:hAnsi="Consolas" w:cs="Consolas"/>
+                <w:sz w:val="18"/>
+                <w:szCs w:val="18"/>
+              </w:rPr>
+              <w:t>/</w:t>
+            </w:r>
+            <w:proofErr w:type="gramStart"/>
+            <w:r>
+              <w:rPr>
+                <w:rFonts w:ascii="Consolas" w:eastAsia="Consolas" w:hAnsi="Consolas" w:cs="Consolas"/>
+                <w:sz w:val="18"/>
+                <w:szCs w:val="18"/>
+              </w:rPr>
+              <w:t>/ .husky</w:t>
+            </w:r>
+            <w:proofErr w:type="gramEnd"/>
+            <w:r>
+              <w:rPr>
+                <w:rFonts w:ascii="Consolas" w:eastAsia="Consolas" w:hAnsi="Consolas" w:cs="Consolas"/>
+                <w:sz w:val="18"/>
+                <w:szCs w:val="18"/>
+              </w:rPr>
+              <w:t>/pre-commit</w:t>
             </w:r>
           </w:p>
           <w:p>
-            <w:pPr>
-              <w:spacing w:after="0"/>
-            </w:pPr>
-            <w:r>
-              <w:rPr>
-                <w:rFonts w:ascii="Consolas" w:cs="Consolas" w:eastAsia="Consolas" w:hAnsi="Consolas"/>
-                <w:color w:val="2B2B2B"/>
-                <w:sz w:val="18"/>
-                <w:szCs w:val="18"/>
-              </w:rPr>
-              <w:t xml:space="preserve">npx lint-staged</w:t>
+            <w:proofErr w:type="spellStart"/>
+            <w:r>
+              <w:rPr>
+                <w:rFonts w:ascii="Consolas" w:eastAsia="Consolas" w:hAnsi="Consolas" w:cs="Consolas"/>
+                <w:sz w:val="18"/>
+                <w:szCs w:val="18"/>
+              </w:rPr>
+              <w:lastRenderedPageBreak/>
+              <w:t>npx</w:t>
+            </w:r>
+            <w:proofErr w:type="spellEnd"/>
+            <w:r>
+              <w:rPr>
+                <w:rFonts w:ascii="Consolas" w:eastAsia="Consolas" w:hAnsi="Consolas" w:cs="Consolas"/>
+                <w:sz w:val="18"/>
+                <w:szCs w:val="18"/>
+              </w:rPr>
+              <w:t xml:space="preserve"> lint-staged</w:t>
             </w:r>
           </w:p>
         </w:tc>
@@ -713,39 +1055,44 @@
         <w:rPr>
           <w:b/>
           <w:bCs/>
-          <w:color w:val="1F3864"/>
-        </w:rPr>
+        </w:rPr>
+        <w:lastRenderedPageBreak/>
         <w:t xml:space="preserve">Verified live: </w:t>
       </w:r>
       <w:r>
-        <w:t xml:space="preserve">the hook fired during the actual Phase 4 commit (§9) — lint-staged ran, reformatted the staged files, and the commit completed with the corrected files included, exactly as designed.</w:t>
+        <w:t>the hook fired during the actual Phase 4 commit (§9) — lint-staged ran, reformatted the staged files, and the commit completed with the corrected files included, exactly as designed.</w:t>
       </w:r>
     </w:p>
     <w:p>
       <w:pPr>
         <w:pStyle w:val="Heading1"/>
         <w:pBdr>
-          <w:bottom w:val="single" w:color="8EA9C1" w:sz="6" w:space="4"/>
+          <w:bottom w:val="single" w:sz="6" w:space="4" w:color="8EA9C1"/>
         </w:pBdr>
-        <w:spacing w:after="140" w:before="300"/>
-      </w:pPr>
-      <w:r>
-        <w:t xml:space="preserve">5. CI/CD Pipeline</w:t>
-      </w:r>
-    </w:p>
-    <w:p>
-      <w:pPr>
-        <w:spacing w:after="80" w:before="180"/>
-      </w:pPr>
-      <w:r>
-        <w:rPr>
-          <w:b/>
-          <w:bCs/>
-          <w:color w:val="2E5A88"/>
+        <w:spacing w:before="300" w:after="140"/>
+        <w:rPr>
+          <w:color w:val="auto"/>
+        </w:rPr>
+      </w:pPr>
+      <w:r>
+        <w:rPr>
+          <w:color w:val="auto"/>
+        </w:rPr>
+        <w:t>5. CI/CD Pipeline</w:t>
+      </w:r>
+    </w:p>
+    <w:p>
+      <w:pPr>
+        <w:spacing w:before="180" w:after="80"/>
+      </w:pPr>
+      <w:r>
+        <w:rPr>
+          <w:b/>
+          <w:bCs/>
           <w:sz w:val="23"/>
           <w:szCs w:val="23"/>
         </w:rPr>
-        <w:t xml:space="preserve">GitHub Actions</w:t>
+        <w:t>GitHub Actions</w:t>
       </w:r>
     </w:p>
     <w:p>
@@ -753,58 +1100,77 @@
         <w:spacing w:after="110"/>
       </w:pPr>
       <w:r>
-        <w:t xml:space="preserve">.github/workflows/ci.yml triggers on every push and pull request to main:</w:t>
+        <w:t>.</w:t>
+      </w:r>
+      <w:proofErr w:type="spellStart"/>
+      <w:r>
+        <w:t>github</w:t>
+      </w:r>
+      <w:proofErr w:type="spellEnd"/>
+      <w:r>
+        <w:t>/workflows/</w:t>
+      </w:r>
+      <w:proofErr w:type="spellStart"/>
+      <w:r>
+        <w:t>ci.yml</w:t>
+      </w:r>
+      <w:proofErr w:type="spellEnd"/>
+      <w:r>
+        <w:t xml:space="preserve"> triggers on every push and pull request to main:</w:t>
       </w:r>
     </w:p>
     <w:tbl>
       <w:tblPr>
-        <w:tblW w:type="dxa" w:w="10466"/>
+        <w:tblW w:w="10466" w:type="dxa"/>
         <w:tblBorders>
-          <w:top w:val="single" w:color="auto" w:sz="4"/>
-          <w:left w:val="single" w:color="auto" w:sz="4"/>
-          <w:bottom w:val="single" w:color="auto" w:sz="4"/>
-          <w:right w:val="single" w:color="auto" w:sz="4"/>
-          <w:insideH w:val="single" w:color="auto" w:sz="4"/>
-          <w:insideV w:val="single" w:color="auto" w:sz="4"/>
+          <w:top w:val="single" w:sz="4" w:space="0" w:color="auto"/>
+          <w:left w:val="single" w:sz="4" w:space="0" w:color="auto"/>
+          <w:bottom w:val="single" w:sz="4" w:space="0" w:color="auto"/>
+          <w:right w:val="single" w:sz="4" w:space="0" w:color="auto"/>
+          <w:insideH w:val="single" w:sz="4" w:space="0" w:color="auto"/>
+          <w:insideV w:val="single" w:sz="4" w:space="0" w:color="auto"/>
         </w:tblBorders>
+        <w:tblCellMar>
+          <w:left w:w="10" w:type="dxa"/>
+          <w:right w:w="10" w:type="dxa"/>
+        </w:tblCellMar>
+        <w:tblLook w:val="04A0" w:firstRow="1" w:lastRow="0" w:firstColumn="1" w:lastColumn="0" w:noHBand="0" w:noVBand="1"/>
       </w:tblPr>
       <w:tblGrid>
         <w:gridCol w:w="10466"/>
       </w:tblGrid>
       <w:tr>
+        <w:tblPrEx>
+          <w:tblCellMar>
+            <w:top w:w="0" w:type="dxa"/>
+            <w:bottom w:w="0" w:type="dxa"/>
+          </w:tblCellMar>
+        </w:tblPrEx>
         <w:tc>
           <w:tcPr>
-            <w:tcW w:type="dxa" w:w="10466"/>
-            <w:shd w:fill="F3F6FA" w:val="clear"/>
+            <w:tcW w:w="10466" w:type="dxa"/>
+            <w:shd w:val="clear" w:color="auto" w:fill="F3F6FA"/>
             <w:tcMar>
-              <w:top w:type="dxa" w:w="140"/>
-              <w:left w:type="dxa" w:w="180"/>
-              <w:bottom w:type="dxa" w:w="140"/>
-              <w:right w:type="dxa" w:w="180"/>
+              <w:top w:w="140" w:type="dxa"/>
+              <w:left w:w="180" w:type="dxa"/>
+              <w:bottom w:w="140" w:type="dxa"/>
+              <w:right w:w="180" w:type="dxa"/>
             </w:tcMar>
           </w:tcPr>
           <w:p>
-            <w:pPr>
-              <w:spacing w:after="0"/>
-            </w:pPr>
-            <w:r>
-              <w:rPr>
-                <w:rFonts w:ascii="Consolas" w:cs="Consolas" w:eastAsia="Consolas" w:hAnsi="Consolas"/>
-                <w:color w:val="2B2B2B"/>
-                <w:sz w:val="18"/>
-                <w:szCs w:val="18"/>
-              </w:rPr>
-              <w:t xml:space="preserve">jobs: lint-and-build</w:t>
+            <w:r>
+              <w:rPr>
+                <w:rFonts w:ascii="Consolas" w:eastAsia="Consolas" w:hAnsi="Consolas" w:cs="Consolas"/>
+                <w:sz w:val="18"/>
+                <w:szCs w:val="18"/>
+              </w:rPr>
+              <w:t>jobs: lint-and-build</w:t>
             </w:r>
           </w:p>
           <w:p>
-            <w:pPr>
-              <w:spacing w:after="0"/>
-            </w:pPr>
-            <w:r>
-              <w:rPr>
-                <w:rFonts w:ascii="Consolas" w:cs="Consolas" w:eastAsia="Consolas" w:hAnsi="Consolas"/>
-                <w:color w:val="2B2B2B"/>
+            <w:r>
+              <w:rPr>
+                <w:rFonts w:ascii="Consolas" w:eastAsia="Consolas" w:hAnsi="Consolas" w:cs="Consolas"/>
                 <w:sz w:val="18"/>
                 <w:szCs w:val="18"/>
               </w:rPr>
@@ -812,73 +1178,155 @@
             </w:r>
           </w:p>
           <w:p>
-            <w:pPr>
-              <w:spacing w:after="0"/>
-            </w:pPr>
-            <w:r>
-              <w:rPr>
-                <w:rFonts w:ascii="Consolas" w:cs="Consolas" w:eastAsia="Consolas" w:hAnsi="Consolas"/>
-                <w:color w:val="2B2B2B"/>
-                <w:sz w:val="18"/>
-                <w:szCs w:val="18"/>
-              </w:rPr>
-              <w:t xml:space="preserve">  2. actions/setup-node (Node 20, npm cache)</w:t>
+            <w:r>
+              <w:rPr>
+                <w:rFonts w:ascii="Consolas" w:eastAsia="Consolas" w:hAnsi="Consolas" w:cs="Consolas"/>
+                <w:sz w:val="18"/>
+                <w:szCs w:val="18"/>
+              </w:rPr>
+              <w:t xml:space="preserve">  2. actions/setup-node (Node 20, </w:t>
+            </w:r>
+            <w:proofErr w:type="spellStart"/>
+            <w:r>
+              <w:rPr>
+                <w:rFonts w:ascii="Consolas" w:eastAsia="Consolas" w:hAnsi="Consolas" w:cs="Consolas"/>
+                <w:sz w:val="18"/>
+                <w:szCs w:val="18"/>
+              </w:rPr>
+              <w:t>npm</w:t>
+            </w:r>
+            <w:proofErr w:type="spellEnd"/>
+            <w:r>
+              <w:rPr>
+                <w:rFonts w:ascii="Consolas" w:eastAsia="Consolas" w:hAnsi="Consolas" w:cs="Consolas"/>
+                <w:sz w:val="18"/>
+                <w:szCs w:val="18"/>
+              </w:rPr>
+              <w:t xml:space="preserve"> cache)</w:t>
             </w:r>
           </w:p>
           <w:p>
-            <w:pPr>
-              <w:spacing w:after="0"/>
-            </w:pPr>
-            <w:r>
-              <w:rPr>
-                <w:rFonts w:ascii="Consolas" w:cs="Consolas" w:eastAsia="Consolas" w:hAnsi="Consolas"/>
-                <w:color w:val="2B2B2B"/>
-                <w:sz w:val="18"/>
-                <w:szCs w:val="18"/>
-              </w:rPr>
-              <w:t xml:space="preserve">  3. npm ci</w:t>
+            <w:r>
+              <w:rPr>
+                <w:rFonts w:ascii="Consolas" w:eastAsia="Consolas" w:hAnsi="Consolas" w:cs="Consolas"/>
+                <w:sz w:val="18"/>
+                <w:szCs w:val="18"/>
+              </w:rPr>
+              <w:t xml:space="preserve">  3. </w:t>
+            </w:r>
+            <w:proofErr w:type="spellStart"/>
+            <w:r>
+              <w:rPr>
+                <w:rFonts w:ascii="Consolas" w:eastAsia="Consolas" w:hAnsi="Consolas" w:cs="Consolas"/>
+                <w:sz w:val="18"/>
+                <w:szCs w:val="18"/>
+              </w:rPr>
+              <w:t>npm</w:t>
+            </w:r>
+            <w:proofErr w:type="spellEnd"/>
+            <w:r>
+              <w:rPr>
+                <w:rFonts w:ascii="Consolas" w:eastAsia="Consolas" w:hAnsi="Consolas" w:cs="Consolas"/>
+                <w:sz w:val="18"/>
+                <w:szCs w:val="18"/>
+              </w:rPr>
+              <w:t xml:space="preserve"> ci</w:t>
             </w:r>
           </w:p>
           <w:p>
-            <w:pPr>
-              <w:spacing w:after="0"/>
-            </w:pPr>
-            <w:r>
-              <w:rPr>
-                <w:rFonts w:ascii="Consolas" w:cs="Consolas" w:eastAsia="Consolas" w:hAnsi="Consolas"/>
-                <w:color w:val="2B2B2B"/>
-                <w:sz w:val="18"/>
-                <w:szCs w:val="18"/>
-              </w:rPr>
-              <w:t xml:space="preserve">  4. npm run format:check</w:t>
-            </w:r>
+            <w:r>
+              <w:rPr>
+                <w:rFonts w:ascii="Consolas" w:eastAsia="Consolas" w:hAnsi="Consolas" w:cs="Consolas"/>
+                <w:sz w:val="18"/>
+                <w:szCs w:val="18"/>
+              </w:rPr>
+              <w:t xml:space="preserve">  4. </w:t>
+            </w:r>
+            <w:proofErr w:type="spellStart"/>
+            <w:r>
+              <w:rPr>
+                <w:rFonts w:ascii="Consolas" w:eastAsia="Consolas" w:hAnsi="Consolas" w:cs="Consolas"/>
+                <w:sz w:val="18"/>
+                <w:szCs w:val="18"/>
+              </w:rPr>
+              <w:t>npm</w:t>
+            </w:r>
+            <w:proofErr w:type="spellEnd"/>
+            <w:r>
+              <w:rPr>
+                <w:rFonts w:ascii="Consolas" w:eastAsia="Consolas" w:hAnsi="Consolas" w:cs="Consolas"/>
+                <w:sz w:val="18"/>
+                <w:szCs w:val="18"/>
+              </w:rPr>
+              <w:t xml:space="preserve"> run </w:t>
+            </w:r>
+            <w:proofErr w:type="spellStart"/>
+            <w:proofErr w:type="gramStart"/>
+            <w:r>
+              <w:rPr>
+                <w:rFonts w:ascii="Consolas" w:eastAsia="Consolas" w:hAnsi="Consolas" w:cs="Consolas"/>
+                <w:sz w:val="18"/>
+                <w:szCs w:val="18"/>
+              </w:rPr>
+              <w:t>format:check</w:t>
+            </w:r>
+            <w:proofErr w:type="spellEnd"/>
+            <w:proofErr w:type="gramEnd"/>
           </w:p>
           <w:p>
-            <w:pPr>
-              <w:spacing w:after="0"/>
-            </w:pPr>
-            <w:r>
-              <w:rPr>
-                <w:rFonts w:ascii="Consolas" w:cs="Consolas" w:eastAsia="Consolas" w:hAnsi="Consolas"/>
-                <w:color w:val="2B2B2B"/>
-                <w:sz w:val="18"/>
-                <w:szCs w:val="18"/>
-              </w:rPr>
-              <w:t xml:space="preserve">  5. npm run lint</w:t>
+            <w:r>
+              <w:rPr>
+                <w:rFonts w:ascii="Consolas" w:eastAsia="Consolas" w:hAnsi="Consolas" w:cs="Consolas"/>
+                <w:sz w:val="18"/>
+                <w:szCs w:val="18"/>
+              </w:rPr>
+              <w:t xml:space="preserve">  5. </w:t>
+            </w:r>
+            <w:proofErr w:type="spellStart"/>
+            <w:r>
+              <w:rPr>
+                <w:rFonts w:ascii="Consolas" w:eastAsia="Consolas" w:hAnsi="Consolas" w:cs="Consolas"/>
+                <w:sz w:val="18"/>
+                <w:szCs w:val="18"/>
+              </w:rPr>
+              <w:t>npm</w:t>
+            </w:r>
+            <w:proofErr w:type="spellEnd"/>
+            <w:r>
+              <w:rPr>
+                <w:rFonts w:ascii="Consolas" w:eastAsia="Consolas" w:hAnsi="Consolas" w:cs="Consolas"/>
+                <w:sz w:val="18"/>
+                <w:szCs w:val="18"/>
+              </w:rPr>
+              <w:t xml:space="preserve"> run lint</w:t>
             </w:r>
           </w:p>
           <w:p>
-            <w:pPr>
-              <w:spacing w:after="0"/>
-            </w:pPr>
-            <w:r>
-              <w:rPr>
-                <w:rFonts w:ascii="Consolas" w:cs="Consolas" w:eastAsia="Consolas" w:hAnsi="Consolas"/>
-                <w:color w:val="2B2B2B"/>
-                <w:sz w:val="18"/>
-                <w:szCs w:val="18"/>
-              </w:rPr>
-              <w:t xml:space="preserve">  6. npm run build</w:t>
+            <w:r>
+              <w:rPr>
+                <w:rFonts w:ascii="Consolas" w:eastAsia="Consolas" w:hAnsi="Consolas" w:cs="Consolas"/>
+                <w:sz w:val="18"/>
+                <w:szCs w:val="18"/>
+              </w:rPr>
+              <w:t xml:space="preserve">  6. </w:t>
+            </w:r>
+            <w:proofErr w:type="spellStart"/>
+            <w:r>
+              <w:rPr>
+                <w:rFonts w:ascii="Consolas" w:eastAsia="Consolas" w:hAnsi="Consolas" w:cs="Consolas"/>
+                <w:sz w:val="18"/>
+                <w:szCs w:val="18"/>
+              </w:rPr>
+              <w:t>npm</w:t>
+            </w:r>
+            <w:proofErr w:type="spellEnd"/>
+            <w:r>
+              <w:rPr>
+                <w:rFonts w:ascii="Consolas" w:eastAsia="Consolas" w:hAnsi="Consolas" w:cs="Consolas"/>
+                <w:sz w:val="18"/>
+                <w:szCs w:val="18"/>
+              </w:rPr>
+              <w:t xml:space="preserve"> run build</w:t>
             </w:r>
           </w:p>
         </w:tc>
@@ -889,23 +1337,24 @@
         <w:spacing w:after="110"/>
       </w:pPr>
       <w:r>
-        <w:t xml:space="preserve">A failure at any step blocks the merge — matching the Execution Plan's explicit requirement that the pipeline “fail the build on non-compliant code.”</w:t>
-      </w:r>
-    </w:p>
-    <w:p>
-      <w:pPr>
-        <w:spacing w:after="80" w:before="180"/>
-      </w:pPr>
-      <w:r>
-        <w:rPr>
-          <w:b/>
-          <w:bCs/>
-          <w:color w:val="2E5A88"/>
+        <w:t>A failure at any step blocks the merge — matching the Execution Plan's explicit requirement that the pipeline “fail the build on non-compliant code.”</w:t>
+      </w:r>
+    </w:p>
+    <w:p>
+      <w:pPr>
+        <w:spacing w:before="180" w:after="80"/>
+      </w:pPr>
+      <w:proofErr w:type="spellStart"/>
+      <w:r>
+        <w:rPr>
+          <w:b/>
+          <w:bCs/>
           <w:sz w:val="23"/>
           <w:szCs w:val="23"/>
         </w:rPr>
-        <w:t xml:space="preserve">Vercel</w:t>
-      </w:r>
+        <w:t>Vercel</w:t>
+      </w:r>
+      <w:proofErr w:type="spellEnd"/>
     </w:p>
     <w:p>
       <w:pPr>
@@ -920,24 +1369,67 @@
         <w:rPr>
           <w:b/>
           <w:bCs/>
-          <w:color w:val="A15C00"/>
         </w:rPr>
         <w:t xml:space="preserve">○ Pending (your action) — </w:t>
       </w:r>
       <w:r>
-        <w:t xml:space="preserve">not yet connected — requires your own Vercel account. The README's “One-time manual setup” section has the exact steps: import the pushed GitHub repository, confirm the default Next.js build settings, add the same environment variables as .env.local, and deploy. Once connected, every push to main auto-deploys to production and every pull request gets its own preview deployment.</w:t>
+        <w:t xml:space="preserve">not yet connected — requires your own </w:t>
+      </w:r>
+      <w:proofErr w:type="spellStart"/>
+      <w:r>
+        <w:t>Vercel</w:t>
+      </w:r>
+      <w:proofErr w:type="spellEnd"/>
+      <w:r>
+        <w:t xml:space="preserve"> account. The README's “One-time manual setup” section has the exact steps: import the pushed GitHub repository, confirm the default Next.js build settings, add the same environment variables </w:t>
+      </w:r>
+      <w:proofErr w:type="gramStart"/>
+      <w:r>
+        <w:t>as .</w:t>
+      </w:r>
+      <w:proofErr w:type="spellStart"/>
+      <w:r>
+        <w:t>env</w:t>
+      </w:r>
+      <w:proofErr w:type="gramEnd"/>
+      <w:r>
+        <w:t>.local</w:t>
+      </w:r>
+      <w:proofErr w:type="spellEnd"/>
+      <w:r>
+        <w:t>, and deploy. Once connected, every push to main auto-deploys to production and every pull request gets its own preview deployment.</w:t>
       </w:r>
     </w:p>
     <w:p>
       <w:pPr>
         <w:pStyle w:val="Heading1"/>
         <w:pBdr>
-          <w:bottom w:val="single" w:color="8EA9C1" w:sz="6" w:space="4"/>
+          <w:bottom w:val="single" w:sz="6" w:space="4" w:color="8EA9C1"/>
         </w:pBdr>
-        <w:spacing w:after="140" w:before="300"/>
-      </w:pPr>
-      <w:r>
-        <w:t xml:space="preserve">6. Supabase and Environment Variables</w:t>
+        <w:spacing w:before="300" w:after="140"/>
+        <w:rPr>
+          <w:color w:val="auto"/>
+        </w:rPr>
+      </w:pPr>
+      <w:r>
+        <w:rPr>
+          <w:color w:val="auto"/>
+        </w:rPr>
+        <w:t xml:space="preserve">6. </w:t>
+      </w:r>
+      <w:proofErr w:type="spellStart"/>
+      <w:r>
+        <w:rPr>
+          <w:color w:val="auto"/>
+        </w:rPr>
+        <w:t>Supabase</w:t>
+      </w:r>
+      <w:proofErr w:type="spellEnd"/>
+      <w:r>
+        <w:rPr>
+          <w:color w:val="auto"/>
+        </w:rPr>
+        <w:t xml:space="preserve"> and Environment Variables</w:t>
       </w:r>
     </w:p>
     <w:p>
@@ -949,17 +1441,40 @@
         </w:numPr>
         <w:spacing w:after="80"/>
       </w:pPr>
-      <w:r>
-        <w:rPr>
-          <w:b/>
-          <w:bCs/>
-          <w:i w:val="false"/>
-          <w:iCs w:val="false"/>
-        </w:rPr>
-        <w:t xml:space="preserve">.env.local.example </w:t>
-      </w:r>
-      <w:r>
-        <w:t xml:space="preserve">added as a committed template with four fields: NEXT_PUBLIC_SUPABASE_URL, NEXT_PUBLIC_SUPABASE_ANON_KEY, SUPABASE_SERVICE_ROLE_KEY, and DATABASE_URL.</w:t>
+      <w:proofErr w:type="gramStart"/>
+      <w:r>
+        <w:rPr>
+          <w:b/>
+          <w:bCs/>
+        </w:rPr>
+        <w:t>.</w:t>
+      </w:r>
+      <w:proofErr w:type="spellStart"/>
+      <w:r>
+        <w:rPr>
+          <w:b/>
+          <w:bCs/>
+        </w:rPr>
+        <w:t>env</w:t>
+      </w:r>
+      <w:proofErr w:type="gramEnd"/>
+      <w:r>
+        <w:rPr>
+          <w:b/>
+          <w:bCs/>
+        </w:rPr>
+        <w:t>.local.example</w:t>
+      </w:r>
+      <w:proofErr w:type="spellEnd"/>
+      <w:r>
+        <w:rPr>
+          <w:b/>
+          <w:bCs/>
+        </w:rPr>
+        <w:t xml:space="preserve"> </w:t>
+      </w:r>
+      <w:r>
+        <w:t>added as a committed template with four fields: NEXT_PUBLIC_SUPABASE_URL, NEXT_PUBLIC_SUPABASE_ANON_KEY, SUPABASE_SERVICE_ROLE_KEY, and DATABASE_URL.</w:t>
       </w:r>
     </w:p>
     <w:p>
@@ -971,17 +1486,73 @@
         </w:numPr>
         <w:spacing w:after="80"/>
       </w:pPr>
-      <w:r>
-        <w:rPr>
-          <w:b/>
-          <w:bCs/>
-          <w:i w:val="false"/>
-          <w:iCs w:val="false"/>
-        </w:rPr>
-        <w:t xml:space="preserve">.gitignore fix: </w:t>
-      </w:r>
-      <w:r>
-        <w:t xml:space="preserve">the original .env* rule was also silently ignoring .env.local.example. Added !.env.local.example so the template stays tracked while every real .env file (with actual secrets) stays ignored — confirmed with git check-ignore before and after.</w:t>
+      <w:proofErr w:type="gramStart"/>
+      <w:r>
+        <w:rPr>
+          <w:b/>
+          <w:bCs/>
+        </w:rPr>
+        <w:t>.</w:t>
+      </w:r>
+      <w:proofErr w:type="spellStart"/>
+      <w:r>
+        <w:rPr>
+          <w:b/>
+          <w:bCs/>
+        </w:rPr>
+        <w:t>gitignore</w:t>
+      </w:r>
+      <w:proofErr w:type="spellEnd"/>
+      <w:proofErr w:type="gramEnd"/>
+      <w:r>
+        <w:rPr>
+          <w:b/>
+          <w:bCs/>
+        </w:rPr>
+        <w:t xml:space="preserve"> fix: </w:t>
+      </w:r>
+      <w:r>
+        <w:t xml:space="preserve">the </w:t>
+      </w:r>
+      <w:proofErr w:type="gramStart"/>
+      <w:r>
+        <w:t>original .env</w:t>
+      </w:r>
+      <w:proofErr w:type="gramEnd"/>
+      <w:r>
+        <w:t xml:space="preserve">* rule was also silently </w:t>
+      </w:r>
+      <w:proofErr w:type="gramStart"/>
+      <w:r>
+        <w:t>ignoring .</w:t>
+      </w:r>
+      <w:proofErr w:type="spellStart"/>
+      <w:r>
+        <w:t>env</w:t>
+      </w:r>
+      <w:proofErr w:type="gramEnd"/>
+      <w:r>
+        <w:t>.local.example</w:t>
+      </w:r>
+      <w:proofErr w:type="spellEnd"/>
+      <w:r>
+        <w:t xml:space="preserve">. </w:t>
+      </w:r>
+      <w:proofErr w:type="gramStart"/>
+      <w:r>
+        <w:t>Added !.</w:t>
+      </w:r>
+      <w:proofErr w:type="spellStart"/>
+      <w:r>
+        <w:t>env</w:t>
+      </w:r>
+      <w:proofErr w:type="gramEnd"/>
+      <w:r>
+        <w:t>.local.example</w:t>
+      </w:r>
+      <w:proofErr w:type="spellEnd"/>
+      <w:r>
+        <w:t xml:space="preserve"> so the template stays tracked while every real .env file (with actual secrets) stays ignored — confirmed with git check-ignore before and after.</w:t>
       </w:r>
     </w:p>
     <w:p>
@@ -997,24 +1568,66 @@
         <w:rPr>
           <w:b/>
           <w:bCs/>
-          <w:color w:val="A15C00"/>
         </w:rPr>
         <w:t xml:space="preserve">○ Pending (your action) — </w:t>
       </w:r>
-      <w:r>
-        <w:t xml:space="preserve">Supabase project not yet provisioned — requires your own Supabase account. Once created, copy its API URL/keys and database connection string into a local .env.local (not committed) and into Vercel's environment variables.</w:t>
+      <w:proofErr w:type="spellStart"/>
+      <w:r>
+        <w:t>Supabase</w:t>
+      </w:r>
+      <w:proofErr w:type="spellEnd"/>
+      <w:r>
+        <w:t xml:space="preserve"> project not yet provisioned — requires your own </w:t>
+      </w:r>
+      <w:proofErr w:type="spellStart"/>
+      <w:r>
+        <w:t>Supabase</w:t>
+      </w:r>
+      <w:proofErr w:type="spellEnd"/>
+      <w:r>
+        <w:t xml:space="preserve"> account. Once created, copy its API URL/keys and database connection string into a </w:t>
+      </w:r>
+      <w:proofErr w:type="gramStart"/>
+      <w:r>
+        <w:t>local .</w:t>
+      </w:r>
+      <w:proofErr w:type="spellStart"/>
+      <w:r>
+        <w:t>env</w:t>
+      </w:r>
+      <w:proofErr w:type="gramEnd"/>
+      <w:r>
+        <w:t>.local</w:t>
+      </w:r>
+      <w:proofErr w:type="spellEnd"/>
+      <w:r>
+        <w:t xml:space="preserve"> (not committed) and into </w:t>
+      </w:r>
+      <w:proofErr w:type="spellStart"/>
+      <w:r>
+        <w:t>Vercel's</w:t>
+      </w:r>
+      <w:proofErr w:type="spellEnd"/>
+      <w:r>
+        <w:t xml:space="preserve"> environment variables.</w:t>
       </w:r>
     </w:p>
     <w:p>
       <w:pPr>
         <w:pStyle w:val="Heading1"/>
         <w:pBdr>
-          <w:bottom w:val="single" w:color="8EA9C1" w:sz="6" w:space="4"/>
+          <w:bottom w:val="single" w:sz="6" w:space="4" w:color="8EA9C1"/>
         </w:pBdr>
-        <w:spacing w:after="140" w:before="300"/>
-      </w:pPr>
-      <w:r>
-        <w:t xml:space="preserve">7. Python Environment for Dummy Data</w:t>
+        <w:spacing w:before="300" w:after="140"/>
+        <w:rPr>
+          <w:color w:val="auto"/>
+        </w:rPr>
+      </w:pPr>
+      <w:r>
+        <w:rPr>
+          <w:color w:val="auto"/>
+        </w:rPr>
+        <w:t>7. Python Environment for Dummy Data</w:t>
       </w:r>
     </w:p>
     <w:p>
@@ -1030,13 +1643,19 @@
         <w:rPr>
           <w:b/>
           <w:bCs/>
-          <w:i w:val="false"/>
-          <w:iCs w:val="false"/>
         </w:rPr>
         <w:t xml:space="preserve">data/requirements.txt: </w:t>
       </w:r>
       <w:r>
-        <w:t xml:space="preserve">pandas, faker, psycopg2-binary, python-dotenv.</w:t>
+        <w:t>pandas, faker, psycopg2-binary, python-</w:t>
+      </w:r>
+      <w:proofErr w:type="spellStart"/>
+      <w:r>
+        <w:t>dotenv</w:t>
+      </w:r>
+      <w:proofErr w:type="spellEnd"/>
+      <w:r>
+        <w:t>.</w:t>
       </w:r>
     </w:p>
     <w:p>
@@ -1052,13 +1671,11 @@
         <w:rPr>
           <w:b/>
           <w:bCs/>
-          <w:i w:val="false"/>
-          <w:iCs w:val="false"/>
         </w:rPr>
         <w:t xml:space="preserve">data/seed.py: </w:t>
       </w:r>
       <w:r>
-        <w:t xml:space="preserve">scaffolded with a docstring describing its purpose and referencing the Phase 2 Analysis calculations and the Phase 3 SDD's Database Design — the generation logic itself is Phase 5 (Development) work, not Phase 4.</w:t>
+        <w:t>scaffolded with a docstring describing its purpose and referencing the Phase 2 Analysis calculations and the Phase 3 SDD's Database Design — the generation logic itself is Phase 5 (Development) work, not Phase 4.</w:t>
       </w:r>
     </w:p>
     <w:p>
@@ -1070,29 +1687,85 @@
         </w:numPr>
         <w:spacing w:after="80"/>
       </w:pPr>
-      <w:r>
-        <w:rPr>
-          <w:b/>
-          <w:bCs/>
-          <w:i w:val="false"/>
-          <w:iCs w:val="false"/>
-        </w:rPr>
-        <w:t xml:space="preserve">.gitignore: </w:t>
-      </w:r>
-      <w:r>
-        <w:t xml:space="preserve">__pycache__/, *.pyc, .venv/ and venv/ added alongside the existing Next.js/node ignores.</w:t>
+      <w:proofErr w:type="gramStart"/>
+      <w:r>
+        <w:rPr>
+          <w:b/>
+          <w:bCs/>
+        </w:rPr>
+        <w:t>.</w:t>
+      </w:r>
+      <w:proofErr w:type="spellStart"/>
+      <w:r>
+        <w:rPr>
+          <w:b/>
+          <w:bCs/>
+        </w:rPr>
+        <w:t>gitignore</w:t>
+      </w:r>
+      <w:proofErr w:type="spellEnd"/>
+      <w:proofErr w:type="gramEnd"/>
+      <w:r>
+        <w:rPr>
+          <w:b/>
+          <w:bCs/>
+        </w:rPr>
+        <w:t xml:space="preserve">: </w:t>
+      </w:r>
+      <w:r>
+        <w:t>__</w:t>
+      </w:r>
+      <w:proofErr w:type="spellStart"/>
+      <w:r>
+        <w:t>pycache</w:t>
+      </w:r>
+      <w:proofErr w:type="spellEnd"/>
+      <w:r>
+        <w:t>__/, *.</w:t>
+      </w:r>
+      <w:proofErr w:type="spellStart"/>
+      <w:r>
+        <w:t>pyc</w:t>
+      </w:r>
+      <w:proofErr w:type="spellEnd"/>
+      <w:proofErr w:type="gramStart"/>
+      <w:r>
+        <w:t>, .</w:t>
+      </w:r>
+      <w:proofErr w:type="spellStart"/>
+      <w:r>
+        <w:t>venv</w:t>
+      </w:r>
+      <w:proofErr w:type="spellEnd"/>
+      <w:proofErr w:type="gramEnd"/>
+      <w:r>
+        <w:t xml:space="preserve">/ and </w:t>
+      </w:r>
+      <w:proofErr w:type="spellStart"/>
+      <w:r>
+        <w:t>venv</w:t>
+      </w:r>
+      <w:proofErr w:type="spellEnd"/>
+      <w:r>
+        <w:t>/ added alongside the existing Next.js/node ignores.</w:t>
       </w:r>
     </w:p>
     <w:p>
       <w:pPr>
         <w:pStyle w:val="Heading1"/>
         <w:pBdr>
-          <w:bottom w:val="single" w:color="8EA9C1" w:sz="6" w:space="4"/>
+          <w:bottom w:val="single" w:sz="6" w:space="4" w:color="8EA9C1"/>
         </w:pBdr>
-        <w:spacing w:after="140" w:before="300"/>
-      </w:pPr>
-      <w:r>
-        <w:t xml:space="preserve">8. Git Workflow Conventions</w:t>
+        <w:spacing w:before="300" w:after="140"/>
+        <w:rPr>
+          <w:color w:val="auto"/>
+        </w:rPr>
+      </w:pPr>
+      <w:r>
+        <w:rPr>
+          <w:color w:val="auto"/>
+        </w:rPr>
+        <w:t>8. Git Workflow Conventions</w:t>
       </w:r>
     </w:p>
     <w:p>
@@ -1105,7 +1778,31 @@
         <w:spacing w:after="80"/>
       </w:pPr>
       <w:r>
-        <w:t xml:space="preserve">Commit messages follow Conventional Commits (feat:, fix:, chore:, docs:) — documented in the README so the convention is explicit, not assumed.</w:t>
+        <w:t>Commit messages follow Conventional Commits (</w:t>
+      </w:r>
+      <w:proofErr w:type="gramStart"/>
+      <w:r>
+        <w:t>feat:,</w:t>
+      </w:r>
+      <w:proofErr w:type="gramEnd"/>
+      <w:r>
+        <w:t xml:space="preserve"> </w:t>
+      </w:r>
+      <w:proofErr w:type="gramStart"/>
+      <w:r>
+        <w:t>fix:,</w:t>
+      </w:r>
+      <w:proofErr w:type="gramEnd"/>
+      <w:r>
+        <w:t xml:space="preserve"> </w:t>
+      </w:r>
+      <w:proofErr w:type="gramStart"/>
+      <w:r>
+        <w:t>chore:,</w:t>
+      </w:r>
+      <w:proofErr w:type="gramEnd"/>
+      <w:r>
+        <w:t xml:space="preserve"> docs:) — documented in the README so the convention is explicit, not assumed.</w:t>
       </w:r>
     </w:p>
     <w:p>
@@ -1118,47 +1815,64 @@
         <w:spacing w:after="80"/>
       </w:pPr>
       <w:r>
-        <w:t xml:space="preserve">The README also documents the full local setup, the Python environment setup, and every script's purpose, per the Execution Plan's Phase 4 task to “document setup/run instructions in the README.”</w:t>
+        <w:t>The README also documents the full local setup, the Python environment setup, and every script's purpose, per the Execution Plan's Phase 4 task to “document setup/run instructions in the README.”</w:t>
       </w:r>
     </w:p>
     <w:p>
       <w:pPr>
         <w:pStyle w:val="Heading1"/>
         <w:pBdr>
-          <w:bottom w:val="single" w:color="8EA9C1" w:sz="6" w:space="4"/>
+          <w:bottom w:val="single" w:sz="6" w:space="4" w:color="8EA9C1"/>
         </w:pBdr>
-        <w:spacing w:after="140" w:before="300"/>
-      </w:pPr>
-      <w:r>
-        <w:t xml:space="preserve">9. Verification</w:t>
+        <w:spacing w:before="300" w:after="140"/>
+        <w:rPr>
+          <w:color w:val="auto"/>
+        </w:rPr>
+      </w:pPr>
+      <w:r>
+        <w:rPr>
+          <w:color w:val="auto"/>
+        </w:rPr>
+        <w:t>9. Verification</w:t>
       </w:r>
     </w:p>
     <w:tbl>
       <w:tblPr>
-        <w:tblW w:type="dxa" w:w="10466"/>
+        <w:tblW w:w="10466" w:type="dxa"/>
         <w:tblBorders>
-          <w:top w:val="single" w:color="auto" w:sz="4"/>
-          <w:left w:val="single" w:color="auto" w:sz="4"/>
-          <w:bottom w:val="single" w:color="auto" w:sz="4"/>
-          <w:right w:val="single" w:color="auto" w:sz="4"/>
-          <w:insideH w:val="single" w:color="auto" w:sz="4"/>
-          <w:insideV w:val="single" w:color="auto" w:sz="4"/>
+          <w:top w:val="single" w:sz="4" w:space="0" w:color="auto"/>
+          <w:left w:val="single" w:sz="4" w:space="0" w:color="auto"/>
+          <w:bottom w:val="single" w:sz="4" w:space="0" w:color="auto"/>
+          <w:right w:val="single" w:sz="4" w:space="0" w:color="auto"/>
+          <w:insideH w:val="single" w:sz="4" w:space="0" w:color="auto"/>
+          <w:insideV w:val="single" w:sz="4" w:space="0" w:color="auto"/>
         </w:tblBorders>
+        <w:tblCellMar>
+          <w:left w:w="10" w:type="dxa"/>
+          <w:right w:w="10" w:type="dxa"/>
+        </w:tblCellMar>
+        <w:tblLook w:val="04A0" w:firstRow="1" w:lastRow="0" w:firstColumn="1" w:lastColumn="0" w:noHBand="0" w:noVBand="1"/>
       </w:tblPr>
       <w:tblGrid>
         <w:gridCol w:w="2800"/>
         <w:gridCol w:w="7666"/>
       </w:tblGrid>
       <w:tr>
+        <w:tblPrEx>
+          <w:tblCellMar>
+            <w:top w:w="0" w:type="dxa"/>
+            <w:bottom w:w="0" w:type="dxa"/>
+          </w:tblCellMar>
+        </w:tblPrEx>
         <w:tc>
           <w:tcPr>
-            <w:tcW w:type="dxa" w:w="2800"/>
-            <w:shd w:fill="DCE6F1" w:val="clear"/>
+            <w:tcW w:w="2800" w:type="dxa"/>
+            <w:shd w:val="clear" w:color="auto" w:fill="DCE6F1"/>
             <w:tcMar>
-              <w:top w:type="dxa" w:w="80"/>
-              <w:left w:type="dxa" w:w="100"/>
-              <w:bottom w:type="dxa" w:w="80"/>
-              <w:right w:type="dxa" w:w="100"/>
+              <w:top w:w="80" w:type="dxa"/>
+              <w:left w:w="100" w:type="dxa"/>
+              <w:bottom w:w="80" w:type="dxa"/>
+              <w:right w:w="100" w:type="dxa"/>
             </w:tcMar>
           </w:tcPr>
           <w:p>
@@ -1166,23 +1880,22 @@
               <w:rPr>
                 <w:b/>
                 <w:bCs/>
-                <w:color w:val="1F3864"/>
-                <w:sz w:val="18"/>
-                <w:szCs w:val="18"/>
-              </w:rPr>
-              <w:t xml:space="preserve">Check</w:t>
+                <w:sz w:val="18"/>
+                <w:szCs w:val="18"/>
+              </w:rPr>
+              <w:t>Check</w:t>
             </w:r>
           </w:p>
         </w:tc>
         <w:tc>
           <w:tcPr>
-            <w:tcW w:type="dxa" w:w="7666"/>
-            <w:shd w:fill="DCE6F1" w:val="clear"/>
+            <w:tcW w:w="7666" w:type="dxa"/>
+            <w:shd w:val="clear" w:color="auto" w:fill="DCE6F1"/>
             <w:tcMar>
-              <w:top w:type="dxa" w:w="80"/>
-              <w:left w:type="dxa" w:w="100"/>
-              <w:bottom w:type="dxa" w:w="80"/>
-              <w:right w:type="dxa" w:w="100"/>
+              <w:top w:w="80" w:type="dxa"/>
+              <w:left w:w="100" w:type="dxa"/>
+              <w:bottom w:w="80" w:type="dxa"/>
+              <w:right w:w="100" w:type="dxa"/>
             </w:tcMar>
           </w:tcPr>
           <w:p>
@@ -1190,241 +1903,278 @@
               <w:rPr>
                 <w:b/>
                 <w:bCs/>
-                <w:color w:val="1F3864"/>
-                <w:sz w:val="18"/>
-                <w:szCs w:val="18"/>
-              </w:rPr>
-              <w:t xml:space="preserve">Result</w:t>
+                <w:sz w:val="18"/>
+                <w:szCs w:val="18"/>
+              </w:rPr>
+              <w:t>Result</w:t>
             </w:r>
           </w:p>
         </w:tc>
       </w:tr>
       <w:tr>
+        <w:tblPrEx>
+          <w:tblCellMar>
+            <w:top w:w="0" w:type="dxa"/>
+            <w:bottom w:w="0" w:type="dxa"/>
+          </w:tblCellMar>
+        </w:tblPrEx>
         <w:tc>
           <w:tcPr>
-            <w:tcW w:type="dxa" w:w="2800"/>
+            <w:tcW w:w="2800" w:type="dxa"/>
             <w:tcMar>
-              <w:top w:type="dxa" w:w="80"/>
-              <w:left w:type="dxa" w:w="100"/>
-              <w:bottom w:type="dxa" w:w="80"/>
-              <w:right w:type="dxa" w:w="100"/>
+              <w:top w:w="80" w:type="dxa"/>
+              <w:left w:w="100" w:type="dxa"/>
+              <w:bottom w:w="80" w:type="dxa"/>
+              <w:right w:w="100" w:type="dxa"/>
             </w:tcMar>
           </w:tcPr>
           <w:p>
-            <w:r>
-              <w:rPr>
-                <w:b w:val="false"/>
-                <w:bCs w:val="false"/>
-                <w:sz w:val="18"/>
-                <w:szCs w:val="18"/>
-              </w:rPr>
-              <w:t xml:space="preserve">npm run build</w:t>
+            <w:proofErr w:type="spellStart"/>
+            <w:r>
+              <w:rPr>
+                <w:sz w:val="18"/>
+                <w:szCs w:val="18"/>
+              </w:rPr>
+              <w:t>npm</w:t>
+            </w:r>
+            <w:proofErr w:type="spellEnd"/>
+            <w:r>
+              <w:rPr>
+                <w:sz w:val="18"/>
+                <w:szCs w:val="18"/>
+              </w:rPr>
+              <w:t xml:space="preserve"> run build</w:t>
             </w:r>
           </w:p>
         </w:tc>
         <w:tc>
           <w:tcPr>
-            <w:tcW w:type="dxa" w:w="7666"/>
+            <w:tcW w:w="7666" w:type="dxa"/>
             <w:tcMar>
-              <w:top w:type="dxa" w:w="80"/>
-              <w:left w:type="dxa" w:w="100"/>
-              <w:bottom w:type="dxa" w:w="80"/>
-              <w:right w:type="dxa" w:w="100"/>
+              <w:top w:w="80" w:type="dxa"/>
+              <w:left w:w="100" w:type="dxa"/>
+              <w:bottom w:w="80" w:type="dxa"/>
+              <w:right w:w="100" w:type="dxa"/>
             </w:tcMar>
           </w:tcPr>
           <w:p>
             <w:r>
               <w:rPr>
-                <w:b w:val="false"/>
-                <w:bCs w:val="false"/>
-                <w:sz w:val="18"/>
-                <w:szCs w:val="18"/>
-              </w:rPr>
-              <w:t xml:space="preserve">Passed — compiled successfully, static pages generated</w:t>
+                <w:sz w:val="18"/>
+                <w:szCs w:val="18"/>
+              </w:rPr>
+              <w:t>Passed — compiled successfully, static pages generated</w:t>
             </w:r>
           </w:p>
         </w:tc>
       </w:tr>
       <w:tr>
+        <w:tblPrEx>
+          <w:tblCellMar>
+            <w:top w:w="0" w:type="dxa"/>
+            <w:bottom w:w="0" w:type="dxa"/>
+          </w:tblCellMar>
+        </w:tblPrEx>
         <w:tc>
           <w:tcPr>
-            <w:tcW w:type="dxa" w:w="2800"/>
+            <w:tcW w:w="2800" w:type="dxa"/>
             <w:tcMar>
-              <w:top w:type="dxa" w:w="80"/>
-              <w:left w:type="dxa" w:w="100"/>
-              <w:bottom w:type="dxa" w:w="80"/>
-              <w:right w:type="dxa" w:w="100"/>
+              <w:top w:w="80" w:type="dxa"/>
+              <w:left w:w="100" w:type="dxa"/>
+              <w:bottom w:w="80" w:type="dxa"/>
+              <w:right w:w="100" w:type="dxa"/>
             </w:tcMar>
           </w:tcPr>
           <w:p>
-            <w:r>
-              <w:rPr>
-                <w:b w:val="false"/>
-                <w:bCs w:val="false"/>
-                <w:sz w:val="18"/>
-                <w:szCs w:val="18"/>
-              </w:rPr>
-              <w:t xml:space="preserve">npm run lint</w:t>
+            <w:proofErr w:type="spellStart"/>
+            <w:r>
+              <w:rPr>
+                <w:sz w:val="18"/>
+                <w:szCs w:val="18"/>
+              </w:rPr>
+              <w:lastRenderedPageBreak/>
+              <w:t>npm</w:t>
+            </w:r>
+            <w:proofErr w:type="spellEnd"/>
+            <w:r>
+              <w:rPr>
+                <w:sz w:val="18"/>
+                <w:szCs w:val="18"/>
+              </w:rPr>
+              <w:t xml:space="preserve"> run lint</w:t>
             </w:r>
           </w:p>
         </w:tc>
         <w:tc>
           <w:tcPr>
-            <w:tcW w:type="dxa" w:w="7666"/>
+            <w:tcW w:w="7666" w:type="dxa"/>
             <w:tcMar>
-              <w:top w:type="dxa" w:w="80"/>
-              <w:left w:type="dxa" w:w="100"/>
-              <w:bottom w:type="dxa" w:w="80"/>
-              <w:right w:type="dxa" w:w="100"/>
+              <w:top w:w="80" w:type="dxa"/>
+              <w:left w:w="100" w:type="dxa"/>
+              <w:bottom w:w="80" w:type="dxa"/>
+              <w:right w:w="100" w:type="dxa"/>
             </w:tcMar>
           </w:tcPr>
           <w:p>
             <w:r>
               <w:rPr>
-                <w:b w:val="false"/>
-                <w:bCs w:val="false"/>
-                <w:sz w:val="18"/>
-                <w:szCs w:val="18"/>
-              </w:rPr>
-              <w:t xml:space="preserve">Passed — exit code 0, no errors</w:t>
+                <w:sz w:val="18"/>
+                <w:szCs w:val="18"/>
+              </w:rPr>
+              <w:t>Passed — exit code 0, no errors</w:t>
             </w:r>
           </w:p>
         </w:tc>
       </w:tr>
       <w:tr>
+        <w:tblPrEx>
+          <w:tblCellMar>
+            <w:top w:w="0" w:type="dxa"/>
+            <w:bottom w:w="0" w:type="dxa"/>
+          </w:tblCellMar>
+        </w:tblPrEx>
         <w:tc>
           <w:tcPr>
-            <w:tcW w:type="dxa" w:w="2800"/>
+            <w:tcW w:w="2800" w:type="dxa"/>
             <w:tcMar>
-              <w:top w:type="dxa" w:w="80"/>
-              <w:left w:type="dxa" w:w="100"/>
-              <w:bottom w:type="dxa" w:w="80"/>
-              <w:right w:type="dxa" w:w="100"/>
+              <w:top w:w="80" w:type="dxa"/>
+              <w:left w:w="100" w:type="dxa"/>
+              <w:bottom w:w="80" w:type="dxa"/>
+              <w:right w:w="100" w:type="dxa"/>
             </w:tcMar>
           </w:tcPr>
           <w:p>
-            <w:r>
-              <w:rPr>
-                <w:b w:val="false"/>
-                <w:bCs w:val="false"/>
-                <w:sz w:val="18"/>
-                <w:szCs w:val="18"/>
-              </w:rPr>
-              <w:t xml:space="preserve">npm run format</w:t>
+            <w:proofErr w:type="spellStart"/>
+            <w:r>
+              <w:rPr>
+                <w:sz w:val="18"/>
+                <w:szCs w:val="18"/>
+              </w:rPr>
+              <w:t>npm</w:t>
+            </w:r>
+            <w:proofErr w:type="spellEnd"/>
+            <w:r>
+              <w:rPr>
+                <w:sz w:val="18"/>
+                <w:szCs w:val="18"/>
+              </w:rPr>
+              <w:t xml:space="preserve"> run format</w:t>
             </w:r>
           </w:p>
         </w:tc>
         <w:tc>
           <w:tcPr>
-            <w:tcW w:type="dxa" w:w="7666"/>
+            <w:tcW w:w="7666" w:type="dxa"/>
             <w:tcMar>
-              <w:top w:type="dxa" w:w="80"/>
-              <w:left w:type="dxa" w:w="100"/>
-              <w:bottom w:type="dxa" w:w="80"/>
-              <w:right w:type="dxa" w:w="100"/>
+              <w:top w:w="80" w:type="dxa"/>
+              <w:left w:w="100" w:type="dxa"/>
+              <w:bottom w:w="80" w:type="dxa"/>
+              <w:right w:w="100" w:type="dxa"/>
             </w:tcMar>
           </w:tcPr>
           <w:p>
             <w:r>
               <w:rPr>
-                <w:b w:val="false"/>
-                <w:bCs w:val="false"/>
-                <w:sz w:val="18"/>
-                <w:szCs w:val="18"/>
-              </w:rPr>
-              <w:t xml:space="preserve">Passed — all files formatted/confirmed unchanged</w:t>
+                <w:sz w:val="18"/>
+                <w:szCs w:val="18"/>
+              </w:rPr>
+              <w:t>Passed — all files formatted/confirmed unchanged</w:t>
             </w:r>
           </w:p>
         </w:tc>
       </w:tr>
       <w:tr>
+        <w:tblPrEx>
+          <w:tblCellMar>
+            <w:top w:w="0" w:type="dxa"/>
+            <w:bottom w:w="0" w:type="dxa"/>
+          </w:tblCellMar>
+        </w:tblPrEx>
         <w:tc>
           <w:tcPr>
-            <w:tcW w:type="dxa" w:w="2800"/>
+            <w:tcW w:w="2800" w:type="dxa"/>
             <w:tcMar>
-              <w:top w:type="dxa" w:w="80"/>
-              <w:left w:type="dxa" w:w="100"/>
-              <w:bottom w:type="dxa" w:w="80"/>
-              <w:right w:type="dxa" w:w="100"/>
+              <w:top w:w="80" w:type="dxa"/>
+              <w:left w:w="100" w:type="dxa"/>
+              <w:bottom w:w="80" w:type="dxa"/>
+              <w:right w:w="100" w:type="dxa"/>
             </w:tcMar>
           </w:tcPr>
           <w:p>
             <w:r>
               <w:rPr>
-                <w:b w:val="false"/>
-                <w:bCs w:val="false"/>
-                <w:sz w:val="18"/>
-                <w:szCs w:val="18"/>
-              </w:rPr>
-              <w:t xml:space="preserve">Pre-commit hook</w:t>
+                <w:sz w:val="18"/>
+                <w:szCs w:val="18"/>
+              </w:rPr>
+              <w:t>Pre-commit hook</w:t>
             </w:r>
           </w:p>
         </w:tc>
         <w:tc>
           <w:tcPr>
-            <w:tcW w:type="dxa" w:w="7666"/>
+            <w:tcW w:w="7666" w:type="dxa"/>
             <w:tcMar>
-              <w:top w:type="dxa" w:w="80"/>
-              <w:left w:type="dxa" w:w="100"/>
-              <w:bottom w:type="dxa" w:w="80"/>
-              <w:right w:type="dxa" w:w="100"/>
+              <w:top w:w="80" w:type="dxa"/>
+              <w:left w:w="100" w:type="dxa"/>
+              <w:bottom w:w="80" w:type="dxa"/>
+              <w:right w:w="100" w:type="dxa"/>
             </w:tcMar>
           </w:tcPr>
           <w:p>
             <w:r>
               <w:rPr>
-                <w:b w:val="false"/>
-                <w:bCs w:val="false"/>
-                <w:sz w:val="18"/>
-                <w:szCs w:val="18"/>
-              </w:rPr>
-              <w:t xml:space="preserve">Verified live — lint-staged ran automatically on the Phase 4 commit</w:t>
+                <w:sz w:val="18"/>
+                <w:szCs w:val="18"/>
+              </w:rPr>
+              <w:t>Verified live — lint-staged ran automatically on the Phase 4 commit</w:t>
             </w:r>
           </w:p>
         </w:tc>
       </w:tr>
       <w:tr>
+        <w:tblPrEx>
+          <w:tblCellMar>
+            <w:top w:w="0" w:type="dxa"/>
+            <w:bottom w:w="0" w:type="dxa"/>
+          </w:tblCellMar>
+        </w:tblPrEx>
         <w:tc>
           <w:tcPr>
-            <w:tcW w:type="dxa" w:w="2800"/>
+            <w:tcW w:w="2800" w:type="dxa"/>
             <w:tcMar>
-              <w:top w:type="dxa" w:w="80"/>
-              <w:left w:type="dxa" w:w="100"/>
-              <w:bottom w:type="dxa" w:w="80"/>
-              <w:right w:type="dxa" w:w="100"/>
+              <w:top w:w="80" w:type="dxa"/>
+              <w:left w:w="100" w:type="dxa"/>
+              <w:bottom w:w="80" w:type="dxa"/>
+              <w:right w:w="100" w:type="dxa"/>
             </w:tcMar>
           </w:tcPr>
           <w:p>
             <w:r>
               <w:rPr>
-                <w:b w:val="false"/>
-                <w:bCs w:val="false"/>
-                <w:sz w:val="18"/>
-                <w:szCs w:val="18"/>
-              </w:rPr>
-              <w:t xml:space="preserve">Initial commit</w:t>
+                <w:sz w:val="18"/>
+                <w:szCs w:val="18"/>
+              </w:rPr>
+              <w:t>Initial commit</w:t>
             </w:r>
           </w:p>
         </w:tc>
         <w:tc>
           <w:tcPr>
-            <w:tcW w:type="dxa" w:w="7666"/>
+            <w:tcW w:w="7666" w:type="dxa"/>
             <w:tcMar>
-              <w:top w:type="dxa" w:w="80"/>
-              <w:left w:type="dxa" w:w="100"/>
-              <w:bottom w:type="dxa" w:w="80"/>
-              <w:right w:type="dxa" w:w="100"/>
+              <w:top w:w="80" w:type="dxa"/>
+              <w:left w:w="100" w:type="dxa"/>
+              <w:bottom w:w="80" w:type="dxa"/>
+              <w:right w:w="100" w:type="dxa"/>
             </w:tcMar>
           </w:tcPr>
           <w:p>
             <w:r>
               <w:rPr>
-                <w:b w:val="false"/>
-                <w:bCs w:val="false"/>
-                <w:sz w:val="18"/>
-                <w:szCs w:val="18"/>
-              </w:rPr>
-              <w:t xml:space="preserve">chore: Phase 4 environment and CI/CD setup, on branch main</w:t>
+                <w:sz w:val="18"/>
+                <w:szCs w:val="18"/>
+              </w:rPr>
+              <w:t>chore: Phase 4 environment and CI/CD setup, on branch main</w:t>
             </w:r>
           </w:p>
         </w:tc>
@@ -1434,12 +2184,18 @@
       <w:pPr>
         <w:pStyle w:val="Heading1"/>
         <w:pBdr>
-          <w:bottom w:val="single" w:color="8EA9C1" w:sz="6" w:space="4"/>
+          <w:bottom w:val="single" w:sz="6" w:space="4" w:color="8EA9C1"/>
         </w:pBdr>
-        <w:spacing w:after="140" w:before="300"/>
-      </w:pPr>
-      <w:r>
-        <w:t xml:space="preserve">10. Outstanding Manual Actions</w:t>
+        <w:spacing w:before="300" w:after="140"/>
+        <w:rPr>
+          <w:color w:val="auto"/>
+        </w:rPr>
+      </w:pPr>
+      <w:r>
+        <w:rPr>
+          <w:color w:val="auto"/>
+        </w:rPr>
+        <w:t>10. Outstanding Manual Actions</w:t>
       </w:r>
     </w:p>
     <w:p>
@@ -1447,7 +2203,7 @@
         <w:spacing w:after="110"/>
       </w:pPr>
       <w:r>
-        <w:t xml:space="preserve">These three steps need your own account credentials and cannot be performed from this environment. Exact steps are in the repository README, “One-time manual setup.”</w:t>
+        <w:t>These three steps need your own account credentials and cannot be performed from this environment. Exact steps are in the repository README, “One-time manual setup.”</w:t>
       </w:r>
     </w:p>
     <w:p>
@@ -1463,12 +2219,11 @@
         <w:rPr>
           <w:b/>
           <w:bCs/>
-          <w:color w:val="A15C00"/>
         </w:rPr>
         <w:t xml:space="preserve">○ Pending (your action) — </w:t>
       </w:r>
       <w:r>
-        <w:t xml:space="preserve">Create the GitHub repository and push (git remote add origin …, git push -u origin main).</w:t>
+        <w:t>Create the GitHub repository and push (git remote add origin …, git push -u origin main).</w:t>
       </w:r>
     </w:p>
     <w:p>
@@ -1484,12 +2239,19 @@
         <w:rPr>
           <w:b/>
           <w:bCs/>
-          <w:color w:val="A15C00"/>
         </w:rPr>
         <w:t xml:space="preserve">○ Pending (your action) — </w:t>
       </w:r>
       <w:r>
-        <w:t xml:space="preserve">Connect the repository to Vercel and add environment variables.</w:t>
+        <w:t xml:space="preserve">Connect the repository to </w:t>
+      </w:r>
+      <w:proofErr w:type="spellStart"/>
+      <w:r>
+        <w:t>Vercel</w:t>
+      </w:r>
+      <w:proofErr w:type="spellEnd"/>
+      <w:r>
+        <w:t xml:space="preserve"> and add environment variables.</w:t>
       </w:r>
     </w:p>
     <w:p>
@@ -1505,12 +2267,43 @@
         <w:rPr>
           <w:b/>
           <w:bCs/>
-          <w:color w:val="A15C00"/>
         </w:rPr>
         <w:t xml:space="preserve">○ Pending (your action) — </w:t>
       </w:r>
       <w:r>
-        <w:t xml:space="preserve">Create the Supabase project and populate .env.local / Vercel with its keys.</w:t>
+        <w:t xml:space="preserve">Create the </w:t>
+      </w:r>
+      <w:proofErr w:type="spellStart"/>
+      <w:r>
+        <w:t>Supabase</w:t>
+      </w:r>
+      <w:proofErr w:type="spellEnd"/>
+      <w:r>
+        <w:t xml:space="preserve"> project and </w:t>
+      </w:r>
+      <w:proofErr w:type="gramStart"/>
+      <w:r>
+        <w:t>populate .</w:t>
+      </w:r>
+      <w:proofErr w:type="spellStart"/>
+      <w:r>
+        <w:t>env</w:t>
+      </w:r>
+      <w:proofErr w:type="gramEnd"/>
+      <w:r>
+        <w:t>.local</w:t>
+      </w:r>
+      <w:proofErr w:type="spellEnd"/>
+      <w:r>
+        <w:t xml:space="preserve"> / </w:t>
+      </w:r>
+      <w:proofErr w:type="spellStart"/>
+      <w:r>
+        <w:t>Vercel</w:t>
+      </w:r>
+      <w:proofErr w:type="spellEnd"/>
+      <w:r>
+        <w:t xml:space="preserve"> with its keys.</w:t>
       </w:r>
     </w:p>
     <w:p>
@@ -1526,17 +2319,16 @@
         <w:rPr>
           <w:b/>
           <w:bCs/>
-          <w:color w:val="A15C00"/>
         </w:rPr>
         <w:t xml:space="preserve">○ Pending (your action) — </w:t>
       </w:r>
       <w:r>
-        <w:t xml:space="preserve">Delete the duplicate scaffold left at Project\app (inside the OneDrive docs folder) — the working codebase is now only at C:\Users\vcollins\dev\cpf-group-dashboard.</w:t>
-      </w:r>
-    </w:p>
-    <w:p>
-      <w:pPr>
-        <w:spacing w:after="0" w:before="200"/>
+        <w:t>Delete the duplicate scaffold left at Project\app (inside the OneDrive docs folder) — the working codebase is now only at C:\Users\vcollins\dev\cpf-group-dashboard.</w:t>
+      </w:r>
+    </w:p>
+    <w:p>
+      <w:pPr>
+        <w:spacing w:before="200"/>
       </w:pPr>
     </w:p>
     <w:p>
@@ -1547,20 +2339,19 @@
         <w:rPr>
           <w:b/>
           <w:bCs/>
-          <w:color w:val="1F3864"/>
         </w:rPr>
         <w:t xml:space="preserve">Deliverable: </w:t>
       </w:r>
       <w:r>
-        <w:t xml:space="preserve">a working repository with a green CI pipeline proven on a real commit, and an environment fully ready for Week 8 development — matching the Execution Plan's Phase 4 deliverable statement exactly, with the three external-account steps above flagged rather than silently assumed done.</w:t>
+        <w:t>a working repository with a green CI pipeline proven on a real commit, and an environment fully ready for Week 8 development — matching the Execution Plan's Phase 4 deliverable statement exactly, with the three external-account steps above flagged rather than silently assumed done.</w:t>
       </w:r>
     </w:p>
     <w:sectPr>
-      <w:headerReference w:type="default" r:id="rId6"/>
-      <w:footerReference w:type="default" r:id="rId7"/>
-      <w:pgSz w:w="11906" w:h="16838" w:orient="portrait"/>
+      <w:headerReference w:type="default" r:id="rId7"/>
+      <w:footerReference w:type="default" r:id="rId8"/>
+      <w:pgSz w:w="11906" w:h="16838"/>
       <w:pgMar w:top="720" w:right="720" w:bottom="720" w:left="720" w:header="708" w:footer="708" w:gutter="0"/>
-      <w:pgNumType/>
+      <w:cols w:space="720"/>
       <w:docGrid w:linePitch="360"/>
     </w:sectPr>
   </w:body>
@@ -1568,18 +2359,9 @@
 </file>
 
 <file path=word/endnotes.xml><?xml version="1.0" encoding="utf-8"?>
-<w:endnotes xmlns:wpc="http://schemas.microsoft.com/office/word/2010/wordprocessingCanvas" xmlns:mc="http://schemas.openxmlformats.org/markup-compatibility/2006" xmlns:o="urn:schemas-microsoft-com:office:office" xmlns:r="http://schemas.openxmlformats.org/officeDocument/2006/relationships" xmlns:m="http://schemas.openxmlformats.org/officeDocument/2006/math" xmlns:v="urn:schemas-microsoft-com:vml" xmlns:wp14="http://schemas.microsoft.com/office/word/2010/wordprocessingDrawing" xmlns:wp="http://schemas.openxmlformats.org/drawingml/2006/wordprocessingDrawing" xmlns:w10="urn:schemas-microsoft-com:office:word" xmlns:w="http://schemas.openxmlformats.org/wordprocessingml/2006/main" xmlns:w14="http://schemas.microsoft.com/office/word/2010/wordml" xmlns:w15="http://schemas.microsoft.com/office/word/2012/wordml" xmlns:wpg="http://schemas.microsoft.com/office/word/2010/wordprocessingGroup" xmlns:wpi="http://schemas.microsoft.com/office/word/2010/wordprocessingInk" xmlns:wne="http://schemas.microsoft.com/office/word/2006/wordml" xmlns:wps="http://schemas.microsoft.com/office/word/2010/wordprocessingShape" mc:Ignorable="w14 w15 wp14">
+<w:endnotes xmlns:wpc="http://schemas.microsoft.com/office/word/2010/wordprocessingCanvas" xmlns:cx="http://schemas.microsoft.com/office/drawing/2014/chartex" xmlns:cx1="http://schemas.microsoft.com/office/drawing/2015/9/8/chartex" xmlns:cx2="http://schemas.microsoft.com/office/drawing/2015/10/21/chartex" xmlns:cx3="http://schemas.microsoft.com/office/drawing/2016/5/9/chartex" xmlns:cx4="http://schemas.microsoft.com/office/drawing/2016/5/10/chartex" xmlns:cx5="http://schemas.microsoft.com/office/drawing/2016/5/11/chartex" xmlns:cx6="http://schemas.microsoft.com/office/drawing/2016/5/12/chartex" xmlns:cx7="http://schemas.microsoft.com/office/drawing/2016/5/13/chartex" xmlns:cx8="http://schemas.microsoft.com/office/drawing/2016/5/14/chartex" xmlns:mc="http://schemas.openxmlformats.org/markup-compatibility/2006" xmlns:aink="http://schemas.microsoft.com/office/drawing/2016/ink" xmlns:am3d="http://schemas.microsoft.com/office/drawing/2017/model3d" xmlns:o="urn:schemas-microsoft-com:office:office" xmlns:oel="http://schemas.microsoft.com/office/2019/extlst" xmlns:r="http://schemas.openxmlformats.org/officeDocument/2006/relationships" xmlns:m="http://schemas.openxmlformats.org/officeDocument/2006/math" xmlns:v="urn:schemas-microsoft-com:vml" xmlns:wp14="http://schemas.microsoft.com/office/word/2010/wordprocessingDrawing" xmlns:wp="http://schemas.openxmlformats.org/drawingml/2006/wordprocessingDrawing" xmlns:w10="urn:schemas-microsoft-com:office:word" xmlns:w="http://schemas.openxmlformats.org/wordprocessingml/2006/main" xmlns:w14="http://schemas.microsoft.com/office/word/2010/wordml" xmlns:w15="http://schemas.microsoft.com/office/word/2012/wordml" xmlns:w16cex="http://schemas.microsoft.com/office/word/2018/wordml/cex" xmlns:w16cid="http://schemas.microsoft.com/office/word/2016/wordml/cid" xmlns:w16="http://schemas.microsoft.com/office/word/2018/wordml" xmlns:w16du="http://schemas.microsoft.com/office/word/2023/wordml/word16du" xmlns:w16sdtdh="http://schemas.microsoft.com/office/word/2020/wordml/sdtdatahash" xmlns:w16sdtfl="http://schemas.microsoft.com/office/word/2024/wordml/sdtformatlock" xmlns:w16se="http://schemas.microsoft.com/office/word/2015/wordml/symex" xmlns:wpg="http://schemas.microsoft.com/office/word/2010/wordprocessingGroup" xmlns:wpi="http://schemas.microsoft.com/office/word/2010/wordprocessingInk" xmlns:wne="http://schemas.microsoft.com/office/word/2006/wordml" xmlns:wps="http://schemas.microsoft.com/office/word/2010/wordprocessingShape" mc:Ignorable="w14 w15 w16se w16cid w16 w16cex w16sdtdh w16sdtfl w16du wp14">
   <w:endnote w:type="separator" w:id="-1">
     <w:p>
-      <w:pPr>
-        <w:spacing w:after="0" w:line="240" w:lineRule="auto"/>
-      </w:pPr>
-      <w:r>
-        <w:rPr>
-          <w:rStyle w:val="EndnoteReference"/>
-        </w:rPr>
-        <w:endnoteRef/>
-      </w:r>
       <w:r>
         <w:separator/>
       </w:r>
@@ -1587,15 +2369,6 @@
   </w:endnote>
   <w:endnote w:type="continuationSeparator" w:id="0">
     <w:p>
-      <w:pPr>
-        <w:spacing w:after="0" w:line="240" w:lineRule="auto"/>
-      </w:pPr>
-      <w:r>
-        <w:rPr>
-          <w:rStyle w:val="EndnoteReference"/>
-        </w:rPr>
-        <w:endnoteRef/>
-      </w:r>
       <w:r>
         <w:continuationSeparator/>
       </w:r>
@@ -1605,7 +2378,7 @@
 </file>
 
 <file path=word/footer1.xml><?xml version="1.0" encoding="utf-8"?>
-<w:ftr xmlns:wpc="http://schemas.microsoft.com/office/word/2010/wordprocessingCanvas" xmlns:mc="http://schemas.openxmlformats.org/markup-compatibility/2006" xmlns:o="urn:schemas-microsoft-com:office:office" xmlns:r="http://schemas.openxmlformats.org/officeDocument/2006/relationships" xmlns:m="http://schemas.openxmlformats.org/officeDocument/2006/math" xmlns:v="urn:schemas-microsoft-com:vml" xmlns:wp14="http://schemas.microsoft.com/office/word/2010/wordprocessingDrawing" xmlns:wp="http://schemas.openxmlformats.org/drawingml/2006/wordprocessingDrawing" xmlns:w10="urn:schemas-microsoft-com:office:word" xmlns:w="http://schemas.openxmlformats.org/wordprocessingml/2006/main" xmlns:w14="http://schemas.microsoft.com/office/word/2010/wordml" xmlns:w15="http://schemas.microsoft.com/office/word/2012/wordml" xmlns:wpg="http://schemas.microsoft.com/office/word/2010/wordprocessingGroup" xmlns:wpi="http://schemas.microsoft.com/office/word/2010/wordprocessingInk" xmlns:wne="http://schemas.microsoft.com/office/word/2006/wordml" xmlns:wps="http://schemas.microsoft.com/office/word/2010/wordprocessingShape">
+<w:ftr xmlns:wpc="http://schemas.microsoft.com/office/word/2010/wordprocessingCanvas" xmlns:cx="http://schemas.microsoft.com/office/drawing/2014/chartex" xmlns:cx1="http://schemas.microsoft.com/office/drawing/2015/9/8/chartex" xmlns:cx2="http://schemas.microsoft.com/office/drawing/2015/10/21/chartex" xmlns:cx3="http://schemas.microsoft.com/office/drawing/2016/5/9/chartex" xmlns:cx4="http://schemas.microsoft.com/office/drawing/2016/5/10/chartex" xmlns:cx5="http://schemas.microsoft.com/office/drawing/2016/5/11/chartex" xmlns:cx6="http://schemas.microsoft.com/office/drawing/2016/5/12/chartex" xmlns:cx7="http://schemas.microsoft.com/office/drawing/2016/5/13/chartex" xmlns:cx8="http://schemas.microsoft.com/office/drawing/2016/5/14/chartex" xmlns:mc="http://schemas.openxmlformats.org/markup-compatibility/2006" xmlns:aink="http://schemas.microsoft.com/office/drawing/2016/ink" xmlns:am3d="http://schemas.microsoft.com/office/drawing/2017/model3d" xmlns:o="urn:schemas-microsoft-com:office:office" xmlns:oel="http://schemas.microsoft.com/office/2019/extlst" xmlns:r="http://schemas.openxmlformats.org/officeDocument/2006/relationships" xmlns:m="http://schemas.openxmlformats.org/officeDocument/2006/math" xmlns:v="urn:schemas-microsoft-com:vml" xmlns:wp14="http://schemas.microsoft.com/office/word/2010/wordprocessingDrawing" xmlns:wp="http://schemas.openxmlformats.org/drawingml/2006/wordprocessingDrawing" xmlns:w10="urn:schemas-microsoft-com:office:word" xmlns:w="http://schemas.openxmlformats.org/wordprocessingml/2006/main" xmlns:w14="http://schemas.microsoft.com/office/word/2010/wordml" xmlns:w15="http://schemas.microsoft.com/office/word/2012/wordml" xmlns:w16cex="http://schemas.microsoft.com/office/word/2018/wordml/cex" xmlns:w16cid="http://schemas.microsoft.com/office/word/2016/wordml/cid" xmlns:w16="http://schemas.microsoft.com/office/word/2018/wordml" xmlns:w16du="http://schemas.microsoft.com/office/word/2023/wordml/word16du" xmlns:w16sdtdh="http://schemas.microsoft.com/office/word/2020/wordml/sdtdatahash" xmlns:w16sdtfl="http://schemas.microsoft.com/office/word/2024/wordml/sdtformatlock" xmlns:w16se="http://schemas.microsoft.com/office/word/2015/wordml/symex" xmlns:wpg="http://schemas.microsoft.com/office/word/2010/wordprocessingGroup" xmlns:wpi="http://schemas.microsoft.com/office/word/2010/wordprocessingInk" xmlns:wne="http://schemas.microsoft.com/office/word/2006/wordml" xmlns:wps="http://schemas.microsoft.com/office/word/2010/wordprocessingShape" mc:Ignorable="w14 w15 w16se w16cid w16 w16cex w16sdtdh w16sdtfl w16du wp14">
   <w:p>
     <w:pPr>
       <w:jc w:val="center"/>
@@ -1625,8 +2398,38 @@
         <w:szCs w:val="16"/>
       </w:rPr>
       <w:fldChar w:fldCharType="begin"/>
-      <w:instrText xml:space="preserve">PAGE</w:instrText>
+    </w:r>
+    <w:r>
+      <w:rPr>
+        <w:color w:val="808080"/>
+        <w:sz w:val="16"/>
+        <w:szCs w:val="16"/>
+      </w:rPr>
+      <w:instrText>PAGE</w:instrText>
+    </w:r>
+    <w:r>
+      <w:rPr>
+        <w:color w:val="808080"/>
+        <w:sz w:val="16"/>
+        <w:szCs w:val="16"/>
+      </w:rPr>
       <w:fldChar w:fldCharType="separate"/>
+    </w:r>
+    <w:r>
+      <w:rPr>
+        <w:noProof/>
+        <w:color w:val="808080"/>
+        <w:sz w:val="16"/>
+        <w:szCs w:val="16"/>
+      </w:rPr>
+      <w:t>1</w:t>
+    </w:r>
+    <w:r>
+      <w:rPr>
+        <w:color w:val="808080"/>
+        <w:sz w:val="16"/>
+        <w:szCs w:val="16"/>
+      </w:rPr>
       <w:fldChar w:fldCharType="end"/>
     </w:r>
     <w:r>
@@ -1644,8 +2447,38 @@
         <w:szCs w:val="16"/>
       </w:rPr>
       <w:fldChar w:fldCharType="begin"/>
-      <w:instrText xml:space="preserve">NUMPAGES</w:instrText>
+    </w:r>
+    <w:r>
+      <w:rPr>
+        <w:color w:val="808080"/>
+        <w:sz w:val="16"/>
+        <w:szCs w:val="16"/>
+      </w:rPr>
+      <w:instrText>NUMPAGES</w:instrText>
+    </w:r>
+    <w:r>
+      <w:rPr>
+        <w:color w:val="808080"/>
+        <w:sz w:val="16"/>
+        <w:szCs w:val="16"/>
+      </w:rPr>
       <w:fldChar w:fldCharType="separate"/>
+    </w:r>
+    <w:r>
+      <w:rPr>
+        <w:noProof/>
+        <w:color w:val="808080"/>
+        <w:sz w:val="16"/>
+        <w:szCs w:val="16"/>
+      </w:rPr>
+      <w:t>2</w:t>
+    </w:r>
+    <w:r>
+      <w:rPr>
+        <w:color w:val="808080"/>
+        <w:sz w:val="16"/>
+        <w:szCs w:val="16"/>
+      </w:rPr>
       <w:fldChar w:fldCharType="end"/>
     </w:r>
   </w:p>
@@ -1653,18 +2486,9 @@
 </file>
 
 <file path=word/footnotes.xml><?xml version="1.0" encoding="utf-8"?>
-<w:footnotes xmlns:wpc="http://schemas.microsoft.com/office/word/2010/wordprocessingCanvas" xmlns:mc="http://schemas.openxmlformats.org/markup-compatibility/2006" xmlns:o="urn:schemas-microsoft-com:office:office" xmlns:r="http://schemas.openxmlformats.org/officeDocument/2006/relationships" xmlns:m="http://schemas.openxmlformats.org/officeDocument/2006/math" xmlns:v="urn:schemas-microsoft-com:vml" xmlns:wp14="http://schemas.microsoft.com/office/word/2010/wordprocessingDrawing" xmlns:wp="http://schemas.openxmlformats.org/drawingml/2006/wordprocessingDrawing" xmlns:w10="urn:schemas-microsoft-com:office:word" xmlns:w="http://schemas.openxmlformats.org/wordprocessingml/2006/main" xmlns:w14="http://schemas.microsoft.com/office/word/2010/wordml" xmlns:w15="http://schemas.microsoft.com/office/word/2012/wordml" xmlns:wpg="http://schemas.microsoft.com/office/word/2010/wordprocessingGroup" xmlns:wpi="http://schemas.microsoft.com/office/word/2010/wordprocessingInk" xmlns:wne="http://schemas.microsoft.com/office/word/2006/wordml" xmlns:wps="http://schemas.microsoft.com/office/word/2010/wordprocessingShape" mc:Ignorable="w14 w15 wp14">
+<w:footnotes xmlns:wpc="http://schemas.microsoft.com/office/word/2010/wordprocessingCanvas" xmlns:cx="http://schemas.microsoft.com/office/drawing/2014/chartex" xmlns:cx1="http://schemas.microsoft.com/office/drawing/2015/9/8/chartex" xmlns:cx2="http://schemas.microsoft.com/office/drawing/2015/10/21/chartex" xmlns:cx3="http://schemas.microsoft.com/office/drawing/2016/5/9/chartex" xmlns:cx4="http://schemas.microsoft.com/office/drawing/2016/5/10/chartex" xmlns:cx5="http://schemas.microsoft.com/office/drawing/2016/5/11/chartex" xmlns:cx6="http://schemas.microsoft.com/office/drawing/2016/5/12/chartex" xmlns:cx7="http://schemas.microsoft.com/office/drawing/2016/5/13/chartex" xmlns:cx8="http://schemas.microsoft.com/office/drawing/2016/5/14/chartex" xmlns:mc="http://schemas.openxmlformats.org/markup-compatibility/2006" xmlns:aink="http://schemas.microsoft.com/office/drawing/2016/ink" xmlns:am3d="http://schemas.microsoft.com/office/drawing/2017/model3d" xmlns:o="urn:schemas-microsoft-com:office:office" xmlns:oel="http://schemas.microsoft.com/office/2019/extlst" xmlns:r="http://schemas.openxmlformats.org/officeDocument/2006/relationships" xmlns:m="http://schemas.openxmlformats.org/officeDocument/2006/math" xmlns:v="urn:schemas-microsoft-com:vml" xmlns:wp14="http://schemas.microsoft.com/office/word/2010/wordprocessingDrawing" xmlns:wp="http://schemas.openxmlformats.org/drawingml/2006/wordprocessingDrawing" xmlns:w10="urn:schemas-microsoft-com:office:word" xmlns:w="http://schemas.openxmlformats.org/wordprocessingml/2006/main" xmlns:w14="http://schemas.microsoft.com/office/word/2010/wordml" xmlns:w15="http://schemas.microsoft.com/office/word/2012/wordml" xmlns:w16cex="http://schemas.microsoft.com/office/word/2018/wordml/cex" xmlns:w16cid="http://schemas.microsoft.com/office/word/2016/wordml/cid" xmlns:w16="http://schemas.microsoft.com/office/word/2018/wordml" xmlns:w16du="http://schemas.microsoft.com/office/word/2023/wordml/word16du" xmlns:w16sdtdh="http://schemas.microsoft.com/office/word/2020/wordml/sdtdatahash" xmlns:w16sdtfl="http://schemas.microsoft.com/office/word/2024/wordml/sdtformatlock" xmlns:w16se="http://schemas.microsoft.com/office/word/2015/wordml/symex" xmlns:wpg="http://schemas.microsoft.com/office/word/2010/wordprocessingGroup" xmlns:wpi="http://schemas.microsoft.com/office/word/2010/wordprocessingInk" xmlns:wne="http://schemas.microsoft.com/office/word/2006/wordml" xmlns:wps="http://schemas.microsoft.com/office/word/2010/wordprocessingShape" mc:Ignorable="w14 w15 w16se w16cid w16 w16cex w16sdtdh w16sdtfl w16du wp14">
   <w:footnote w:type="separator" w:id="-1">
     <w:p>
-      <w:pPr>
-        <w:spacing w:after="0" w:line="240" w:lineRule="auto"/>
-      </w:pPr>
-      <w:r>
-        <w:rPr>
-          <w:rStyle w:val="FootnoteReference"/>
-        </w:rPr>
-        <w:footnoteRef/>
-      </w:r>
       <w:r>
         <w:separator/>
       </w:r>
@@ -1672,15 +2496,6 @@
   </w:footnote>
   <w:footnote w:type="continuationSeparator" w:id="0">
     <w:p>
-      <w:pPr>
-        <w:spacing w:after="0" w:line="240" w:lineRule="auto"/>
-      </w:pPr>
-      <w:r>
-        <w:rPr>
-          <w:rStyle w:val="FootnoteReference"/>
-        </w:rPr>
-        <w:footnoteRef/>
-      </w:r>
       <w:r>
         <w:continuationSeparator/>
       </w:r>
@@ -1690,7 +2505,7 @@
 </file>
 
 <file path=word/header1.xml><?xml version="1.0" encoding="utf-8"?>
-<w:hdr xmlns:wpc="http://schemas.microsoft.com/office/word/2010/wordprocessingCanvas" xmlns:mc="http://schemas.openxmlformats.org/markup-compatibility/2006" xmlns:o="urn:schemas-microsoft-com:office:office" xmlns:r="http://schemas.openxmlformats.org/officeDocument/2006/relationships" xmlns:m="http://schemas.openxmlformats.org/officeDocument/2006/math" xmlns:v="urn:schemas-microsoft-com:vml" xmlns:wp14="http://schemas.microsoft.com/office/word/2010/wordprocessingDrawing" xmlns:wp="http://schemas.openxmlformats.org/drawingml/2006/wordprocessingDrawing" xmlns:w10="urn:schemas-microsoft-com:office:word" xmlns:w="http://schemas.openxmlformats.org/wordprocessingml/2006/main" xmlns:w14="http://schemas.microsoft.com/office/word/2010/wordml" xmlns:w15="http://schemas.microsoft.com/office/word/2012/wordml" xmlns:wpg="http://schemas.microsoft.com/office/word/2010/wordprocessingGroup" xmlns:wpi="http://schemas.microsoft.com/office/word/2010/wordprocessingInk" xmlns:wne="http://schemas.microsoft.com/office/word/2006/wordml" xmlns:wps="http://schemas.microsoft.com/office/word/2010/wordprocessingShape" xmlns:cx="http://schemas.microsoft.com/office/drawing/2014/chartex" xmlns:cx1="http://schemas.microsoft.com/office/drawing/2015/9/8/chartex" xmlns:cx2="http://schemas.microsoft.com/office/drawing/2015/10/21/chartex" xmlns:cx3="http://schemas.microsoft.com/office/drawing/2016/5/9/chartex" xmlns:cx4="http://schemas.microsoft.com/office/drawing/2016/5/10/chartex" xmlns:cx5="http://schemas.microsoft.com/office/drawing/2016/5/11/chartex" xmlns:cx6="http://schemas.microsoft.com/office/drawing/2016/5/12/chartex" xmlns:cx7="http://schemas.microsoft.com/office/drawing/2016/5/13/chartex" xmlns:cx8="http://schemas.microsoft.com/office/drawing/2016/5/14/chartex" xmlns:w16cid="http://schemas.microsoft.com/office/word/2016/wordml/cid" xmlns:w16se="http://schemas.microsoft.com/office/word/2015/wordml/symex">
+<w:hdr xmlns:wpc="http://schemas.microsoft.com/office/word/2010/wordprocessingCanvas" xmlns:cx="http://schemas.microsoft.com/office/drawing/2014/chartex" xmlns:cx1="http://schemas.microsoft.com/office/drawing/2015/9/8/chartex" xmlns:cx2="http://schemas.microsoft.com/office/drawing/2015/10/21/chartex" xmlns:cx3="http://schemas.microsoft.com/office/drawing/2016/5/9/chartex" xmlns:cx4="http://schemas.microsoft.com/office/drawing/2016/5/10/chartex" xmlns:cx5="http://schemas.microsoft.com/office/drawing/2016/5/11/chartex" xmlns:cx6="http://schemas.microsoft.com/office/drawing/2016/5/12/chartex" xmlns:cx7="http://schemas.microsoft.com/office/drawing/2016/5/13/chartex" xmlns:cx8="http://schemas.microsoft.com/office/drawing/2016/5/14/chartex" xmlns:mc="http://schemas.openxmlformats.org/markup-compatibility/2006" xmlns:aink="http://schemas.microsoft.com/office/drawing/2016/ink" xmlns:am3d="http://schemas.microsoft.com/office/drawing/2017/model3d" xmlns:o="urn:schemas-microsoft-com:office:office" xmlns:oel="http://schemas.microsoft.com/office/2019/extlst" xmlns:r="http://schemas.openxmlformats.org/officeDocument/2006/relationships" xmlns:m="http://schemas.openxmlformats.org/officeDocument/2006/math" xmlns:v="urn:schemas-microsoft-com:vml" xmlns:wp14="http://schemas.microsoft.com/office/word/2010/wordprocessingDrawing" xmlns:wp="http://schemas.openxmlformats.org/drawingml/2006/wordprocessingDrawing" xmlns:w10="urn:schemas-microsoft-com:office:word" xmlns:w="http://schemas.openxmlformats.org/wordprocessingml/2006/main" xmlns:w14="http://schemas.microsoft.com/office/word/2010/wordml" xmlns:w15="http://schemas.microsoft.com/office/word/2012/wordml" xmlns:w16cex="http://schemas.microsoft.com/office/word/2018/wordml/cex" xmlns:w16cid="http://schemas.microsoft.com/office/word/2016/wordml/cid" xmlns:w16="http://schemas.microsoft.com/office/word/2018/wordml" xmlns:w16du="http://schemas.microsoft.com/office/word/2023/wordml/word16du" xmlns:w16sdtdh="http://schemas.microsoft.com/office/word/2020/wordml/sdtdatahash" xmlns:w16sdtfl="http://schemas.microsoft.com/office/word/2024/wordml/sdtformatlock" xmlns:w16se="http://schemas.microsoft.com/office/word/2015/wordml/symex" xmlns:wpg="http://schemas.microsoft.com/office/word/2010/wordprocessingGroup" xmlns:wpi="http://schemas.microsoft.com/office/word/2010/wordprocessingInk" xmlns:wne="http://schemas.microsoft.com/office/word/2006/wordml" xmlns:wps="http://schemas.microsoft.com/office/word/2010/wordprocessingShape" mc:Ignorable="w14 w15 w16se w16cid w16 w16cex w16sdtdh w16sdtfl w16du wp14">
   <w:p>
     <w:pPr>
       <w:jc w:val="right"/>
@@ -1703,17 +2518,73 @@
         <w:sz w:val="16"/>
         <w:szCs w:val="16"/>
       </w:rPr>
-      <w:t xml:space="preserve">Phase 4 — Environment and CI/CD | CPF Group Analytics Dashboard</w:t>
+      <w:t>Phase 4 — Environment and CI/CD | CPF Group Analytics Dashboard</w:t>
     </w:r>
   </w:p>
 </w:hdr>
 </file>
 
 <file path=word/numbering.xml><?xml version="1.0" encoding="utf-8"?>
-<w:numbering xmlns:wpc="http://schemas.microsoft.com/office/word/2010/wordprocessingCanvas" xmlns:mc="http://schemas.openxmlformats.org/markup-compatibility/2006" xmlns:o="urn:schemas-microsoft-com:office:office" xmlns:r="http://schemas.openxmlformats.org/officeDocument/2006/relationships" xmlns:m="http://schemas.openxmlformats.org/officeDocument/2006/math" xmlns:v="urn:schemas-microsoft-com:vml" xmlns:wp14="http://schemas.microsoft.com/office/word/2010/wordprocessingDrawing" xmlns:wp="http://schemas.openxmlformats.org/drawingml/2006/wordprocessingDrawing" xmlns:w10="urn:schemas-microsoft-com:office:word" xmlns:w="http://schemas.openxmlformats.org/wordprocessingml/2006/main" xmlns:w14="http://schemas.microsoft.com/office/word/2010/wordml" xmlns:w15="http://schemas.microsoft.com/office/word/2012/wordml" xmlns:wpg="http://schemas.microsoft.com/office/word/2010/wordprocessingGroup" xmlns:wpi="http://schemas.microsoft.com/office/word/2010/wordprocessingInk" xmlns:wne="http://schemas.microsoft.com/office/word/2006/wordml" xmlns:wps="http://schemas.microsoft.com/office/word/2010/wordprocessingShape" mc:Ignorable="w14 w15 wp14">
+<w:numbering xmlns:wpc="http://schemas.microsoft.com/office/word/2010/wordprocessingCanvas" xmlns:cx="http://schemas.microsoft.com/office/drawing/2014/chartex" xmlns:cx1="http://schemas.microsoft.com/office/drawing/2015/9/8/chartex" xmlns:cx2="http://schemas.microsoft.com/office/drawing/2015/10/21/chartex" xmlns:cx3="http://schemas.microsoft.com/office/drawing/2016/5/9/chartex" xmlns:cx4="http://schemas.microsoft.com/office/drawing/2016/5/10/chartex" xmlns:cx5="http://schemas.microsoft.com/office/drawing/2016/5/11/chartex" xmlns:cx6="http://schemas.microsoft.com/office/drawing/2016/5/12/chartex" xmlns:cx7="http://schemas.microsoft.com/office/drawing/2016/5/13/chartex" xmlns:cx8="http://schemas.microsoft.com/office/drawing/2016/5/14/chartex" xmlns:mc="http://schemas.openxmlformats.org/markup-compatibility/2006" xmlns:aink="http://schemas.microsoft.com/office/drawing/2016/ink" xmlns:am3d="http://schemas.microsoft.com/office/drawing/2017/model3d" xmlns:o="urn:schemas-microsoft-com:office:office" xmlns:oel="http://schemas.microsoft.com/office/2019/extlst" xmlns:r="http://schemas.openxmlformats.org/officeDocument/2006/relationships" xmlns:m="http://schemas.openxmlformats.org/officeDocument/2006/math" xmlns:v="urn:schemas-microsoft-com:vml" xmlns:wp14="http://schemas.microsoft.com/office/word/2010/wordprocessingDrawing" xmlns:wp="http://schemas.openxmlformats.org/drawingml/2006/wordprocessingDrawing" xmlns:w10="urn:schemas-microsoft-com:office:word" xmlns:w="http://schemas.openxmlformats.org/wordprocessingml/2006/main" xmlns:w14="http://schemas.microsoft.com/office/word/2010/wordml" xmlns:w15="http://schemas.microsoft.com/office/word/2012/wordml" xmlns:w16cex="http://schemas.microsoft.com/office/word/2018/wordml/cex" xmlns:w16cid="http://schemas.microsoft.com/office/word/2016/wordml/cid" xmlns:w16="http://schemas.microsoft.com/office/word/2018/wordml" xmlns:w16du="http://schemas.microsoft.com/office/word/2023/wordml/word16du" xmlns:w16sdtdh="http://schemas.microsoft.com/office/word/2020/wordml/sdtdatahash" xmlns:w16sdtfl="http://schemas.microsoft.com/office/word/2024/wordml/sdtformatlock" xmlns:w16se="http://schemas.microsoft.com/office/word/2015/wordml/symex" xmlns:wpg="http://schemas.microsoft.com/office/word/2010/wordprocessingGroup" xmlns:wpi="http://schemas.microsoft.com/office/word/2010/wordprocessingInk" xmlns:wne="http://schemas.microsoft.com/office/word/2006/wordml" xmlns:wps="http://schemas.microsoft.com/office/word/2010/wordprocessingShape" mc:Ignorable="w14 w15 w16se w16cid w16 w16cex w16sdtdh w16sdtfl w16du wp14">
+  <w:abstractNum w:abstractNumId="0" w15:restartNumberingAfterBreak="0">
+    <w:nsid w:val="1A8811F4"/>
+    <w:multiLevelType w:val="hybridMultilevel"/>
+    <w:tmpl w:val="C52A75F6"/>
+    <w:lvl w:ilvl="0" w:tplc="E342E776">
+      <w:start w:val="1"/>
+      <w:numFmt w:val="bullet"/>
+      <w:lvlText w:val="•"/>
+      <w:lvlJc w:val="left"/>
+      <w:pPr>
+        <w:ind w:left="431" w:hanging="288"/>
+      </w:pPr>
+    </w:lvl>
+    <w:lvl w:ilvl="1" w:tplc="4D263E42">
+      <w:numFmt w:val="decimal"/>
+      <w:lvlText w:val=""/>
+      <w:lvlJc w:val="left"/>
+    </w:lvl>
+    <w:lvl w:ilvl="2" w:tplc="F78A1090">
+      <w:numFmt w:val="decimal"/>
+      <w:lvlText w:val=""/>
+      <w:lvlJc w:val="left"/>
+    </w:lvl>
+    <w:lvl w:ilvl="3" w:tplc="E10E6B00">
+      <w:numFmt w:val="decimal"/>
+      <w:lvlText w:val=""/>
+      <w:lvlJc w:val="left"/>
+    </w:lvl>
+    <w:lvl w:ilvl="4" w:tplc="64242B1C">
+      <w:numFmt w:val="decimal"/>
+      <w:lvlText w:val=""/>
+      <w:lvlJc w:val="left"/>
+    </w:lvl>
+    <w:lvl w:ilvl="5" w:tplc="4A0407F6">
+      <w:numFmt w:val="decimal"/>
+      <w:lvlText w:val=""/>
+      <w:lvlJc w:val="left"/>
+    </w:lvl>
+    <w:lvl w:ilvl="6" w:tplc="D750D0A4">
+      <w:numFmt w:val="decimal"/>
+      <w:lvlText w:val=""/>
+      <w:lvlJc w:val="left"/>
+    </w:lvl>
+    <w:lvl w:ilvl="7" w:tplc="C026FB2E">
+      <w:numFmt w:val="decimal"/>
+      <w:lvlText w:val=""/>
+      <w:lvlJc w:val="left"/>
+    </w:lvl>
+    <w:lvl w:ilvl="8" w:tplc="9D0A3064">
+      <w:numFmt w:val="decimal"/>
+      <w:lvlText w:val=""/>
+      <w:lvlJc w:val="left"/>
+    </w:lvl>
+  </w:abstractNum>
   <w:abstractNum w:abstractNumId="1" w15:restartNumberingAfterBreak="0">
+    <w:nsid w:val="5A083E82"/>
     <w:multiLevelType w:val="hybridMultilevel"/>
-    <w:lvl w:ilvl="0" w:tentative="1">
+    <w:tmpl w:val="959AB9CC"/>
+    <w:lvl w:ilvl="0" w:tplc="416ACC4C" w:tentative="1">
       <w:start w:val="1"/>
       <w:numFmt w:val="bullet"/>
       <w:lvlText w:val="●"/>
@@ -1722,7 +2593,7 @@
         <w:ind w:left="720" w:hanging="360"/>
       </w:pPr>
     </w:lvl>
-    <w:lvl w:ilvl="1" w:tentative="1">
+    <w:lvl w:ilvl="1" w:tplc="055E45F2" w:tentative="1">
       <w:start w:val="1"/>
       <w:numFmt w:val="bullet"/>
       <w:lvlText w:val="○"/>
@@ -1731,7 +2602,7 @@
         <w:ind w:left="1440" w:hanging="360"/>
       </w:pPr>
     </w:lvl>
-    <w:lvl w:ilvl="2" w:tentative="1">
+    <w:lvl w:ilvl="2" w:tplc="DD689EF4" w:tentative="1">
       <w:start w:val="1"/>
       <w:numFmt w:val="bullet"/>
       <w:lvlText w:val="■"/>
@@ -1740,7 +2611,7 @@
         <w:ind w:left="2160" w:hanging="360"/>
       </w:pPr>
     </w:lvl>
-    <w:lvl w:ilvl="3" w:tentative="1">
+    <w:lvl w:ilvl="3" w:tplc="5CB2A68E" w:tentative="1">
       <w:start w:val="1"/>
       <w:numFmt w:val="bullet"/>
       <w:lvlText w:val="●"/>
@@ -1749,7 +2620,7 @@
         <w:ind w:left="2880" w:hanging="360"/>
       </w:pPr>
     </w:lvl>
-    <w:lvl w:ilvl="4" w:tentative="1">
+    <w:lvl w:ilvl="4" w:tplc="3D205EA2" w:tentative="1">
       <w:start w:val="1"/>
       <w:numFmt w:val="bullet"/>
       <w:lvlText w:val="○"/>
@@ -1758,7 +2629,7 @@
         <w:ind w:left="3600" w:hanging="360"/>
       </w:pPr>
     </w:lvl>
-    <w:lvl w:ilvl="5" w:tentative="1">
+    <w:lvl w:ilvl="5" w:tplc="DBF6FDF2" w:tentative="1">
       <w:start w:val="1"/>
       <w:numFmt w:val="bullet"/>
       <w:lvlText w:val="■"/>
@@ -1767,7 +2638,7 @@
         <w:ind w:left="4320" w:hanging="360"/>
       </w:pPr>
     </w:lvl>
-    <w:lvl w:ilvl="6" w:tentative="1">
+    <w:lvl w:ilvl="6" w:tplc="D390E696" w:tentative="1">
       <w:start w:val="1"/>
       <w:numFmt w:val="bullet"/>
       <w:lvlText w:val="●"/>
@@ -1776,7 +2647,7 @@
         <w:ind w:left="5040" w:hanging="360"/>
       </w:pPr>
     </w:lvl>
-    <w:lvl w:ilvl="7" w:tentative="1">
+    <w:lvl w:ilvl="7" w:tplc="A1748180" w:tentative="1">
       <w:start w:val="1"/>
       <w:numFmt w:val="bullet"/>
       <w:lvlText w:val="●"/>
@@ -1785,7 +2656,7 @@
         <w:ind w:left="5760" w:hanging="360"/>
       </w:pPr>
     </w:lvl>
-    <w:lvl w:ilvl="8" w:tentative="1">
+    <w:lvl w:ilvl="8" w:tplc="6C70639C" w:tentative="1">
       <w:start w:val="1"/>
       <w:numFmt w:val="bullet"/>
       <w:lvlText w:val="●"/>
@@ -1795,26 +2666,14 @@
       </w:pPr>
     </w:lvl>
   </w:abstractNum>
-  <w:abstractNum w:abstractNumId="2" w15:restartNumberingAfterBreak="0">
-    <w:multiLevelType w:val="hybridMultilevel"/>
-    <w:lvl w:ilvl="0" w:tentative="1">
-      <w:start w:val="1"/>
-      <w:numFmt w:val="bullet"/>
-      <w:lvlText w:val="•"/>
-      <w:lvlJc w:val="left"/>
-      <w:pPr>
-        <w:ind w:left="431" w:hanging="288"/>
-      </w:pPr>
-    </w:lvl>
-  </w:abstractNum>
-  <w:num w:numId="1">
+  <w:num w:numId="1" w16cid:durableId="2122333207">
     <w:abstractNumId w:val="1"/>
     <w:lvlOverride w:ilvl="0">
       <w:startOverride w:val="1"/>
     </w:lvlOverride>
   </w:num>
-  <w:num w:numId="2">
-    <w:abstractNumId w:val="2"/>
+  <w:num w:numId="2" w16cid:durableId="983192418">
+    <w:abstractNumId w:val="0"/>
     <w:lvlOverride w:ilvl="0">
       <w:startOverride w:val="1"/>
     </w:lvlOverride>
@@ -1823,30 +2682,407 @@
 </file>
 
 <file path=word/styles.xml><?xml version="1.0" encoding="utf-8"?>
-<w:styles xmlns:mc="http://schemas.openxmlformats.org/markup-compatibility/2006" xmlns:r="http://schemas.openxmlformats.org/officeDocument/2006/relationships" xmlns:w="http://schemas.openxmlformats.org/wordprocessingml/2006/main" xmlns:w14="http://schemas.microsoft.com/office/word/2010/wordml" xmlns:w15="http://schemas.microsoft.com/office/word/2012/wordml" mc:Ignorable="w14 w15">
+<w:styles xmlns:mc="http://schemas.openxmlformats.org/markup-compatibility/2006" xmlns:r="http://schemas.openxmlformats.org/officeDocument/2006/relationships" xmlns:w="http://schemas.openxmlformats.org/wordprocessingml/2006/main" xmlns:w14="http://schemas.microsoft.com/office/word/2010/wordml" xmlns:w15="http://schemas.microsoft.com/office/word/2012/wordml" xmlns:w16cex="http://schemas.microsoft.com/office/word/2018/wordml/cex" xmlns:w16cid="http://schemas.microsoft.com/office/word/2016/wordml/cid" xmlns:w16="http://schemas.microsoft.com/office/word/2018/wordml" xmlns:w16du="http://schemas.microsoft.com/office/word/2023/wordml/word16du" xmlns:w16sdtdh="http://schemas.microsoft.com/office/word/2020/wordml/sdtdatahash" xmlns:w16sdtfl="http://schemas.microsoft.com/office/word/2024/wordml/sdtformatlock" xmlns:w16se="http://schemas.microsoft.com/office/word/2015/wordml/symex" mc:Ignorable="w14 w15 w16se w16cid w16 w16cex w16sdtdh w16sdtfl w16du">
   <w:docDefaults>
-    <w:rPrDefault/>
+    <w:rPrDefault>
+      <w:rPr>
+        <w:rFonts w:ascii="Times New Roman" w:eastAsia="Times New Roman" w:hAnsi="Times New Roman" w:cs="Times New Roman"/>
+        <w:lang w:val="en-GB" w:eastAsia="en-GB" w:bidi="ar-SA"/>
+      </w:rPr>
+    </w:rPrDefault>
     <w:pPrDefault/>
   </w:docDefaults>
-  <w:style w:type="paragraph" w:styleId="Normal" w:default="1">
+  <w:latentStyles w:defLockedState="0" w:defUIPriority="99" w:defSemiHidden="0" w:defUnhideWhenUsed="0" w:defQFormat="0" w:count="376">
+    <w:lsdException w:name="Normal" w:uiPriority="0" w:qFormat="1"/>
+    <w:lsdException w:name="heading 1" w:uiPriority="9" w:qFormat="1"/>
+    <w:lsdException w:name="heading 2" w:semiHidden="1" w:uiPriority="9" w:unhideWhenUsed="1" w:qFormat="1"/>
+    <w:lsdException w:name="heading 3" w:semiHidden="1" w:uiPriority="9" w:unhideWhenUsed="1" w:qFormat="1"/>
+    <w:lsdException w:name="heading 4" w:semiHidden="1" w:uiPriority="9" w:unhideWhenUsed="1" w:qFormat="1"/>
+    <w:lsdException w:name="heading 5" w:semiHidden="1" w:uiPriority="9" w:unhideWhenUsed="1" w:qFormat="1"/>
+    <w:lsdException w:name="heading 6" w:semiHidden="1" w:uiPriority="9" w:unhideWhenUsed="1" w:qFormat="1"/>
+    <w:lsdException w:name="heading 7" w:semiHidden="1" w:uiPriority="9" w:unhideWhenUsed="1" w:qFormat="1"/>
+    <w:lsdException w:name="heading 8" w:semiHidden="1" w:uiPriority="9" w:unhideWhenUsed="1" w:qFormat="1"/>
+    <w:lsdException w:name="heading 9" w:semiHidden="1" w:uiPriority="9" w:unhideWhenUsed="1" w:qFormat="1"/>
+    <w:lsdException w:name="index 1" w:semiHidden="1" w:unhideWhenUsed="1"/>
+    <w:lsdException w:name="index 2" w:semiHidden="1" w:unhideWhenUsed="1"/>
+    <w:lsdException w:name="index 3" w:semiHidden="1" w:unhideWhenUsed="1"/>
+    <w:lsdException w:name="index 4" w:semiHidden="1" w:unhideWhenUsed="1"/>
+    <w:lsdException w:name="index 5" w:semiHidden="1" w:unhideWhenUsed="1"/>
+    <w:lsdException w:name="index 6" w:semiHidden="1" w:unhideWhenUsed="1"/>
+    <w:lsdException w:name="index 7" w:semiHidden="1" w:unhideWhenUsed="1"/>
+    <w:lsdException w:name="index 8" w:semiHidden="1" w:unhideWhenUsed="1"/>
+    <w:lsdException w:name="index 9" w:semiHidden="1" w:unhideWhenUsed="1"/>
+    <w:lsdException w:name="toc 1" w:semiHidden="1" w:uiPriority="39" w:unhideWhenUsed="1"/>
+    <w:lsdException w:name="toc 2" w:semiHidden="1" w:uiPriority="39" w:unhideWhenUsed="1"/>
+    <w:lsdException w:name="toc 3" w:semiHidden="1" w:uiPriority="39" w:unhideWhenUsed="1"/>
+    <w:lsdException w:name="toc 4" w:semiHidden="1" w:uiPriority="39" w:unhideWhenUsed="1"/>
+    <w:lsdException w:name="toc 5" w:semiHidden="1" w:uiPriority="39" w:unhideWhenUsed="1"/>
+    <w:lsdException w:name="toc 6" w:semiHidden="1" w:uiPriority="39" w:unhideWhenUsed="1"/>
+    <w:lsdException w:name="toc 7" w:semiHidden="1" w:uiPriority="39" w:unhideWhenUsed="1"/>
+    <w:lsdException w:name="toc 8" w:semiHidden="1" w:uiPriority="39" w:unhideWhenUsed="1"/>
+    <w:lsdException w:name="toc 9" w:semiHidden="1" w:uiPriority="39" w:unhideWhenUsed="1"/>
+    <w:lsdException w:name="Normal Indent" w:semiHidden="1" w:unhideWhenUsed="1"/>
+    <w:lsdException w:name="footnote text" w:semiHidden="1" w:unhideWhenUsed="1"/>
+    <w:lsdException w:name="annotation text" w:semiHidden="1" w:unhideWhenUsed="1"/>
+    <w:lsdException w:name="header" w:semiHidden="1" w:unhideWhenUsed="1"/>
+    <w:lsdException w:name="footer" w:semiHidden="1" w:unhideWhenUsed="1"/>
+    <w:lsdException w:name="index heading" w:semiHidden="1" w:unhideWhenUsed="1"/>
+    <w:lsdException w:name="caption" w:semiHidden="1" w:uiPriority="35" w:unhideWhenUsed="1" w:qFormat="1"/>
+    <w:lsdException w:name="table of figures" w:semiHidden="1" w:unhideWhenUsed="1"/>
+    <w:lsdException w:name="envelope address" w:semiHidden="1" w:unhideWhenUsed="1"/>
+    <w:lsdException w:name="envelope return" w:semiHidden="1" w:unhideWhenUsed="1"/>
+    <w:lsdException w:name="footnote reference" w:semiHidden="1" w:unhideWhenUsed="1"/>
+    <w:lsdException w:name="annotation reference" w:semiHidden="1" w:unhideWhenUsed="1"/>
+    <w:lsdException w:name="line number" w:semiHidden="1" w:unhideWhenUsed="1"/>
+    <w:lsdException w:name="page number" w:semiHidden="1" w:unhideWhenUsed="1"/>
+    <w:lsdException w:name="endnote reference" w:semiHidden="1" w:unhideWhenUsed="1"/>
+    <w:lsdException w:name="endnote text" w:semiHidden="1" w:unhideWhenUsed="1"/>
+    <w:lsdException w:name="table of authorities" w:semiHidden="1" w:unhideWhenUsed="1"/>
+    <w:lsdException w:name="macro" w:semiHidden="1" w:unhideWhenUsed="1"/>
+    <w:lsdException w:name="toa heading" w:semiHidden="1" w:unhideWhenUsed="1"/>
+    <w:lsdException w:name="List" w:semiHidden="1" w:unhideWhenUsed="1"/>
+    <w:lsdException w:name="List Bullet" w:semiHidden="1" w:unhideWhenUsed="1"/>
+    <w:lsdException w:name="List Number" w:semiHidden="1" w:unhideWhenUsed="1"/>
+    <w:lsdException w:name="List 2" w:semiHidden="1" w:unhideWhenUsed="1"/>
+    <w:lsdException w:name="List 3" w:semiHidden="1" w:unhideWhenUsed="1"/>
+    <w:lsdException w:name="List 4" w:semiHidden="1" w:unhideWhenUsed="1"/>
+    <w:lsdException w:name="List 5" w:semiHidden="1" w:unhideWhenUsed="1"/>
+    <w:lsdException w:name="List Bullet 2" w:semiHidden="1" w:unhideWhenUsed="1"/>
+    <w:lsdException w:name="List Bullet 3" w:semiHidden="1" w:unhideWhenUsed="1"/>
+    <w:lsdException w:name="List Bullet 4" w:semiHidden="1" w:unhideWhenUsed="1"/>
+    <w:lsdException w:name="List Bullet 5" w:semiHidden="1" w:unhideWhenUsed="1"/>
+    <w:lsdException w:name="List Number 2" w:semiHidden="1" w:unhideWhenUsed="1"/>
+    <w:lsdException w:name="List Number 3" w:semiHidden="1" w:unhideWhenUsed="1"/>
+    <w:lsdException w:name="List Number 4" w:semiHidden="1" w:unhideWhenUsed="1"/>
+    <w:lsdException w:name="List Number 5" w:semiHidden="1" w:unhideWhenUsed="1"/>
+    <w:lsdException w:name="Title" w:uiPriority="10" w:qFormat="1"/>
+    <w:lsdException w:name="Closing" w:semiHidden="1" w:unhideWhenUsed="1"/>
+    <w:lsdException w:name="Signature" w:semiHidden="1" w:unhideWhenUsed="1"/>
+    <w:lsdException w:name="Default Paragraph Font" w:semiHidden="1" w:uiPriority="1" w:unhideWhenUsed="1"/>
+    <w:lsdException w:name="Body Text" w:semiHidden="1" w:unhideWhenUsed="1"/>
+    <w:lsdException w:name="Body Text Indent" w:semiHidden="1" w:unhideWhenUsed="1"/>
+    <w:lsdException w:name="List Continue" w:semiHidden="1" w:unhideWhenUsed="1"/>
+    <w:lsdException w:name="List Continue 2" w:semiHidden="1" w:unhideWhenUsed="1"/>
+    <w:lsdException w:name="List Continue 3" w:semiHidden="1" w:unhideWhenUsed="1"/>
+    <w:lsdException w:name="List Continue 4" w:semiHidden="1" w:unhideWhenUsed="1"/>
+    <w:lsdException w:name="List Continue 5" w:semiHidden="1" w:unhideWhenUsed="1"/>
+    <w:lsdException w:name="Message Header" w:semiHidden="1" w:unhideWhenUsed="1"/>
+    <w:lsdException w:name="Subtitle" w:uiPriority="11" w:qFormat="1"/>
+    <w:lsdException w:name="Salutation" w:semiHidden="1" w:unhideWhenUsed="1"/>
+    <w:lsdException w:name="Date" w:semiHidden="1" w:unhideWhenUsed="1"/>
+    <w:lsdException w:name="Body Text First Indent" w:semiHidden="1" w:unhideWhenUsed="1"/>
+    <w:lsdException w:name="Body Text First Indent 2" w:semiHidden="1" w:unhideWhenUsed="1"/>
+    <w:lsdException w:name="Note Heading" w:semiHidden="1" w:unhideWhenUsed="1"/>
+    <w:lsdException w:name="Body Text 2" w:semiHidden="1" w:unhideWhenUsed="1"/>
+    <w:lsdException w:name="Body Text 3" w:semiHidden="1" w:unhideWhenUsed="1"/>
+    <w:lsdException w:name="Body Text Indent 2" w:semiHidden="1" w:unhideWhenUsed="1"/>
+    <w:lsdException w:name="Body Text Indent 3" w:semiHidden="1" w:unhideWhenUsed="1"/>
+    <w:lsdException w:name="Block Text" w:semiHidden="1" w:unhideWhenUsed="1"/>
+    <w:lsdException w:name="Hyperlink" w:semiHidden="1" w:unhideWhenUsed="1"/>
+    <w:lsdException w:name="FollowedHyperlink" w:semiHidden="1" w:unhideWhenUsed="1"/>
+    <w:lsdException w:name="Strong" w:uiPriority="22" w:qFormat="1"/>
+    <w:lsdException w:name="Emphasis" w:uiPriority="20" w:qFormat="1"/>
+    <w:lsdException w:name="Document Map" w:semiHidden="1" w:unhideWhenUsed="1"/>
+    <w:lsdException w:name="Plain Text" w:semiHidden="1" w:unhideWhenUsed="1"/>
+    <w:lsdException w:name="E-mail Signature" w:semiHidden="1" w:unhideWhenUsed="1"/>
+    <w:lsdException w:name="HTML Top of Form" w:semiHidden="1" w:unhideWhenUsed="1"/>
+    <w:lsdException w:name="HTML Bottom of Form" w:semiHidden="1" w:unhideWhenUsed="1"/>
+    <w:lsdException w:name="Normal (Web)" w:semiHidden="1" w:unhideWhenUsed="1"/>
+    <w:lsdException w:name="HTML Acronym" w:semiHidden="1" w:unhideWhenUsed="1"/>
+    <w:lsdException w:name="HTML Address" w:semiHidden="1" w:unhideWhenUsed="1"/>
+    <w:lsdException w:name="HTML Cite" w:semiHidden="1" w:unhideWhenUsed="1"/>
+    <w:lsdException w:name="HTML Code" w:semiHidden="1" w:unhideWhenUsed="1"/>
+    <w:lsdException w:name="HTML Definition" w:semiHidden="1" w:unhideWhenUsed="1"/>
+    <w:lsdException w:name="HTML Keyboard" w:semiHidden="1" w:unhideWhenUsed="1"/>
+    <w:lsdException w:name="HTML Preformatted" w:semiHidden="1" w:unhideWhenUsed="1"/>
+    <w:lsdException w:name="HTML Sample" w:semiHidden="1" w:unhideWhenUsed="1"/>
+    <w:lsdException w:name="HTML Typewriter" w:semiHidden="1" w:unhideWhenUsed="1"/>
+    <w:lsdException w:name="HTML Variable" w:semiHidden="1" w:unhideWhenUsed="1"/>
+    <w:lsdException w:name="Normal Table" w:semiHidden="1" w:unhideWhenUsed="1"/>
+    <w:lsdException w:name="annotation subject" w:semiHidden="1" w:unhideWhenUsed="1"/>
+    <w:lsdException w:name="No List" w:semiHidden="1" w:unhideWhenUsed="1"/>
+    <w:lsdException w:name="Outline List 1" w:semiHidden="1" w:unhideWhenUsed="1"/>
+    <w:lsdException w:name="Outline List 2" w:semiHidden="1" w:unhideWhenUsed="1"/>
+    <w:lsdException w:name="Outline List 3" w:semiHidden="1" w:unhideWhenUsed="1"/>
+    <w:lsdException w:name="Table Simple 1" w:semiHidden="1" w:unhideWhenUsed="1"/>
+    <w:lsdException w:name="Table Simple 2" w:semiHidden="1" w:unhideWhenUsed="1"/>
+    <w:lsdException w:name="Table Simple 3" w:semiHidden="1" w:unhideWhenUsed="1"/>
+    <w:lsdException w:name="Table Classic 1" w:semiHidden="1" w:unhideWhenUsed="1"/>
+    <w:lsdException w:name="Table Classic 2" w:semiHidden="1" w:unhideWhenUsed="1"/>
+    <w:lsdException w:name="Table Classic 3" w:semiHidden="1" w:unhideWhenUsed="1"/>
+    <w:lsdException w:name="Table Classic 4" w:semiHidden="1" w:unhideWhenUsed="1"/>
+    <w:lsdException w:name="Table Colorful 1" w:semiHidden="1" w:unhideWhenUsed="1"/>
+    <w:lsdException w:name="Table Colorful 2" w:semiHidden="1" w:unhideWhenUsed="1"/>
+    <w:lsdException w:name="Table Colorful 3" w:semiHidden="1" w:unhideWhenUsed="1"/>
+    <w:lsdException w:name="Table Columns 1" w:semiHidden="1" w:unhideWhenUsed="1"/>
+    <w:lsdException w:name="Table Columns 2" w:semiHidden="1" w:unhideWhenUsed="1"/>
+    <w:lsdException w:name="Table Columns 3" w:semiHidden="1" w:unhideWhenUsed="1"/>
+    <w:lsdException w:name="Table Columns 4" w:semiHidden="1" w:unhideWhenUsed="1"/>
+    <w:lsdException w:name="Table Columns 5" w:semiHidden="1" w:unhideWhenUsed="1"/>
+    <w:lsdException w:name="Table Grid 1" w:semiHidden="1" w:unhideWhenUsed="1"/>
+    <w:lsdException w:name="Table Grid 2" w:semiHidden="1" w:unhideWhenUsed="1"/>
+    <w:lsdException w:name="Table Grid 3" w:semiHidden="1" w:unhideWhenUsed="1"/>
+    <w:lsdException w:name="Table Grid 4" w:semiHidden="1" w:unhideWhenUsed="1"/>
+    <w:lsdException w:name="Table Grid 5" w:semiHidden="1" w:unhideWhenUsed="1"/>
+    <w:lsdException w:name="Table Grid 6" w:semiHidden="1" w:unhideWhenUsed="1"/>
+    <w:lsdException w:name="Table Grid 7" w:semiHidden="1" w:unhideWhenUsed="1"/>
+    <w:lsdException w:name="Table Grid 8" w:semiHidden="1" w:unhideWhenUsed="1"/>
+    <w:lsdException w:name="Table List 1" w:semiHidden="1" w:unhideWhenUsed="1"/>
+    <w:lsdException w:name="Table List 2" w:semiHidden="1" w:unhideWhenUsed="1"/>
+    <w:lsdException w:name="Table List 3" w:semiHidden="1" w:unhideWhenUsed="1"/>
+    <w:lsdException w:name="Table List 4" w:semiHidden="1" w:unhideWhenUsed="1"/>
+    <w:lsdException w:name="Table List 5" w:semiHidden="1" w:unhideWhenUsed="1"/>
+    <w:lsdException w:name="Table List 6" w:semiHidden="1" w:unhideWhenUsed="1"/>
+    <w:lsdException w:name="Table List 7" w:semiHidden="1" w:unhideWhenUsed="1"/>
+    <w:lsdException w:name="Table List 8" w:semiHidden="1" w:unhideWhenUsed="1"/>
+    <w:lsdException w:name="Table 3D effects 1" w:semiHidden="1" w:unhideWhenUsed="1"/>
+    <w:lsdException w:name="Table 3D effects 2" w:semiHidden="1" w:unhideWhenUsed="1"/>
+    <w:lsdException w:name="Table 3D effects 3" w:semiHidden="1" w:unhideWhenUsed="1"/>
+    <w:lsdException w:name="Table Contemporary" w:semiHidden="1" w:unhideWhenUsed="1"/>
+    <w:lsdException w:name="Table Elegant" w:semiHidden="1" w:unhideWhenUsed="1"/>
+    <w:lsdException w:name="Table Professional" w:semiHidden="1" w:unhideWhenUsed="1"/>
+    <w:lsdException w:name="Table Subtle 1" w:semiHidden="1" w:unhideWhenUsed="1"/>
+    <w:lsdException w:name="Table Subtle 2" w:semiHidden="1" w:unhideWhenUsed="1"/>
+    <w:lsdException w:name="Table Web 1" w:semiHidden="1" w:unhideWhenUsed="1"/>
+    <w:lsdException w:name="Table Web 2" w:semiHidden="1" w:unhideWhenUsed="1"/>
+    <w:lsdException w:name="Table Web 3" w:semiHidden="1" w:unhideWhenUsed="1"/>
+    <w:lsdException w:name="Balloon Text" w:semiHidden="1" w:unhideWhenUsed="1"/>
+    <w:lsdException w:name="Table Grid" w:uiPriority="39"/>
+    <w:lsdException w:name="Table Theme" w:semiHidden="1" w:unhideWhenUsed="1"/>
+    <w:lsdException w:name="Placeholder Text" w:semiHidden="1"/>
+    <w:lsdException w:name="No Spacing" w:uiPriority="1" w:qFormat="1"/>
+    <w:lsdException w:name="Light Shading" w:uiPriority="60"/>
+    <w:lsdException w:name="Light List" w:uiPriority="61"/>
+    <w:lsdException w:name="Light Grid" w:uiPriority="62"/>
+    <w:lsdException w:name="Medium Shading 1" w:uiPriority="63"/>
+    <w:lsdException w:name="Medium Shading 2" w:uiPriority="64"/>
+    <w:lsdException w:name="Medium List 1" w:uiPriority="65"/>
+    <w:lsdException w:name="Medium List 2" w:uiPriority="66"/>
+    <w:lsdException w:name="Medium Grid 1" w:uiPriority="67"/>
+    <w:lsdException w:name="Medium Grid 2" w:uiPriority="68"/>
+    <w:lsdException w:name="Medium Grid 3" w:uiPriority="69"/>
+    <w:lsdException w:name="Dark List" w:uiPriority="70"/>
+    <w:lsdException w:name="Colorful Shading" w:uiPriority="71"/>
+    <w:lsdException w:name="Colorful List" w:uiPriority="72"/>
+    <w:lsdException w:name="Colorful Grid" w:uiPriority="73"/>
+    <w:lsdException w:name="Light Shading Accent 1" w:uiPriority="60"/>
+    <w:lsdException w:name="Light List Accent 1" w:uiPriority="61"/>
+    <w:lsdException w:name="Light Grid Accent 1" w:uiPriority="62"/>
+    <w:lsdException w:name="Medium Shading 1 Accent 1" w:uiPriority="63"/>
+    <w:lsdException w:name="Medium Shading 2 Accent 1" w:uiPriority="64"/>
+    <w:lsdException w:name="Medium List 1 Accent 1" w:uiPriority="65"/>
+    <w:lsdException w:name="Revision" w:semiHidden="1"/>
+    <w:lsdException w:name="List Paragraph" w:uiPriority="34" w:qFormat="1"/>
+    <w:lsdException w:name="Quote" w:uiPriority="29" w:qFormat="1"/>
+    <w:lsdException w:name="Intense Quote" w:uiPriority="30" w:qFormat="1"/>
+    <w:lsdException w:name="Medium List 2 Accent 1" w:uiPriority="66"/>
+    <w:lsdException w:name="Medium Grid 1 Accent 1" w:uiPriority="67"/>
+    <w:lsdException w:name="Medium Grid 2 Accent 1" w:uiPriority="68"/>
+    <w:lsdException w:name="Medium Grid 3 Accent 1" w:uiPriority="69"/>
+    <w:lsdException w:name="Dark List Accent 1" w:uiPriority="70"/>
+    <w:lsdException w:name="Colorful Shading Accent 1" w:uiPriority="71"/>
+    <w:lsdException w:name="Colorful List Accent 1" w:uiPriority="72"/>
+    <w:lsdException w:name="Colorful Grid Accent 1" w:uiPriority="73"/>
+    <w:lsdException w:name="Light Shading Accent 2" w:uiPriority="60"/>
+    <w:lsdException w:name="Light List Accent 2" w:uiPriority="61"/>
+    <w:lsdException w:name="Light Grid Accent 2" w:uiPriority="62"/>
+    <w:lsdException w:name="Medium Shading 1 Accent 2" w:uiPriority="63"/>
+    <w:lsdException w:name="Medium Shading 2 Accent 2" w:uiPriority="64"/>
+    <w:lsdException w:name="Medium List 1 Accent 2" w:uiPriority="65"/>
+    <w:lsdException w:name="Medium List 2 Accent 2" w:uiPriority="66"/>
+    <w:lsdException w:name="Medium Grid 1 Accent 2" w:uiPriority="67"/>
+    <w:lsdException w:name="Medium Grid 2 Accent 2" w:uiPriority="68"/>
+    <w:lsdException w:name="Medium Grid 3 Accent 2" w:uiPriority="69"/>
+    <w:lsdException w:name="Dark List Accent 2" w:uiPriority="70"/>
+    <w:lsdException w:name="Colorful Shading Accent 2" w:uiPriority="71"/>
+    <w:lsdException w:name="Colorful List Accent 2" w:uiPriority="72"/>
+    <w:lsdException w:name="Colorful Grid Accent 2" w:uiPriority="73"/>
+    <w:lsdException w:name="Light Shading Accent 3" w:uiPriority="60"/>
+    <w:lsdException w:name="Light List Accent 3" w:uiPriority="61"/>
+    <w:lsdException w:name="Light Grid Accent 3" w:uiPriority="62"/>
+    <w:lsdException w:name="Medium Shading 1 Accent 3" w:uiPriority="63"/>
+    <w:lsdException w:name="Medium Shading 2 Accent 3" w:uiPriority="64"/>
+    <w:lsdException w:name="Medium List 1 Accent 3" w:uiPriority="65"/>
+    <w:lsdException w:name="Medium List 2 Accent 3" w:uiPriority="66"/>
+    <w:lsdException w:name="Medium Grid 1 Accent 3" w:uiPriority="67"/>
+    <w:lsdException w:name="Medium Grid 2 Accent 3" w:uiPriority="68"/>
+    <w:lsdException w:name="Medium Grid 3 Accent 3" w:uiPriority="69"/>
+    <w:lsdException w:name="Dark List Accent 3" w:uiPriority="70"/>
+    <w:lsdException w:name="Colorful Shading Accent 3" w:uiPriority="71"/>
+    <w:lsdException w:name="Colorful List Accent 3" w:uiPriority="72"/>
+    <w:lsdException w:name="Colorful Grid Accent 3" w:uiPriority="73"/>
+    <w:lsdException w:name="Light Shading Accent 4" w:uiPriority="60"/>
+    <w:lsdException w:name="Light List Accent 4" w:uiPriority="61"/>
+    <w:lsdException w:name="Light Grid Accent 4" w:uiPriority="62"/>
+    <w:lsdException w:name="Medium Shading 1 Accent 4" w:uiPriority="63"/>
+    <w:lsdException w:name="Medium Shading 2 Accent 4" w:uiPriority="64"/>
+    <w:lsdException w:name="Medium List 1 Accent 4" w:uiPriority="65"/>
+    <w:lsdException w:name="Medium List 2 Accent 4" w:uiPriority="66"/>
+    <w:lsdException w:name="Medium Grid 1 Accent 4" w:uiPriority="67"/>
+    <w:lsdException w:name="Medium Grid 2 Accent 4" w:uiPriority="68"/>
+    <w:lsdException w:name="Medium Grid 3 Accent 4" w:uiPriority="69"/>
+    <w:lsdException w:name="Dark List Accent 4" w:uiPriority="70"/>
+    <w:lsdException w:name="Colorful Shading Accent 4" w:uiPriority="71"/>
+    <w:lsdException w:name="Colorful List Accent 4" w:uiPriority="72"/>
+    <w:lsdException w:name="Colorful Grid Accent 4" w:uiPriority="73"/>
+    <w:lsdException w:name="Light Shading Accent 5" w:uiPriority="60"/>
+    <w:lsdException w:name="Light List Accent 5" w:uiPriority="61"/>
+    <w:lsdException w:name="Light Grid Accent 5" w:uiPriority="62"/>
+    <w:lsdException w:name="Medium Shading 1 Accent 5" w:uiPriority="63"/>
+    <w:lsdException w:name="Medium Shading 2 Accent 5" w:uiPriority="64"/>
+    <w:lsdException w:name="Medium List 1 Accent 5" w:uiPriority="65"/>
+    <w:lsdException w:name="Medium List 2 Accent 5" w:uiPriority="66"/>
+    <w:lsdException w:name="Medium Grid 1 Accent 5" w:uiPriority="67"/>
+    <w:lsdException w:name="Medium Grid 2 Accent 5" w:uiPriority="68"/>
+    <w:lsdException w:name="Medium Grid 3 Accent 5" w:uiPriority="69"/>
+    <w:lsdException w:name="Dark List Accent 5" w:uiPriority="70"/>
+    <w:lsdException w:name="Colorful Shading Accent 5" w:uiPriority="71"/>
+    <w:lsdException w:name="Colorful List Accent 5" w:uiPriority="72"/>
+    <w:lsdException w:name="Colorful Grid Accent 5" w:uiPriority="73"/>
+    <w:lsdException w:name="Light Shading Accent 6" w:uiPriority="60"/>
+    <w:lsdException w:name="Light List Accent 6" w:uiPriority="61"/>
+    <w:lsdException w:name="Light Grid Accent 6" w:uiPriority="62"/>
+    <w:lsdException w:name="Medium Shading 1 Accent 6" w:uiPriority="63"/>
+    <w:lsdException w:name="Medium Shading 2 Accent 6" w:uiPriority="64"/>
+    <w:lsdException w:name="Medium List 1 Accent 6" w:uiPriority="65"/>
+    <w:lsdException w:name="Medium List 2 Accent 6" w:uiPriority="66"/>
+    <w:lsdException w:name="Medium Grid 1 Accent 6" w:uiPriority="67"/>
+    <w:lsdException w:name="Medium Grid 2 Accent 6" w:uiPriority="68"/>
+    <w:lsdException w:name="Medium Grid 3 Accent 6" w:uiPriority="69"/>
+    <w:lsdException w:name="Dark List Accent 6" w:uiPriority="70"/>
+    <w:lsdException w:name="Colorful Shading Accent 6" w:uiPriority="71"/>
+    <w:lsdException w:name="Colorful List Accent 6" w:uiPriority="72"/>
+    <w:lsdException w:name="Colorful Grid Accent 6" w:uiPriority="73"/>
+    <w:lsdException w:name="Subtle Emphasis" w:uiPriority="19" w:qFormat="1"/>
+    <w:lsdException w:name="Intense Emphasis" w:uiPriority="21" w:qFormat="1"/>
+    <w:lsdException w:name="Subtle Reference" w:uiPriority="31" w:qFormat="1"/>
+    <w:lsdException w:name="Intense Reference" w:uiPriority="32" w:qFormat="1"/>
+    <w:lsdException w:name="Book Title" w:uiPriority="33" w:qFormat="1"/>
+    <w:lsdException w:name="Bibliography" w:semiHidden="1" w:uiPriority="37" w:unhideWhenUsed="1"/>
+    <w:lsdException w:name="TOC Heading" w:semiHidden="1" w:uiPriority="39" w:unhideWhenUsed="1" w:qFormat="1"/>
+    <w:lsdException w:name="Plain Table 1" w:uiPriority="41"/>
+    <w:lsdException w:name="Plain Table 2" w:uiPriority="42"/>
+    <w:lsdException w:name="Plain Table 3" w:uiPriority="43"/>
+    <w:lsdException w:name="Plain Table 4" w:uiPriority="44"/>
+    <w:lsdException w:name="Plain Table 5" w:uiPriority="45"/>
+    <w:lsdException w:name="Grid Table Light" w:uiPriority="40"/>
+    <w:lsdException w:name="Grid Table 1 Light" w:uiPriority="46"/>
+    <w:lsdException w:name="Grid Table 2" w:uiPriority="47"/>
+    <w:lsdException w:name="Grid Table 3" w:uiPriority="48"/>
+    <w:lsdException w:name="Grid Table 4" w:uiPriority="49"/>
+    <w:lsdException w:name="Grid Table 5 Dark" w:uiPriority="50"/>
+    <w:lsdException w:name="Grid Table 6 Colorful" w:uiPriority="51"/>
+    <w:lsdException w:name="Grid Table 7 Colorful" w:uiPriority="52"/>
+    <w:lsdException w:name="Grid Table 1 Light Accent 1" w:uiPriority="46"/>
+    <w:lsdException w:name="Grid Table 2 Accent 1" w:uiPriority="47"/>
+    <w:lsdException w:name="Grid Table 3 Accent 1" w:uiPriority="48"/>
+    <w:lsdException w:name="Grid Table 4 Accent 1" w:uiPriority="49"/>
+    <w:lsdException w:name="Grid Table 5 Dark Accent 1" w:uiPriority="50"/>
+    <w:lsdException w:name="Grid Table 6 Colorful Accent 1" w:uiPriority="51"/>
+    <w:lsdException w:name="Grid Table 7 Colorful Accent 1" w:uiPriority="52"/>
+    <w:lsdException w:name="Grid Table 1 Light Accent 2" w:uiPriority="46"/>
+    <w:lsdException w:name="Grid Table 2 Accent 2" w:uiPriority="47"/>
+    <w:lsdException w:name="Grid Table 3 Accent 2" w:uiPriority="48"/>
+    <w:lsdException w:name="Grid Table 4 Accent 2" w:uiPriority="49"/>
+    <w:lsdException w:name="Grid Table 5 Dark Accent 2" w:uiPriority="50"/>
+    <w:lsdException w:name="Grid Table 6 Colorful Accent 2" w:uiPriority="51"/>
+    <w:lsdException w:name="Grid Table 7 Colorful Accent 2" w:uiPriority="52"/>
+    <w:lsdException w:name="Grid Table 1 Light Accent 3" w:uiPriority="46"/>
+    <w:lsdException w:name="Grid Table 2 Accent 3" w:uiPriority="47"/>
+    <w:lsdException w:name="Grid Table 3 Accent 3" w:uiPriority="48"/>
+    <w:lsdException w:name="Grid Table 4 Accent 3" w:uiPriority="49"/>
+    <w:lsdException w:name="Grid Table 5 Dark Accent 3" w:uiPriority="50"/>
+    <w:lsdException w:name="Grid Table 6 Colorful Accent 3" w:uiPriority="51"/>
+    <w:lsdException w:name="Grid Table 7 Colorful Accent 3" w:uiPriority="52"/>
+    <w:lsdException w:name="Grid Table 1 Light Accent 4" w:uiPriority="46"/>
+    <w:lsdException w:name="Grid Table 2 Accent 4" w:uiPriority="47"/>
+    <w:lsdException w:name="Grid Table 3 Accent 4" w:uiPriority="48"/>
+    <w:lsdException w:name="Grid Table 4 Accent 4" w:uiPriority="49"/>
+    <w:lsdException w:name="Grid Table 5 Dark Accent 4" w:uiPriority="50"/>
+    <w:lsdException w:name="Grid Table 6 Colorful Accent 4" w:uiPriority="51"/>
+    <w:lsdException w:name="Grid Table 7 Colorful Accent 4" w:uiPriority="52"/>
+    <w:lsdException w:name="Grid Table 1 Light Accent 5" w:uiPriority="46"/>
+    <w:lsdException w:name="Grid Table 2 Accent 5" w:uiPriority="47"/>
+    <w:lsdException w:name="Grid Table 3 Accent 5" w:uiPriority="48"/>
+    <w:lsdException w:name="Grid Table 4 Accent 5" w:uiPriority="49"/>
+    <w:lsdException w:name="Grid Table 5 Dark Accent 5" w:uiPriority="50"/>
+    <w:lsdException w:name="Grid Table 6 Colorful Accent 5" w:uiPriority="51"/>
+    <w:lsdException w:name="Grid Table 7 Colorful Accent 5" w:uiPriority="52"/>
+    <w:lsdException w:name="Grid Table 1 Light Accent 6" w:uiPriority="46"/>
+    <w:lsdException w:name="Grid Table 2 Accent 6" w:uiPriority="47"/>
+    <w:lsdException w:name="Grid Table 3 Accent 6" w:uiPriority="48"/>
+    <w:lsdException w:name="Grid Table 4 Accent 6" w:uiPriority="49"/>
+    <w:lsdException w:name="Grid Table 5 Dark Accent 6" w:uiPriority="50"/>
+    <w:lsdException w:name="Grid Table 6 Colorful Accent 6" w:uiPriority="51"/>
+    <w:lsdException w:name="Grid Table 7 Colorful Accent 6" w:uiPriority="52"/>
+    <w:lsdException w:name="List Table 1 Light" w:uiPriority="46"/>
+    <w:lsdException w:name="List Table 2" w:uiPriority="47"/>
+    <w:lsdException w:name="List Table 3" w:uiPriority="48"/>
+    <w:lsdException w:name="List Table 4" w:uiPriority="49"/>
+    <w:lsdException w:name="List Table 5 Dark" w:uiPriority="50"/>
+    <w:lsdException w:name="List Table 6 Colorful" w:uiPriority="51"/>
+    <w:lsdException w:name="List Table 7 Colorful" w:uiPriority="52"/>
+    <w:lsdException w:name="List Table 1 Light Accent 1" w:uiPriority="46"/>
+    <w:lsdException w:name="List Table 2 Accent 1" w:uiPriority="47"/>
+    <w:lsdException w:name="List Table 3 Accent 1" w:uiPriority="48"/>
+    <w:lsdException w:name="List Table 4 Accent 1" w:uiPriority="49"/>
+    <w:lsdException w:name="List Table 5 Dark Accent 1" w:uiPriority="50"/>
+    <w:lsdException w:name="List Table 6 Colorful Accent 1" w:uiPriority="51"/>
+    <w:lsdException w:name="List Table 7 Colorful Accent 1" w:uiPriority="52"/>
+    <w:lsdException w:name="List Table 1 Light Accent 2" w:uiPriority="46"/>
+    <w:lsdException w:name="List Table 2 Accent 2" w:uiPriority="47"/>
+    <w:lsdException w:name="List Table 3 Accent 2" w:uiPriority="48"/>
+    <w:lsdException w:name="List Table 4 Accent 2" w:uiPriority="49"/>
+    <w:lsdException w:name="List Table 5 Dark Accent 2" w:uiPriority="50"/>
+    <w:lsdException w:name="List Table 6 Colorful Accent 2" w:uiPriority="51"/>
+    <w:lsdException w:name="List Table 7 Colorful Accent 2" w:uiPriority="52"/>
+    <w:lsdException w:name="List Table 1 Light Accent 3" w:uiPriority="46"/>
+    <w:lsdException w:name="List Table 2 Accent 3" w:uiPriority="47"/>
+    <w:lsdException w:name="List Table 3 Accent 3" w:uiPriority="48"/>
+    <w:lsdException w:name="List Table 4 Accent 3" w:uiPriority="49"/>
+    <w:lsdException w:name="List Table 5 Dark Accent 3" w:uiPriority="50"/>
+    <w:lsdException w:name="List Table 6 Colorful Accent 3" w:uiPriority="51"/>
+    <w:lsdException w:name="List Table 7 Colorful Accent 3" w:uiPriority="52"/>
+    <w:lsdException w:name="List Table 1 Light Accent 4" w:uiPriority="46"/>
+    <w:lsdException w:name="List Table 2 Accent 4" w:uiPriority="47"/>
+    <w:lsdException w:name="List Table 3 Accent 4" w:uiPriority="48"/>
+    <w:lsdException w:name="List Table 4 Accent 4" w:uiPriority="49"/>
+    <w:lsdException w:name="List Table 5 Dark Accent 4" w:uiPriority="50"/>
+    <w:lsdException w:name="List Table 6 Colorful Accent 4" w:uiPriority="51"/>
+    <w:lsdException w:name="List Table 7 Colorful Accent 4" w:uiPriority="52"/>
+    <w:lsdException w:name="List Table 1 Light Accent 5" w:uiPriority="46"/>
+    <w:lsdException w:name="List Table 2 Accent 5" w:uiPriority="47"/>
+    <w:lsdException w:name="List Table 3 Accent 5" w:uiPriority="48"/>
+    <w:lsdException w:name="List Table 4 Accent 5" w:uiPriority="49"/>
+    <w:lsdException w:name="List Table 5 Dark Accent 5" w:uiPriority="50"/>
+    <w:lsdException w:name="List Table 6 Colorful Accent 5" w:uiPriority="51"/>
+    <w:lsdException w:name="List Table 7 Colorful Accent 5" w:uiPriority="52"/>
+    <w:lsdException w:name="List Table 1 Light Accent 6" w:uiPriority="46"/>
+    <w:lsdException w:name="List Table 2 Accent 6" w:uiPriority="47"/>
+    <w:lsdException w:name="List Table 3 Accent 6" w:uiPriority="48"/>
+    <w:lsdException w:name="List Table 4 Accent 6" w:uiPriority="49"/>
+    <w:lsdException w:name="List Table 5 Dark Accent 6" w:uiPriority="50"/>
+    <w:lsdException w:name="List Table 6 Colorful Accent 6" w:uiPriority="51"/>
+    <w:lsdException w:name="List Table 7 Colorful Accent 6" w:uiPriority="52"/>
+    <w:lsdException w:name="Mention" w:semiHidden="1" w:unhideWhenUsed="1"/>
+    <w:lsdException w:name="Smart Hyperlink" w:semiHidden="1" w:unhideWhenUsed="1"/>
+    <w:lsdException w:name="Hashtag" w:semiHidden="1" w:unhideWhenUsed="1"/>
+    <w:lsdException w:name="Unresolved Mention" w:semiHidden="1" w:unhideWhenUsed="1"/>
+    <w:lsdException w:name="Smart Link" w:semiHidden="1" w:unhideWhenUsed="1"/>
+  </w:latentStyles>
+  <w:style w:type="paragraph" w:default="1" w:styleId="Normal">
     <w:name w:val="Normal"/>
     <w:qFormat/>
   </w:style>
-  <w:style w:type="paragraph" w:styleId="Title">
-    <w:name w:val="Title"/>
+  <w:style w:type="paragraph" w:styleId="Heading1">
+    <w:name w:val="heading 1"/>
     <w:basedOn w:val="Normal"/>
     <w:next w:val="Normal"/>
+    <w:uiPriority w:val="9"/>
     <w:qFormat/>
-    <w:rPr>
-      <w:sz w:val="56"/>
-      <w:szCs w:val="56"/>
-    </w:rPr>
-  </w:style>
-  <w:style w:type="paragraph" w:styleId="Heading1">
-    <w:name w:val="Heading 1"/>
-    <w:basedOn w:val="Normal"/>
-    <w:next w:val="Normal"/>
-    <w:qFormat/>
+    <w:pPr>
+      <w:outlineLvl w:val="0"/>
+    </w:pPr>
     <w:rPr>
       <w:color w:val="2E74B5"/>
       <w:sz w:val="32"/>
@@ -1854,10 +3090,16 @@
     </w:rPr>
   </w:style>
   <w:style w:type="paragraph" w:styleId="Heading2">
-    <w:name w:val="Heading 2"/>
+    <w:name w:val="heading 2"/>
     <w:basedOn w:val="Normal"/>
     <w:next w:val="Normal"/>
+    <w:uiPriority w:val="9"/>
+    <w:semiHidden/>
+    <w:unhideWhenUsed/>
     <w:qFormat/>
+    <w:pPr>
+      <w:outlineLvl w:val="1"/>
+    </w:pPr>
     <w:rPr>
       <w:color w:val="2E74B5"/>
       <w:sz w:val="26"/>
@@ -1865,10 +3107,16 @@
     </w:rPr>
   </w:style>
   <w:style w:type="paragraph" w:styleId="Heading3">
-    <w:name w:val="Heading 3"/>
+    <w:name w:val="heading 3"/>
     <w:basedOn w:val="Normal"/>
     <w:next w:val="Normal"/>
+    <w:uiPriority w:val="9"/>
+    <w:semiHidden/>
+    <w:unhideWhenUsed/>
     <w:qFormat/>
+    <w:pPr>
+      <w:outlineLvl w:val="2"/>
+    </w:pPr>
     <w:rPr>
       <w:color w:val="1F4D78"/>
       <w:sz w:val="24"/>
@@ -1876,10 +3124,16 @@
     </w:rPr>
   </w:style>
   <w:style w:type="paragraph" w:styleId="Heading4">
-    <w:name w:val="Heading 4"/>
+    <w:name w:val="heading 4"/>
     <w:basedOn w:val="Normal"/>
     <w:next w:val="Normal"/>
+    <w:uiPriority w:val="9"/>
+    <w:semiHidden/>
+    <w:unhideWhenUsed/>
     <w:qFormat/>
+    <w:pPr>
+      <w:outlineLvl w:val="3"/>
+    </w:pPr>
     <w:rPr>
       <w:i/>
       <w:iCs/>
@@ -1887,25 +3141,75 @@
     </w:rPr>
   </w:style>
   <w:style w:type="paragraph" w:styleId="Heading5">
-    <w:name w:val="Heading 5"/>
+    <w:name w:val="heading 5"/>
     <w:basedOn w:val="Normal"/>
     <w:next w:val="Normal"/>
+    <w:uiPriority w:val="9"/>
+    <w:semiHidden/>
+    <w:unhideWhenUsed/>
     <w:qFormat/>
+    <w:pPr>
+      <w:outlineLvl w:val="4"/>
+    </w:pPr>
     <w:rPr>
       <w:color w:val="2E74B5"/>
     </w:rPr>
   </w:style>
   <w:style w:type="paragraph" w:styleId="Heading6">
-    <w:name w:val="Heading 6"/>
+    <w:name w:val="heading 6"/>
     <w:basedOn w:val="Normal"/>
     <w:next w:val="Normal"/>
+    <w:uiPriority w:val="9"/>
+    <w:semiHidden/>
+    <w:unhideWhenUsed/>
     <w:qFormat/>
+    <w:pPr>
+      <w:outlineLvl w:val="5"/>
+    </w:pPr>
     <w:rPr>
       <w:color w:val="1F4D78"/>
     </w:rPr>
   </w:style>
-  <w:style w:type="paragraph" w:styleId="Strong">
-    <w:name w:val="Strong"/>
+  <w:style w:type="character" w:default="1" w:styleId="DefaultParagraphFont">
+    <w:name w:val="Default Paragraph Font"/>
+    <w:uiPriority w:val="1"/>
+    <w:semiHidden/>
+    <w:unhideWhenUsed/>
+  </w:style>
+  <w:style w:type="table" w:default="1" w:styleId="TableNormal">
+    <w:name w:val="Normal Table"/>
+    <w:uiPriority w:val="99"/>
+    <w:semiHidden/>
+    <w:unhideWhenUsed/>
+    <w:tblPr>
+      <w:tblInd w:w="0" w:type="dxa"/>
+      <w:tblCellMar>
+        <w:top w:w="0" w:type="dxa"/>
+        <w:left w:w="108" w:type="dxa"/>
+        <w:bottom w:w="0" w:type="dxa"/>
+        <w:right w:w="108" w:type="dxa"/>
+      </w:tblCellMar>
+    </w:tblPr>
+  </w:style>
+  <w:style w:type="numbering" w:default="1" w:styleId="NoList">
+    <w:name w:val="No List"/>
+    <w:uiPriority w:val="99"/>
+    <w:semiHidden/>
+    <w:unhideWhenUsed/>
+  </w:style>
+  <w:style w:type="paragraph" w:styleId="Title">
+    <w:name w:val="Title"/>
+    <w:basedOn w:val="Normal"/>
+    <w:next w:val="Normal"/>
+    <w:uiPriority w:val="10"/>
+    <w:qFormat/>
+    <w:rPr>
+      <w:sz w:val="56"/>
+      <w:szCs w:val="56"/>
+    </w:rPr>
+  </w:style>
+  <w:style w:type="paragraph" w:customStyle="1" w:styleId="Strong1">
+    <w:name w:val="Strong1"/>
     <w:basedOn w:val="Normal"/>
     <w:next w:val="Normal"/>
     <w:qFormat/>
@@ -1921,7 +3225,6 @@
   </w:style>
   <w:style w:type="character" w:styleId="Hyperlink">
     <w:name w:val="Hyperlink"/>
-    <w:basedOn w:val="DefaultParagraphFont"/>
     <w:uiPriority w:val="99"/>
     <w:unhideWhenUsed/>
     <w:rPr>
@@ -1931,7 +3234,6 @@
   </w:style>
   <w:style w:type="character" w:styleId="FootnoteReference">
     <w:name w:val="footnote reference"/>
-    <w:basedOn w:val="DefaultParagraphFont"/>
     <w:uiPriority w:val="99"/>
     <w:semiHidden/>
     <w:unhideWhenUsed/>
@@ -1946,17 +3248,9 @@
     <w:uiPriority w:val="99"/>
     <w:semiHidden/>
     <w:unhideWhenUsed/>
-    <w:pPr>
-      <w:spacing w:after="0" w:line="240" w:lineRule="auto"/>
-    </w:pPr>
-    <w:rPr>
-      <w:sz w:val="20"/>
-      <w:szCs w:val="20"/>
-    </w:rPr>
   </w:style>
-  <w:style w:type="character" w:styleId="FootnoteTextChar">
+  <w:style w:type="character" w:customStyle="1" w:styleId="FootnoteTextChar">
     <w:name w:val="Footnote Text Char"/>
-    <w:basedOn w:val="DefaultParagraphFont"/>
     <w:link w:val="FootnoteText"/>
     <w:uiPriority w:val="99"/>
     <w:semiHidden/>
@@ -1968,7 +3262,6 @@
   </w:style>
   <w:style w:type="character" w:styleId="EndnoteReference">
     <w:name w:val="endnote reference"/>
-    <w:basedOn w:val="DefaultParagraphFont"/>
     <w:uiPriority w:val="99"/>
     <w:semiHidden/>
     <w:unhideWhenUsed/>
@@ -1983,17 +3276,9 @@
     <w:uiPriority w:val="99"/>
     <w:semiHidden/>
     <w:unhideWhenUsed/>
-    <w:pPr>
-      <w:spacing w:after="0" w:line="240" w:lineRule="auto"/>
-    </w:pPr>
-    <w:rPr>
-      <w:sz w:val="20"/>
-      <w:szCs w:val="20"/>
-    </w:rPr>
   </w:style>
-  <w:style w:type="character" w:styleId="EndnoteTextChar">
+  <w:style w:type="character" w:customStyle="1" w:styleId="EndnoteTextChar">
     <w:name w:val="Endnote Text Char"/>
-    <w:basedOn w:val="DefaultParagraphFont"/>
     <w:link w:val="EndnoteText"/>
     <w:uiPriority w:val="99"/>
     <w:semiHidden/>
@@ -2158,7 +3443,7 @@
         <a:solidFill>
           <a:schemeClr val="phClr"/>
         </a:solidFill>
-        <a:gradFill rotWithShape="true">
+        <a:gradFill rotWithShape="1">
           <a:gsLst>
             <a:gs pos="0">
               <a:schemeClr val="phClr">
@@ -2182,9 +3467,9 @@
               </a:schemeClr>
             </a:gs>
           </a:gsLst>
-          <a:lin ang="5400000" scaled="false"/>
+          <a:lin ang="5400000" scaled="0"/>
         </a:gradFill>
-        <a:gradFill rotWithShape="true">
+        <a:gradFill rotWithShape="1">
           <a:gsLst>
             <a:gs pos="0">
               <a:schemeClr val="phClr">
@@ -2208,7 +3493,7 @@
               </a:schemeClr>
             </a:gs>
           </a:gsLst>
-          <a:lin ang="5400000" scaled="false"/>
+          <a:lin ang="5400000" scaled="0"/>
         </a:gradFill>
       </a:fillStyleLst>
       <a:lnStyleLst>
@@ -2243,7 +3528,7 @@
         </a:effectStyle>
         <a:effectStyle>
           <a:effectLst>
-            <a:outerShdw blurRad="57150" dist="19050" dir="5400000" algn="ctr" rotWithShape="false">
+            <a:outerShdw blurRad="57150" dist="19050" dir="5400000" algn="ctr" rotWithShape="0">
               <a:srgbClr val="000000">
                 <a:alpha val="63000"/>
               </a:srgbClr>
@@ -2261,7 +3546,7 @@
             <a:satMod val="170000"/>
           </a:schemeClr>
         </a:solidFill>
-        <a:gradFill rotWithShape="true">
+        <a:gradFill rotWithShape="1">
           <a:gsLst>
             <a:gs pos="0">
               <a:schemeClr val="phClr">
@@ -2286,7 +3571,7 @@
               </a:schemeClr>
             </a:gs>
           </a:gsLst>
-          <a:lin ang="5400000" scaled="false"/>
+          <a:lin ang="5400000" scaled="0"/>
         </a:gradFill>
       </a:bgFillStyleLst>
     </a:fmtScheme>

</xml_diff>